<commit_message>
modified:   Team Feedback on mapping tool.docx 	modified:   src/components/Legend.jsx
</commit_message>
<xml_diff>
--- a/Team Feedback on mapping tool.docx
+++ b/Team Feedback on mapping tool.docx
@@ -1,15 +1,12 @@
 
 <file path=word/document.xml><?xml version="1.0" encoding="utf-8"?>
-<w:document xmlns:wpc="http://schemas.microsoft.com/office/word/2010/wordprocessingCanvas" xmlns:mc="http://schemas.openxmlformats.org/markup-compatibility/2006" xmlns:o="urn:schemas-microsoft-com:office:office" xmlns:r="http://schemas.openxmlformats.org/officeDocument/2006/relationships" xmlns:m="http://schemas.openxmlformats.org/officeDocument/2006/math" xmlns:v="urn:schemas-microsoft-com:vml" xmlns:wp14="http://schemas.microsoft.com/office/word/2010/wordprocessingDrawing" xmlns:wp="http://schemas.openxmlformats.org/drawingml/2006/wordprocessingDrawing" xmlns:w10="urn:schemas-microsoft-com:office:word" xmlns:w="http://schemas.openxmlformats.org/wordprocessingml/2006/main" xmlns:w14="http://schemas.microsoft.com/office/word/2010/wordml" xmlns:w15="http://schemas.microsoft.com/office/word/2012/wordml" xmlns:wpg="http://schemas.microsoft.com/office/word/2010/wordprocessingGroup" xmlns:wpi="http://schemas.microsoft.com/office/word/2010/wordprocessingInk" xmlns:wne="http://schemas.microsoft.com/office/word/2006/wordml" xmlns:wps="http://schemas.microsoft.com/office/word/2010/wordprocessingShape" xmlns:w16se="http://schemas.microsoft.com/office/word/2015/wordml/symex" xmlns:w16cid="http://schemas.microsoft.com/office/word/2016/wordml/cid" xmlns:w16="http://schemas.microsoft.com/office/word/2018/wordml" xmlns:w16cex="http://schemas.microsoft.com/office/word/2018/wordml/cex" xmlns:w16sdtdh="http://schemas.microsoft.com/office/word/2020/wordml/sdtdatahash" xmlns:w16sdtfl="http://schemas.microsoft.com/office/word/2024/wordml/sdtformatlock" xmlns:a="http://schemas.openxmlformats.org/drawingml/2006/main" xmlns:pic="http://schemas.openxmlformats.org/drawingml/2006/picture" xmlns:a14="http://schemas.microsoft.com/office/drawing/2010/main" mc:Ignorable="w14 w15 wp14 w16se w16cid w16 w16cex w16sdtdh w16sdtfl">
+<w:document xmlns:wpc="http://schemas.microsoft.com/office/word/2010/wordprocessingCanvas" xmlns:cx="http://schemas.microsoft.com/office/drawing/2014/chartex" xmlns:cx1="http://schemas.microsoft.com/office/drawing/2015/9/8/chartex" xmlns:cx2="http://schemas.microsoft.com/office/drawing/2015/10/21/chartex" xmlns:cx3="http://schemas.microsoft.com/office/drawing/2016/5/9/chartex" xmlns:cx4="http://schemas.microsoft.com/office/drawing/2016/5/10/chartex" xmlns:cx5="http://schemas.microsoft.com/office/drawing/2016/5/11/chartex" xmlns:cx6="http://schemas.microsoft.com/office/drawing/2016/5/12/chartex" xmlns:cx7="http://schemas.microsoft.com/office/drawing/2016/5/13/chartex" xmlns:cx8="http://schemas.microsoft.com/office/drawing/2016/5/14/chartex" xmlns:mc="http://schemas.openxmlformats.org/markup-compatibility/2006" xmlns:aink="http://schemas.microsoft.com/office/drawing/2016/ink" xmlns:am3d="http://schemas.microsoft.com/office/drawing/2017/model3d" xmlns:o="urn:schemas-microsoft-com:office:office" xmlns:oel="http://schemas.microsoft.com/office/2019/extlst" xmlns:r="http://schemas.openxmlformats.org/officeDocument/2006/relationships" xmlns:m="http://schemas.openxmlformats.org/officeDocument/2006/math" xmlns:v="urn:schemas-microsoft-com:vml" xmlns:wp14="http://schemas.microsoft.com/office/word/2010/wordprocessingDrawing" xmlns:wp="http://schemas.openxmlformats.org/drawingml/2006/wordprocessingDrawing" xmlns:w10="urn:schemas-microsoft-com:office:word" xmlns:w="http://schemas.openxmlformats.org/wordprocessingml/2006/main" xmlns:w14="http://schemas.microsoft.com/office/word/2010/wordml" xmlns:w15="http://schemas.microsoft.com/office/word/2012/wordml" xmlns:w16cex="http://schemas.microsoft.com/office/word/2018/wordml/cex" xmlns:w16cid="http://schemas.microsoft.com/office/word/2016/wordml/cid" xmlns:w16="http://schemas.microsoft.com/office/word/2018/wordml" xmlns:w16du="http://schemas.microsoft.com/office/word/2023/wordml/word16du" xmlns:w16sdtdh="http://schemas.microsoft.com/office/word/2020/wordml/sdtdatahash" xmlns:w16sdtfl="http://schemas.microsoft.com/office/word/2024/wordml/sdtformatlock" xmlns:w16se="http://schemas.microsoft.com/office/word/2015/wordml/symex" xmlns:wpg="http://schemas.microsoft.com/office/word/2010/wordprocessingGroup" xmlns:wpi="http://schemas.microsoft.com/office/word/2010/wordprocessingInk" xmlns:wne="http://schemas.microsoft.com/office/word/2006/wordml" xmlns:wps="http://schemas.microsoft.com/office/word/2010/wordprocessingShape" mc:Ignorable="w14 w15 w16se w16cid w16 w16cex w16sdtdh w16sdtfl w16du wp14">
   <w:body>
     <w:p>
       <w:pPr>
-        <w:pStyle w:val="Normal"/>
-        <w:suppressLineNumbers w:val="0"/>
-        <w:bidi w:val="0"/>
-        <w:spacing w:before="0" w:beforeAutospacing="off" w:after="160" w:afterAutospacing="off" w:line="279" w:lineRule="auto"/>
-        <w:ind w:left="0" w:right="0"/>
-        <w:jc w:val="left"/>
+        <w:rPr>
+          <w:rFonts w:hint="eastAsia"/>
+        </w:rPr>
       </w:pPr>
     </w:p>
     <w:tbl>
@@ -19,8 +16,8 @@
         <w:tblLook w:val="06A0" w:firstRow="1" w:lastRow="0" w:firstColumn="1" w:lastColumn="0" w:noHBand="1" w:noVBand="1"/>
       </w:tblPr>
       <w:tblGrid>
-        <w:gridCol w:w="3120"/>
-        <w:gridCol w:w="3120"/>
+        <w:gridCol w:w="3115"/>
+        <w:gridCol w:w="3115"/>
         <w:gridCol w:w="3120"/>
       </w:tblGrid>
       <w:tr>
@@ -30,24 +27,21 @@
         <w:tc>
           <w:tcPr>
             <w:tcW w:w="3120" w:type="dxa"/>
-            <w:tcMar/>
-            <w:vAlign w:val="top"/>
-          </w:tcPr>
-          <w:p>
-            <w:pPr>
-              <w:pStyle w:val="Normal"/>
+          </w:tcPr>
+          <w:p>
+            <w:pPr>
               <w:jc w:val="center"/>
               <w:rPr>
-                <w:rFonts w:ascii="Calibri" w:hAnsi="Calibri" w:eastAsia="Calibri" w:cs="Calibri"/>
-                <w:b w:val="1"/>
-                <w:bCs w:val="1"/>
-              </w:rPr>
-            </w:pPr>
-            <w:r>
-              <w:rPr>
-                <w:rFonts w:ascii="Calibri" w:hAnsi="Calibri" w:eastAsia="Calibri" w:cs="Calibri"/>
-                <w:b w:val="1"/>
-                <w:bCs w:val="1"/>
+                <w:rFonts w:ascii="Calibri" w:eastAsia="Calibri" w:hAnsi="Calibri" w:cs="Calibri"/>
+                <w:b/>
+                <w:bCs/>
+              </w:rPr>
+            </w:pPr>
+            <w:r>
+              <w:rPr>
+                <w:rFonts w:ascii="Calibri" w:eastAsia="Calibri" w:hAnsi="Calibri" w:cs="Calibri"/>
+                <w:b/>
+                <w:bCs/>
               </w:rPr>
               <w:t>Issue</w:t>
             </w:r>
@@ -56,24 +50,21 @@
         <w:tc>
           <w:tcPr>
             <w:tcW w:w="3120" w:type="dxa"/>
-            <w:tcMar/>
-            <w:vAlign w:val="top"/>
-          </w:tcPr>
-          <w:p>
-            <w:pPr>
-              <w:pStyle w:val="Normal"/>
+          </w:tcPr>
+          <w:p>
+            <w:pPr>
               <w:jc w:val="center"/>
               <w:rPr>
-                <w:rFonts w:ascii="Calibri" w:hAnsi="Calibri" w:eastAsia="Calibri" w:cs="Calibri"/>
-                <w:b w:val="1"/>
-                <w:bCs w:val="1"/>
-              </w:rPr>
-            </w:pPr>
-            <w:r>
-              <w:rPr>
-                <w:rFonts w:ascii="Calibri" w:hAnsi="Calibri" w:eastAsia="Calibri" w:cs="Calibri"/>
-                <w:b w:val="1"/>
-                <w:bCs w:val="1"/>
+                <w:rFonts w:ascii="Calibri" w:eastAsia="Calibri" w:hAnsi="Calibri" w:cs="Calibri"/>
+                <w:b/>
+                <w:bCs/>
+              </w:rPr>
+            </w:pPr>
+            <w:r>
+              <w:rPr>
+                <w:rFonts w:ascii="Calibri" w:eastAsia="Calibri" w:hAnsi="Calibri" w:cs="Calibri"/>
+                <w:b/>
+                <w:bCs/>
               </w:rPr>
               <w:t>Description</w:t>
             </w:r>
@@ -82,24 +73,21 @@
         <w:tc>
           <w:tcPr>
             <w:tcW w:w="3120" w:type="dxa"/>
-            <w:tcMar/>
-            <w:vAlign w:val="top"/>
-          </w:tcPr>
-          <w:p>
-            <w:pPr>
-              <w:pStyle w:val="Normal"/>
+          </w:tcPr>
+          <w:p>
+            <w:pPr>
               <w:jc w:val="center"/>
               <w:rPr>
-                <w:rFonts w:ascii="Calibri" w:hAnsi="Calibri" w:eastAsia="Calibri" w:cs="Calibri"/>
-                <w:b w:val="1"/>
-                <w:bCs w:val="1"/>
-              </w:rPr>
-            </w:pPr>
-            <w:r>
-              <w:rPr>
-                <w:rFonts w:ascii="Calibri" w:hAnsi="Calibri" w:eastAsia="Calibri" w:cs="Calibri"/>
-                <w:b w:val="1"/>
-                <w:bCs w:val="1"/>
+                <w:rFonts w:ascii="Calibri" w:eastAsia="Calibri" w:hAnsi="Calibri" w:cs="Calibri"/>
+                <w:b/>
+                <w:bCs/>
+              </w:rPr>
+            </w:pPr>
+            <w:r>
+              <w:rPr>
+                <w:rFonts w:ascii="Calibri" w:eastAsia="Calibri" w:hAnsi="Calibri" w:cs="Calibri"/>
+                <w:b/>
+                <w:bCs/>
               </w:rPr>
               <w:t>Screenshot</w:t>
             </w:r>
@@ -113,18 +101,16 @@
         <w:tc>
           <w:tcPr>
             <w:tcW w:w="3120" w:type="dxa"/>
-            <w:tcMar/>
-          </w:tcPr>
-          <w:p>
-            <w:pPr>
-              <w:pStyle w:val="Normal"/>
-              <w:rPr>
-                <w:rFonts w:ascii="Calibri" w:hAnsi="Calibri" w:eastAsia="Calibri" w:cs="Calibri"/>
-              </w:rPr>
-            </w:pPr>
-            <w:r>
-              <w:rPr>
-                <w:rFonts w:ascii="Calibri" w:hAnsi="Calibri" w:eastAsia="Calibri" w:cs="Calibri"/>
+          </w:tcPr>
+          <w:p>
+            <w:pPr>
+              <w:rPr>
+                <w:rFonts w:ascii="Calibri" w:eastAsia="Calibri" w:hAnsi="Calibri" w:cs="Calibri"/>
+              </w:rPr>
+            </w:pPr>
+            <w:r>
+              <w:rPr>
+                <w:rFonts w:ascii="Calibri" w:eastAsia="Calibri" w:hAnsi="Calibri" w:cs="Calibri"/>
               </w:rPr>
               <w:t>Marker size</w:t>
             </w:r>
@@ -133,103 +119,75 @@
         <w:tc>
           <w:tcPr>
             <w:tcW w:w="3120" w:type="dxa"/>
-            <w:tcMar/>
-          </w:tcPr>
-          <w:p>
-            <w:pPr>
-              <w:pStyle w:val="Normal"/>
-              <w:rPr>
-                <w:rFonts w:ascii="Calibri" w:hAnsi="Calibri" w:eastAsia="Calibri" w:cs="Calibri"/>
-              </w:rPr>
-            </w:pPr>
-            <w:r>
-              <w:rPr>
-                <w:rFonts w:ascii="Calibri" w:hAnsi="Calibri" w:eastAsia="Calibri" w:cs="Calibri"/>
-              </w:rPr>
-              <w:t xml:space="preserve">Do we have a clear definition of what is small or large? </w:t>
-            </w:r>
-            <w:r>
-              <w:rPr>
-                <w:rFonts w:ascii="Calibri" w:hAnsi="Calibri" w:eastAsia="Calibri" w:cs="Calibri"/>
-              </w:rPr>
-              <w:t>Maybe we</w:t>
-            </w:r>
-            <w:r>
-              <w:rPr>
-                <w:rFonts w:ascii="Calibri" w:hAnsi="Calibri" w:eastAsia="Calibri" w:cs="Calibri"/>
-              </w:rPr>
-              <w:t xml:space="preserve"> need more categories? </w:t>
-            </w:r>
-            <w:r>
-              <w:rPr>
-                <w:rFonts w:ascii="Calibri" w:hAnsi="Calibri" w:eastAsia="Calibri" w:cs="Calibri"/>
-              </w:rPr>
-              <w:t>It’s</w:t>
-            </w:r>
-            <w:r>
-              <w:rPr>
-                <w:rFonts w:ascii="Calibri" w:hAnsi="Calibri" w:eastAsia="Calibri" w:cs="Calibri"/>
-              </w:rPr>
-              <w:t xml:space="preserve"> hard because some large projects are funded with a small amount or only </w:t>
-            </w:r>
-            <w:r>
-              <w:rPr>
-                <w:rFonts w:ascii="Calibri" w:hAnsi="Calibri" w:eastAsia="Calibri" w:cs="Calibri"/>
-              </w:rPr>
-              <w:t>an initial</w:t>
-            </w:r>
-            <w:r>
-              <w:rPr>
-                <w:rFonts w:ascii="Calibri" w:hAnsi="Calibri" w:eastAsia="Calibri" w:cs="Calibri"/>
-              </w:rPr>
-              <w:t xml:space="preserve"> phase of a potentially large project. It might be best to make this based on funding amount?</w:t>
-            </w:r>
-          </w:p>
-        </w:tc>
-        <w:tc>
-          <w:tcPr>
-            <w:tcW w:w="3120" w:type="dxa"/>
-            <w:tcMar/>
-          </w:tcPr>
-          <w:p>
-            <w:pPr>
-              <w:pStyle w:val="Normal"/>
-            </w:pPr>
-            <w:r>
+          </w:tcPr>
+          <w:p>
+            <w:pPr>
+              <w:rPr>
+                <w:rFonts w:ascii="Calibri" w:eastAsia="Calibri" w:hAnsi="Calibri" w:cs="Calibri"/>
+              </w:rPr>
+            </w:pPr>
+            <w:r>
+              <w:rPr>
+                <w:rFonts w:ascii="Calibri" w:eastAsia="Calibri" w:hAnsi="Calibri" w:cs="Calibri"/>
+              </w:rPr>
+              <w:t>Do we have a clear definition of what is small or large? Maybe we need more categories? It’s hard because some large projects are funded with a small amount or only an initial phase of a potentially large project. It might be best to make this based on funding amount?</w:t>
+            </w:r>
+          </w:p>
+        </w:tc>
+        <w:tc>
+          <w:tcPr>
+            <w:tcW w:w="3120" w:type="dxa"/>
+          </w:tcPr>
+          <w:p>
+            <w:pPr>
+              <w:rPr>
+                <w:rFonts w:hint="eastAsia"/>
+              </w:rPr>
+            </w:pPr>
+            <w:r>
+              <w:rPr>
+                <w:noProof/>
+              </w:rPr>
               <w:drawing>
-                <wp:inline wp14:editId="6CB551B1" wp14:anchorId="7DD0208C">
+                <wp:inline distT="0" distB="0" distL="0" distR="0" wp14:anchorId="7DD0208C" wp14:editId="6CB551B1">
                   <wp:extent cx="1629002" cy="533474"/>
                   <wp:effectExtent l="0" t="0" r="0" b="0"/>
-                  <wp:docPr id="523767694" name="drawing"/>
+                  <wp:docPr id="523767694" name="drawing">
+                    <a:extLst xmlns:a="http://schemas.openxmlformats.org/drawingml/2006/main">
+                      <a:ext uri="{FF2B5EF4-FFF2-40B4-BE49-F238E27FC236}">
+                        <a16:creationId xmlns:a16="http://schemas.microsoft.com/office/drawing/2014/main" id="{F48F8486-759F-41F6-B441-53D44C2ABEA5}"/>
+                      </a:ext>
+                    </a:extLst>
+                  </wp:docPr>
                   <wp:cNvGraphicFramePr>
-                    <a:graphicFrameLocks noChangeAspect="1"/>
+                    <a:graphicFrameLocks xmlns:a="http://schemas.openxmlformats.org/drawingml/2006/main" noChangeAspect="1"/>
                   </wp:cNvGraphicFramePr>
-                  <a:graphic>
-                    <a:graphicData xmlns:a="http://schemas.openxmlformats.org/drawingml/2006/main" uri="http://schemas.openxmlformats.org/drawingml/2006/picture">
+                  <a:graphic xmlns:a="http://schemas.openxmlformats.org/drawingml/2006/main">
+                    <a:graphicData uri="http://schemas.openxmlformats.org/drawingml/2006/picture">
                       <pic:pic xmlns:pic="http://schemas.openxmlformats.org/drawingml/2006/picture">
-                        <pic:nvPicPr xmlns:pic="http://schemas.openxmlformats.org/drawingml/2006/picture">
-                          <pic:cNvPr xmlns:pic="http://schemas.openxmlformats.org/drawingml/2006/picture" id="523767694" name="Picture 523767694"/>
-                          <pic:cNvPicPr xmlns:pic="http://schemas.openxmlformats.org/drawingml/2006/picture"/>
+                        <pic:nvPicPr>
+                          <pic:cNvPr id="523767694" name="Picture 523767694"/>
+                          <pic:cNvPicPr/>
                         </pic:nvPicPr>
-                        <pic:blipFill xmlns:pic="http://schemas.openxmlformats.org/drawingml/2006/picture">
-                          <a:blip xmlns:r="http://schemas.openxmlformats.org/officeDocument/2006/relationships" xmlns:a="http://schemas.openxmlformats.org/drawingml/2006/main" r:embed="rId661313563">
-                            <a:extLst xmlns:a="http://schemas.openxmlformats.org/drawingml/2006/main">
-                              <a:ext xmlns:a="http://schemas.openxmlformats.org/drawingml/2006/main" uri="{28A0092B-C50C-407E-A947-70E740481C1C}">
+                        <pic:blipFill>
+                          <a:blip r:embed="rId4">
+                            <a:extLst>
+                              <a:ext uri="{28A0092B-C50C-407E-A947-70E740481C1C}">
                                 <a14:useLocalDpi xmlns:a14="http://schemas.microsoft.com/office/drawing/2010/main"/>
                               </a:ext>
                             </a:extLst>
                           </a:blip>
-                          <a:stretch xmlns:a="http://schemas.openxmlformats.org/drawingml/2006/main">
-                            <a:fillRect xmlns:a="http://schemas.openxmlformats.org/drawingml/2006/main"/>
+                          <a:stretch>
+                            <a:fillRect/>
                           </a:stretch>
                         </pic:blipFill>
-                        <pic:spPr xmlns:pic="http://schemas.openxmlformats.org/drawingml/2006/picture">
-                          <a:xfrm xmlns:a="http://schemas.openxmlformats.org/drawingml/2006/main">
-                            <a:off xmlns:a="http://schemas.openxmlformats.org/drawingml/2006/main" x="0" y="0"/>
-                            <a:ext xmlns:a="http://schemas.openxmlformats.org/drawingml/2006/main" cx="1629002" cy="533474"/>
+                        <pic:spPr>
+                          <a:xfrm>
+                            <a:off x="0" y="0"/>
+                            <a:ext cx="1629002" cy="533474"/>
                           </a:xfrm>
-                          <a:prstGeom xmlns:a="http://schemas.openxmlformats.org/drawingml/2006/main" prst="rect">
-                            <a:avLst xmlns:a="http://schemas.openxmlformats.org/drawingml/2006/main"/>
+                          <a:prstGeom prst="rect">
+                            <a:avLst/>
                           </a:prstGeom>
                         </pic:spPr>
                       </pic:pic>
@@ -248,18 +206,16 @@
         <w:tc>
           <w:tcPr>
             <w:tcW w:w="3120" w:type="dxa"/>
-            <w:tcMar/>
-          </w:tcPr>
-          <w:p>
-            <w:pPr>
-              <w:pStyle w:val="Normal"/>
-              <w:rPr>
-                <w:rFonts w:ascii="Calibri" w:hAnsi="Calibri" w:eastAsia="Calibri" w:cs="Calibri"/>
-              </w:rPr>
-            </w:pPr>
-            <w:r>
-              <w:rPr>
-                <w:rFonts w:ascii="Calibri" w:hAnsi="Calibri" w:eastAsia="Calibri" w:cs="Calibri"/>
+          </w:tcPr>
+          <w:p>
+            <w:pPr>
+              <w:rPr>
+                <w:rFonts w:ascii="Calibri" w:eastAsia="Calibri" w:hAnsi="Calibri" w:cs="Calibri"/>
+              </w:rPr>
+            </w:pPr>
+            <w:r>
+              <w:rPr>
+                <w:rFonts w:ascii="Calibri" w:eastAsia="Calibri" w:hAnsi="Calibri" w:cs="Calibri"/>
               </w:rPr>
               <w:t>Sector: TarraCO2</w:t>
             </w:r>
@@ -268,67 +224,89 @@
         <w:tc>
           <w:tcPr>
             <w:tcW w:w="3120" w:type="dxa"/>
-            <w:tcMar/>
-          </w:tcPr>
-          <w:p>
-            <w:pPr>
-              <w:pStyle w:val="Normal"/>
-              <w:rPr>
-                <w:rFonts w:ascii="Calibri" w:hAnsi="Calibri" w:eastAsia="Calibri" w:cs="Calibri"/>
-              </w:rPr>
-            </w:pPr>
-            <w:r>
-              <w:rPr>
-                <w:rFonts w:ascii="Calibri" w:hAnsi="Calibri" w:eastAsia="Calibri" w:cs="Calibri"/>
-              </w:rPr>
-              <w:t>TarraCO2 is marked as other but is actually T&amp;S infrastructure</w:t>
-            </w:r>
-          </w:p>
-        </w:tc>
-        <w:tc>
-          <w:tcPr>
-            <w:tcW w:w="3120" w:type="dxa"/>
-            <w:tcMar/>
-          </w:tcPr>
-          <w:p>
-            <w:pPr>
-              <w:pStyle w:val="Normal"/>
-            </w:pPr>
-            <w:r>
+          </w:tcPr>
+          <w:p>
+            <w:pPr>
+              <w:rPr>
+                <w:rFonts w:ascii="Calibri" w:eastAsia="Calibri" w:hAnsi="Calibri" w:cs="Calibri"/>
+              </w:rPr>
+            </w:pPr>
+            <w:r>
+              <w:rPr>
+                <w:rFonts w:ascii="Calibri" w:eastAsia="Calibri" w:hAnsi="Calibri" w:cs="Calibri"/>
+              </w:rPr>
+              <w:t xml:space="preserve">TarraCO2 is marked as other but is </w:t>
+            </w:r>
+            <w:proofErr w:type="gramStart"/>
+            <w:r>
+              <w:rPr>
+                <w:rFonts w:ascii="Calibri" w:eastAsia="Calibri" w:hAnsi="Calibri" w:cs="Calibri"/>
+              </w:rPr>
+              <w:t>actually T&amp;S</w:t>
+            </w:r>
+            <w:proofErr w:type="gramEnd"/>
+            <w:r>
+              <w:rPr>
+                <w:rFonts w:ascii="Calibri" w:eastAsia="Calibri" w:hAnsi="Calibri" w:cs="Calibri"/>
+              </w:rPr>
+              <w:t xml:space="preserve"> infrastructure</w:t>
+            </w:r>
+          </w:p>
+        </w:tc>
+        <w:tc>
+          <w:tcPr>
+            <w:tcW w:w="3120" w:type="dxa"/>
+          </w:tcPr>
+          <w:p>
+            <w:pPr>
+              <w:rPr>
+                <w:rFonts w:hint="eastAsia"/>
+              </w:rPr>
+            </w:pPr>
+            <w:r>
+              <w:rPr>
+                <w:noProof/>
+              </w:rPr>
               <w:drawing>
-                <wp:inline wp14:editId="04EE87EE" wp14:anchorId="17F6AE1F">
+                <wp:inline distT="0" distB="0" distL="0" distR="0" wp14:anchorId="17F6AE1F" wp14:editId="04EE87EE">
                   <wp:extent cx="1838325" cy="323850"/>
                   <wp:effectExtent l="0" t="0" r="0" b="0"/>
-                  <wp:docPr id="916434590" name="drawing"/>
+                  <wp:docPr id="916434590" name="drawing">
+                    <a:extLst xmlns:a="http://schemas.openxmlformats.org/drawingml/2006/main">
+                      <a:ext uri="{FF2B5EF4-FFF2-40B4-BE49-F238E27FC236}">
+                        <a16:creationId xmlns:a16="http://schemas.microsoft.com/office/drawing/2014/main" id="{58080E74-029E-43F4-8CBA-C3ACA00B8FB6}"/>
+                      </a:ext>
+                    </a:extLst>
+                  </wp:docPr>
                   <wp:cNvGraphicFramePr>
-                    <a:graphicFrameLocks noChangeAspect="1"/>
+                    <a:graphicFrameLocks xmlns:a="http://schemas.openxmlformats.org/drawingml/2006/main" noChangeAspect="1"/>
                   </wp:cNvGraphicFramePr>
-                  <a:graphic>
-                    <a:graphicData xmlns:a="http://schemas.openxmlformats.org/drawingml/2006/main" uri="http://schemas.openxmlformats.org/drawingml/2006/picture">
+                  <a:graphic xmlns:a="http://schemas.openxmlformats.org/drawingml/2006/main">
+                    <a:graphicData uri="http://schemas.openxmlformats.org/drawingml/2006/picture">
                       <pic:pic xmlns:pic="http://schemas.openxmlformats.org/drawingml/2006/picture">
-                        <pic:nvPicPr xmlns:pic="http://schemas.openxmlformats.org/drawingml/2006/picture">
-                          <pic:cNvPr xmlns:pic="http://schemas.openxmlformats.org/drawingml/2006/picture" id="916434590" name="Picture 916434590"/>
-                          <pic:cNvPicPr xmlns:pic="http://schemas.openxmlformats.org/drawingml/2006/picture"/>
+                        <pic:nvPicPr>
+                          <pic:cNvPr id="916434590" name="Picture 916434590"/>
+                          <pic:cNvPicPr/>
                         </pic:nvPicPr>
-                        <pic:blipFill xmlns:pic="http://schemas.openxmlformats.org/drawingml/2006/picture">
-                          <a:blip xmlns:r="http://schemas.openxmlformats.org/officeDocument/2006/relationships" xmlns:a="http://schemas.openxmlformats.org/drawingml/2006/main" r:embed="rId939858625">
-                            <a:extLst xmlns:a="http://schemas.openxmlformats.org/drawingml/2006/main">
-                              <a:ext xmlns:a="http://schemas.openxmlformats.org/drawingml/2006/main" uri="{28A0092B-C50C-407E-A947-70E740481C1C}">
+                        <pic:blipFill>
+                          <a:blip r:embed="rId5">
+                            <a:extLst>
+                              <a:ext uri="{28A0092B-C50C-407E-A947-70E740481C1C}">
                                 <a14:useLocalDpi xmlns:a14="http://schemas.microsoft.com/office/drawing/2010/main"/>
                               </a:ext>
                             </a:extLst>
                           </a:blip>
-                          <a:stretch xmlns:a="http://schemas.openxmlformats.org/drawingml/2006/main">
-                            <a:fillRect xmlns:a="http://schemas.openxmlformats.org/drawingml/2006/main"/>
+                          <a:stretch>
+                            <a:fillRect/>
                           </a:stretch>
                         </pic:blipFill>
-                        <pic:spPr xmlns:pic="http://schemas.openxmlformats.org/drawingml/2006/picture">
-                          <a:xfrm xmlns:a="http://schemas.openxmlformats.org/drawingml/2006/main">
-                            <a:off xmlns:a="http://schemas.openxmlformats.org/drawingml/2006/main" x="0" y="0"/>
-                            <a:ext xmlns:a="http://schemas.openxmlformats.org/drawingml/2006/main" cx="1838325" cy="323850"/>
+                        <pic:spPr>
+                          <a:xfrm>
+                            <a:off x="0" y="0"/>
+                            <a:ext cx="1838325" cy="323850"/>
                           </a:xfrm>
-                          <a:prstGeom xmlns:a="http://schemas.openxmlformats.org/drawingml/2006/main" prst="rect">
-                            <a:avLst xmlns:a="http://schemas.openxmlformats.org/drawingml/2006/main"/>
+                          <a:prstGeom prst="rect">
+                            <a:avLst/>
                           </a:prstGeom>
                         </pic:spPr>
                       </pic:pic>
@@ -347,24 +325,26 @@
         <w:tc>
           <w:tcPr>
             <w:tcW w:w="3120" w:type="dxa"/>
-            <w:tcMar/>
-          </w:tcPr>
-          <w:p>
-            <w:pPr>
-              <w:pStyle w:val="Normal"/>
-              <w:rPr>
-                <w:rFonts w:ascii="Calibri" w:hAnsi="Calibri" w:eastAsia="Calibri" w:cs="Calibri"/>
-              </w:rPr>
-            </w:pPr>
-            <w:r>
-              <w:rPr>
-                <w:rFonts w:ascii="Calibri" w:hAnsi="Calibri" w:eastAsia="Calibri" w:cs="Calibri"/>
+          </w:tcPr>
+          <w:p>
+            <w:pPr>
+              <w:rPr>
+                <w:rFonts w:ascii="Calibri" w:eastAsia="Calibri" w:hAnsi="Calibri" w:cs="Calibri"/>
+              </w:rPr>
+            </w:pPr>
+            <w:proofErr w:type="spellStart"/>
+            <w:proofErr w:type="gramStart"/>
+            <w:r>
+              <w:rPr>
+                <w:rFonts w:ascii="Calibri" w:eastAsia="Calibri" w:hAnsi="Calibri" w:cs="Calibri"/>
               </w:rPr>
               <w:t>Category:CCS</w:t>
             </w:r>
-            <w:r>
-              <w:rPr>
-                <w:rFonts w:ascii="Calibri" w:hAnsi="Calibri" w:eastAsia="Calibri" w:cs="Calibri"/>
+            <w:proofErr w:type="spellEnd"/>
+            <w:proofErr w:type="gramEnd"/>
+            <w:r>
+              <w:rPr>
+                <w:rFonts w:ascii="Calibri" w:eastAsia="Calibri" w:hAnsi="Calibri" w:cs="Calibri"/>
               </w:rPr>
               <w:t xml:space="preserve"> T&amp;S</w:t>
             </w:r>
@@ -373,18 +353,16 @@
         <w:tc>
           <w:tcPr>
             <w:tcW w:w="3120" w:type="dxa"/>
-            <w:tcMar/>
-          </w:tcPr>
-          <w:p>
-            <w:pPr>
-              <w:pStyle w:val="Normal"/>
-              <w:rPr>
-                <w:rFonts w:ascii="Calibri" w:hAnsi="Calibri" w:eastAsia="Calibri" w:cs="Calibri"/>
-              </w:rPr>
-            </w:pPr>
-            <w:r>
-              <w:rPr>
-                <w:rFonts w:ascii="Calibri" w:hAnsi="Calibri" w:eastAsia="Calibri" w:cs="Calibri"/>
+          </w:tcPr>
+          <w:p>
+            <w:pPr>
+              <w:rPr>
+                <w:rFonts w:ascii="Calibri" w:eastAsia="Calibri" w:hAnsi="Calibri" w:cs="Calibri"/>
+              </w:rPr>
+            </w:pPr>
+            <w:r>
+              <w:rPr>
+                <w:rFonts w:ascii="Calibri" w:eastAsia="Calibri" w:hAnsi="Calibri" w:cs="Calibri"/>
               </w:rPr>
               <w:t>Can we rename this CO2 T&amp;S?</w:t>
             </w:r>
@@ -393,47 +371,57 @@
         <w:tc>
           <w:tcPr>
             <w:tcW w:w="3120" w:type="dxa"/>
-            <w:tcMar/>
-          </w:tcPr>
-          <w:p>
-            <w:pPr>
-              <w:pStyle w:val="Normal"/>
-            </w:pPr>
-            <w:r>
+          </w:tcPr>
+          <w:p>
+            <w:pPr>
+              <w:rPr>
+                <w:rFonts w:hint="eastAsia"/>
+              </w:rPr>
+            </w:pPr>
+            <w:r>
+              <w:rPr>
+                <w:noProof/>
+              </w:rPr>
               <w:drawing>
-                <wp:inline wp14:editId="12CB0644" wp14:anchorId="46F4B6E2">
+                <wp:inline distT="0" distB="0" distL="0" distR="0" wp14:anchorId="46F4B6E2" wp14:editId="12CB0644">
                   <wp:extent cx="1838325" cy="485775"/>
                   <wp:effectExtent l="0" t="0" r="0" b="0"/>
-                  <wp:docPr id="66426576" name="drawing"/>
+                  <wp:docPr id="66426576" name="drawing">
+                    <a:extLst xmlns:a="http://schemas.openxmlformats.org/drawingml/2006/main">
+                      <a:ext uri="{FF2B5EF4-FFF2-40B4-BE49-F238E27FC236}">
+                        <a16:creationId xmlns:a16="http://schemas.microsoft.com/office/drawing/2014/main" id="{77AF37B6-D196-4D0C-AA0C-D0C680BD0566}"/>
+                      </a:ext>
+                    </a:extLst>
+                  </wp:docPr>
                   <wp:cNvGraphicFramePr>
-                    <a:graphicFrameLocks noChangeAspect="1"/>
+                    <a:graphicFrameLocks xmlns:a="http://schemas.openxmlformats.org/drawingml/2006/main" noChangeAspect="1"/>
                   </wp:cNvGraphicFramePr>
-                  <a:graphic>
-                    <a:graphicData xmlns:a="http://schemas.openxmlformats.org/drawingml/2006/main" uri="http://schemas.openxmlformats.org/drawingml/2006/picture">
+                  <a:graphic xmlns:a="http://schemas.openxmlformats.org/drawingml/2006/main">
+                    <a:graphicData uri="http://schemas.openxmlformats.org/drawingml/2006/picture">
                       <pic:pic xmlns:pic="http://schemas.openxmlformats.org/drawingml/2006/picture">
-                        <pic:nvPicPr xmlns:pic="http://schemas.openxmlformats.org/drawingml/2006/picture">
-                          <pic:cNvPr xmlns:pic="http://schemas.openxmlformats.org/drawingml/2006/picture" id="66426576" name="Picture 66426576"/>
-                          <pic:cNvPicPr xmlns:pic="http://schemas.openxmlformats.org/drawingml/2006/picture"/>
+                        <pic:nvPicPr>
+                          <pic:cNvPr id="66426576" name="Picture 66426576"/>
+                          <pic:cNvPicPr/>
                         </pic:nvPicPr>
-                        <pic:blipFill xmlns:pic="http://schemas.openxmlformats.org/drawingml/2006/picture">
-                          <a:blip xmlns:r="http://schemas.openxmlformats.org/officeDocument/2006/relationships" xmlns:a="http://schemas.openxmlformats.org/drawingml/2006/main" r:embed="rId1113651697">
-                            <a:extLst xmlns:a="http://schemas.openxmlformats.org/drawingml/2006/main">
-                              <a:ext xmlns:a="http://schemas.openxmlformats.org/drawingml/2006/main" uri="{28A0092B-C50C-407E-A947-70E740481C1C}">
+                        <pic:blipFill>
+                          <a:blip r:embed="rId6">
+                            <a:extLst>
+                              <a:ext uri="{28A0092B-C50C-407E-A947-70E740481C1C}">
                                 <a14:useLocalDpi xmlns:a14="http://schemas.microsoft.com/office/drawing/2010/main"/>
                               </a:ext>
                             </a:extLst>
                           </a:blip>
-                          <a:stretch xmlns:a="http://schemas.openxmlformats.org/drawingml/2006/main">
-                            <a:fillRect xmlns:a="http://schemas.openxmlformats.org/drawingml/2006/main"/>
+                          <a:stretch>
+                            <a:fillRect/>
                           </a:stretch>
                         </pic:blipFill>
-                        <pic:spPr xmlns:pic="http://schemas.openxmlformats.org/drawingml/2006/picture">
-                          <a:xfrm xmlns:a="http://schemas.openxmlformats.org/drawingml/2006/main">
-                            <a:off xmlns:a="http://schemas.openxmlformats.org/drawingml/2006/main" x="0" y="0"/>
-                            <a:ext xmlns:a="http://schemas.openxmlformats.org/drawingml/2006/main" cx="1838325" cy="485775"/>
+                        <pic:spPr>
+                          <a:xfrm>
+                            <a:off x="0" y="0"/>
+                            <a:ext cx="1838325" cy="485775"/>
                           </a:xfrm>
-                          <a:prstGeom xmlns:a="http://schemas.openxmlformats.org/drawingml/2006/main" prst="rect">
-                            <a:avLst xmlns:a="http://schemas.openxmlformats.org/drawingml/2006/main"/>
+                          <a:prstGeom prst="rect">
+                            <a:avLst/>
                           </a:prstGeom>
                         </pic:spPr>
                       </pic:pic>
@@ -452,18 +440,16 @@
         <w:tc>
           <w:tcPr>
             <w:tcW w:w="3120" w:type="dxa"/>
-            <w:tcMar/>
-          </w:tcPr>
-          <w:p>
-            <w:pPr>
-              <w:pStyle w:val="Normal"/>
-              <w:rPr>
-                <w:rFonts w:ascii="Calibri" w:hAnsi="Calibri" w:eastAsia="Calibri" w:cs="Calibri"/>
-              </w:rPr>
-            </w:pPr>
-            <w:r>
-              <w:rPr>
-                <w:rFonts w:ascii="Calibri" w:hAnsi="Calibri" w:eastAsia="Calibri" w:cs="Calibri"/>
+          </w:tcPr>
+          <w:p>
+            <w:pPr>
+              <w:rPr>
+                <w:rFonts w:ascii="Calibri" w:eastAsia="Calibri" w:hAnsi="Calibri" w:cs="Calibri"/>
+              </w:rPr>
+            </w:pPr>
+            <w:r>
+              <w:rPr>
+                <w:rFonts w:ascii="Calibri" w:eastAsia="Calibri" w:hAnsi="Calibri" w:cs="Calibri"/>
               </w:rPr>
               <w:t>Category: GO4ECOPLANET</w:t>
             </w:r>
@@ -472,18 +458,16 @@
         <w:tc>
           <w:tcPr>
             <w:tcW w:w="3120" w:type="dxa"/>
-            <w:tcMar/>
-          </w:tcPr>
-          <w:p>
-            <w:pPr>
-              <w:pStyle w:val="Normal"/>
-              <w:rPr>
-                <w:rFonts w:ascii="Calibri" w:hAnsi="Calibri" w:eastAsia="Calibri" w:cs="Calibri"/>
-              </w:rPr>
-            </w:pPr>
-            <w:r>
-              <w:rPr>
-                <w:rFonts w:ascii="Calibri" w:hAnsi="Calibri" w:eastAsia="Calibri" w:cs="Calibri"/>
+          </w:tcPr>
+          <w:p>
+            <w:pPr>
+              <w:rPr>
+                <w:rFonts w:ascii="Calibri" w:eastAsia="Calibri" w:hAnsi="Calibri" w:cs="Calibri"/>
+              </w:rPr>
+            </w:pPr>
+            <w:r>
+              <w:rPr>
+                <w:rFonts w:ascii="Calibri" w:eastAsia="Calibri" w:hAnsi="Calibri" w:cs="Calibri"/>
               </w:rPr>
               <w:t>Marked as cement &amp; lime but it’s just cement</w:t>
             </w:r>
@@ -492,47 +476,57 @@
         <w:tc>
           <w:tcPr>
             <w:tcW w:w="3120" w:type="dxa"/>
-            <w:tcMar/>
-          </w:tcPr>
-          <w:p>
-            <w:pPr>
-              <w:pStyle w:val="Normal"/>
-            </w:pPr>
-            <w:r>
+          </w:tcPr>
+          <w:p>
+            <w:pPr>
+              <w:rPr>
+                <w:rFonts w:hint="eastAsia"/>
+              </w:rPr>
+            </w:pPr>
+            <w:r>
+              <w:rPr>
+                <w:noProof/>
+              </w:rPr>
               <w:drawing>
-                <wp:inline wp14:editId="35E4235E" wp14:anchorId="1F61E0B2">
+                <wp:inline distT="0" distB="0" distL="0" distR="0" wp14:anchorId="1F61E0B2" wp14:editId="35E4235E">
                   <wp:extent cx="695325" cy="1838325"/>
                   <wp:effectExtent l="0" t="0" r="0" b="0"/>
-                  <wp:docPr id="236849351" name="drawing"/>
+                  <wp:docPr id="236849351" name="drawing">
+                    <a:extLst xmlns:a="http://schemas.openxmlformats.org/drawingml/2006/main">
+                      <a:ext uri="{FF2B5EF4-FFF2-40B4-BE49-F238E27FC236}">
+                        <a16:creationId xmlns:a16="http://schemas.microsoft.com/office/drawing/2014/main" id="{0A50EDB1-8598-4511-8FDA-0AB05E742F35}"/>
+                      </a:ext>
+                    </a:extLst>
+                  </wp:docPr>
                   <wp:cNvGraphicFramePr>
-                    <a:graphicFrameLocks noChangeAspect="1"/>
+                    <a:graphicFrameLocks xmlns:a="http://schemas.openxmlformats.org/drawingml/2006/main" noChangeAspect="1"/>
                   </wp:cNvGraphicFramePr>
-                  <a:graphic>
-                    <a:graphicData xmlns:a="http://schemas.openxmlformats.org/drawingml/2006/main" uri="http://schemas.openxmlformats.org/drawingml/2006/picture">
+                  <a:graphic xmlns:a="http://schemas.openxmlformats.org/drawingml/2006/main">
+                    <a:graphicData uri="http://schemas.openxmlformats.org/drawingml/2006/picture">
                       <pic:pic xmlns:pic="http://schemas.openxmlformats.org/drawingml/2006/picture">
-                        <pic:nvPicPr xmlns:pic="http://schemas.openxmlformats.org/drawingml/2006/picture">
-                          <pic:cNvPr xmlns:pic="http://schemas.openxmlformats.org/drawingml/2006/picture" id="236849351" name="Picture 236849351"/>
-                          <pic:cNvPicPr xmlns:pic="http://schemas.openxmlformats.org/drawingml/2006/picture"/>
+                        <pic:nvPicPr>
+                          <pic:cNvPr id="236849351" name="Picture 236849351"/>
+                          <pic:cNvPicPr/>
                         </pic:nvPicPr>
-                        <pic:blipFill xmlns:pic="http://schemas.openxmlformats.org/drawingml/2006/picture">
-                          <a:blip xmlns:r="http://schemas.openxmlformats.org/officeDocument/2006/relationships" xmlns:a="http://schemas.openxmlformats.org/drawingml/2006/main" r:embed="rId1610794017">
-                            <a:extLst xmlns:a="http://schemas.openxmlformats.org/drawingml/2006/main">
-                              <a:ext xmlns:a="http://schemas.openxmlformats.org/drawingml/2006/main" uri="{28A0092B-C50C-407E-A947-70E740481C1C}">
+                        <pic:blipFill>
+                          <a:blip r:embed="rId7">
+                            <a:extLst>
+                              <a:ext uri="{28A0092B-C50C-407E-A947-70E740481C1C}">
                                 <a14:useLocalDpi xmlns:a14="http://schemas.microsoft.com/office/drawing/2010/main"/>
                               </a:ext>
                             </a:extLst>
                           </a:blip>
-                          <a:stretch xmlns:a="http://schemas.openxmlformats.org/drawingml/2006/main">
-                            <a:fillRect xmlns:a="http://schemas.openxmlformats.org/drawingml/2006/main"/>
+                          <a:stretch>
+                            <a:fillRect/>
                           </a:stretch>
                         </pic:blipFill>
-                        <pic:spPr xmlns:pic="http://schemas.openxmlformats.org/drawingml/2006/picture">
-                          <a:xfrm xmlns:a="http://schemas.openxmlformats.org/drawingml/2006/main">
-                            <a:off xmlns:a="http://schemas.openxmlformats.org/drawingml/2006/main" x="0" y="0"/>
-                            <a:ext xmlns:a="http://schemas.openxmlformats.org/drawingml/2006/main" cx="695325" cy="1838325"/>
+                        <pic:spPr>
+                          <a:xfrm>
+                            <a:off x="0" y="0"/>
+                            <a:ext cx="695325" cy="1838325"/>
                           </a:xfrm>
-                          <a:prstGeom xmlns:a="http://schemas.openxmlformats.org/drawingml/2006/main" prst="rect">
-                            <a:avLst xmlns:a="http://schemas.openxmlformats.org/drawingml/2006/main"/>
+                          <a:prstGeom prst="rect">
+                            <a:avLst/>
                           </a:prstGeom>
                         </pic:spPr>
                       </pic:pic>
@@ -551,39 +545,36 @@
         <w:tc>
           <w:tcPr>
             <w:tcW w:w="3120" w:type="dxa"/>
-            <w:tcMar/>
-          </w:tcPr>
-          <w:p>
-            <w:pPr>
-              <w:pStyle w:val="Normal"/>
-              <w:rPr>
-                <w:rFonts w:ascii="Calibri" w:hAnsi="Calibri" w:eastAsia="Calibri" w:cs="Calibri"/>
-              </w:rPr>
-            </w:pPr>
-          </w:p>
-        </w:tc>
-        <w:tc>
-          <w:tcPr>
-            <w:tcW w:w="3120" w:type="dxa"/>
-            <w:tcMar/>
-          </w:tcPr>
-          <w:p>
-            <w:pPr>
-              <w:pStyle w:val="Normal"/>
-              <w:rPr>
-                <w:rFonts w:ascii="Calibri" w:hAnsi="Calibri" w:eastAsia="Calibri" w:cs="Calibri"/>
-              </w:rPr>
-            </w:pPr>
-          </w:p>
-        </w:tc>
-        <w:tc>
-          <w:tcPr>
-            <w:tcW w:w="3120" w:type="dxa"/>
-            <w:tcMar/>
-          </w:tcPr>
-          <w:p>
-            <w:pPr>
-              <w:pStyle w:val="Normal"/>
+          </w:tcPr>
+          <w:p>
+            <w:pPr>
+              <w:rPr>
+                <w:rFonts w:ascii="Calibri" w:eastAsia="Calibri" w:hAnsi="Calibri" w:cs="Calibri"/>
+              </w:rPr>
+            </w:pPr>
+          </w:p>
+        </w:tc>
+        <w:tc>
+          <w:tcPr>
+            <w:tcW w:w="3120" w:type="dxa"/>
+          </w:tcPr>
+          <w:p>
+            <w:pPr>
+              <w:rPr>
+                <w:rFonts w:ascii="Calibri" w:eastAsia="Calibri" w:hAnsi="Calibri" w:cs="Calibri"/>
+              </w:rPr>
+            </w:pPr>
+          </w:p>
+        </w:tc>
+        <w:tc>
+          <w:tcPr>
+            <w:tcW w:w="3120" w:type="dxa"/>
+          </w:tcPr>
+          <w:p>
+            <w:pPr>
+              <w:rPr>
+                <w:rFonts w:hint="eastAsia"/>
+              </w:rPr>
             </w:pPr>
           </w:p>
         </w:tc>
@@ -595,47 +586,50 @@
         <w:tc>
           <w:tcPr>
             <w:tcW w:w="3120" w:type="dxa"/>
-            <w:tcMar/>
-          </w:tcPr>
-          <w:p>
-            <w:pPr>
-              <w:pStyle w:val="Normal"/>
-              <w:rPr>
-                <w:rFonts w:ascii="Calibri" w:hAnsi="Calibri" w:eastAsia="Calibri" w:cs="Calibri"/>
-              </w:rPr>
-            </w:pPr>
-          </w:p>
-        </w:tc>
-        <w:tc>
-          <w:tcPr>
-            <w:tcW w:w="3120" w:type="dxa"/>
-            <w:tcMar/>
-          </w:tcPr>
-          <w:p>
-            <w:pPr>
-              <w:pStyle w:val="Normal"/>
-              <w:rPr>
-                <w:rFonts w:ascii="Calibri" w:hAnsi="Calibri" w:eastAsia="Calibri" w:cs="Calibri"/>
-              </w:rPr>
-            </w:pPr>
-          </w:p>
-        </w:tc>
-        <w:tc>
-          <w:tcPr>
-            <w:tcW w:w="3120" w:type="dxa"/>
-            <w:tcMar/>
-          </w:tcPr>
-          <w:p>
-            <w:pPr>
-              <w:pStyle w:val="Normal"/>
+          </w:tcPr>
+          <w:p>
+            <w:pPr>
+              <w:rPr>
+                <w:rFonts w:ascii="Calibri" w:eastAsia="Calibri" w:hAnsi="Calibri" w:cs="Calibri"/>
+              </w:rPr>
+            </w:pPr>
+          </w:p>
+        </w:tc>
+        <w:tc>
+          <w:tcPr>
+            <w:tcW w:w="3120" w:type="dxa"/>
+          </w:tcPr>
+          <w:p>
+            <w:pPr>
+              <w:rPr>
+                <w:rFonts w:ascii="Calibri" w:eastAsia="Calibri" w:hAnsi="Calibri" w:cs="Calibri"/>
+              </w:rPr>
+            </w:pPr>
+          </w:p>
+        </w:tc>
+        <w:tc>
+          <w:tcPr>
+            <w:tcW w:w="3120" w:type="dxa"/>
+          </w:tcPr>
+          <w:p>
+            <w:pPr>
+              <w:rPr>
+                <w:rFonts w:hint="eastAsia"/>
+              </w:rPr>
             </w:pPr>
           </w:p>
         </w:tc>
       </w:tr>
     </w:tbl>
-    <w:p/>
+    <w:p>
+      <w:pPr>
+        <w:rPr>
+          <w:rFonts w:hint="eastAsia"/>
+        </w:rPr>
+      </w:pPr>
+    </w:p>
     <w:sectPr>
-      <w:pgSz w:w="12240" w:h="15840" w:orient="portrait"/>
+      <w:pgSz w:w="12240" w:h="15840"/>
       <w:pgMar w:top="1440" w:right="1440" w:bottom="1440" w:left="1440" w:header="720" w:footer="720" w:gutter="0"/>
       <w:cols w:space="720"/>
       <w:docGrid w:linePitch="360"/>
@@ -645,11 +639,11 @@
 </file>
 
 <file path=word/styles.xml><?xml version="1.0" encoding="utf-8"?>
-<w:styles xmlns:wp14="http://schemas.microsoft.com/office/word/2010/wordprocessingDrawing" xmlns:mc="http://schemas.openxmlformats.org/markup-compatibility/2006" xmlns:r="http://schemas.openxmlformats.org/officeDocument/2006/relationships" xmlns:w="http://schemas.openxmlformats.org/wordprocessingml/2006/main" xmlns:w14="http://schemas.microsoft.com/office/word/2010/wordml" xmlns:w15="http://schemas.microsoft.com/office/word/2012/wordml" xmlns:w16se="http://schemas.microsoft.com/office/word/2015/wordml/symex" xmlns:w16cid="http://schemas.microsoft.com/office/word/2016/wordml/cid" xmlns:w16="http://schemas.microsoft.com/office/word/2018/wordml" xmlns:w16cex="http://schemas.microsoft.com/office/word/2018/wordml/cex" xmlns:w16sdtdh="http://schemas.microsoft.com/office/word/2020/wordml/sdtdatahash" xmlns:w16sdtfl="http://schemas.microsoft.com/office/word/2024/wordml/sdtformatlock" mc:Ignorable="w14 w15 wp14 w16se w16cid w16 w16cex w16sdtdh w16sdtfl">
+<w:styles xmlns:mc="http://schemas.openxmlformats.org/markup-compatibility/2006" xmlns:r="http://schemas.openxmlformats.org/officeDocument/2006/relationships" xmlns:w="http://schemas.openxmlformats.org/wordprocessingml/2006/main" xmlns:w14="http://schemas.microsoft.com/office/word/2010/wordml" xmlns:w15="http://schemas.microsoft.com/office/word/2012/wordml" xmlns:w16cex="http://schemas.microsoft.com/office/word/2018/wordml/cex" xmlns:w16cid="http://schemas.microsoft.com/office/word/2016/wordml/cid" xmlns:w16="http://schemas.microsoft.com/office/word/2018/wordml" xmlns:w16du="http://schemas.microsoft.com/office/word/2023/wordml/word16du" xmlns:w16sdtdh="http://schemas.microsoft.com/office/word/2020/wordml/sdtdatahash" xmlns:w16sdtfl="http://schemas.microsoft.com/office/word/2024/wordml/sdtformatlock" xmlns:w16se="http://schemas.microsoft.com/office/word/2015/wordml/symex" mc:Ignorable="w14 w15 w16se w16cid w16 w16cex w16sdtdh w16sdtfl w16du">
   <w:docDefaults>
     <w:rPrDefault>
       <w:rPr>
-        <w:rFonts w:asciiTheme="minorHAnsi" w:hAnsiTheme="minorHAnsi" w:eastAsiaTheme="minorEastAsia" w:cstheme="minorBidi"/>
+        <w:rFonts w:asciiTheme="minorHAnsi" w:eastAsiaTheme="minorEastAsia" w:hAnsiTheme="minorHAnsi" w:cstheme="minorBidi"/>
         <w:sz w:val="24"/>
         <w:szCs w:val="24"/>
         <w:lang w:val="en-US" w:eastAsia="ja-JP" w:bidi="ar-SA"/>
@@ -661,17 +655,17 @@
       </w:pPr>
     </w:pPrDefault>
   </w:docDefaults>
-  <w:latentStyles w:defLockedState="0" w:defUIPriority="99" w:defSemiHidden="0" w:defUnhideWhenUsed="0" w:defQFormat="0" w:count="371">
+  <w:latentStyles w:defLockedState="0" w:defUIPriority="99" w:defSemiHidden="0" w:defUnhideWhenUsed="0" w:defQFormat="0" w:count="376">
     <w:lsdException w:name="Normal" w:uiPriority="0" w:qFormat="1"/>
     <w:lsdException w:name="heading 1" w:uiPriority="9" w:qFormat="1"/>
-    <w:lsdException w:name="heading 2" w:uiPriority="9" w:semiHidden="1" w:unhideWhenUsed="1" w:qFormat="1"/>
-    <w:lsdException w:name="heading 3" w:uiPriority="9" w:semiHidden="1" w:unhideWhenUsed="1" w:qFormat="1"/>
-    <w:lsdException w:name="heading 4" w:uiPriority="9" w:semiHidden="1" w:unhideWhenUsed="1" w:qFormat="1"/>
-    <w:lsdException w:name="heading 5" w:uiPriority="9" w:semiHidden="1" w:unhideWhenUsed="1" w:qFormat="1"/>
-    <w:lsdException w:name="heading 6" w:uiPriority="9" w:semiHidden="1" w:unhideWhenUsed="1" w:qFormat="1"/>
-    <w:lsdException w:name="heading 7" w:uiPriority="9" w:semiHidden="1" w:unhideWhenUsed="1" w:qFormat="1"/>
-    <w:lsdException w:name="heading 8" w:uiPriority="9" w:semiHidden="1" w:unhideWhenUsed="1" w:qFormat="1"/>
-    <w:lsdException w:name="heading 9" w:uiPriority="9" w:semiHidden="1" w:unhideWhenUsed="1" w:qFormat="1"/>
+    <w:lsdException w:name="heading 2" w:semiHidden="1" w:uiPriority="9" w:unhideWhenUsed="1" w:qFormat="1"/>
+    <w:lsdException w:name="heading 3" w:semiHidden="1" w:uiPriority="9" w:unhideWhenUsed="1" w:qFormat="1"/>
+    <w:lsdException w:name="heading 4" w:semiHidden="1" w:uiPriority="9" w:unhideWhenUsed="1" w:qFormat="1"/>
+    <w:lsdException w:name="heading 5" w:semiHidden="1" w:uiPriority="9" w:unhideWhenUsed="1" w:qFormat="1"/>
+    <w:lsdException w:name="heading 6" w:semiHidden="1" w:uiPriority="9" w:unhideWhenUsed="1" w:qFormat="1"/>
+    <w:lsdException w:name="heading 7" w:semiHidden="1" w:uiPriority="9" w:unhideWhenUsed="1" w:qFormat="1"/>
+    <w:lsdException w:name="heading 8" w:semiHidden="1" w:uiPriority="9" w:unhideWhenUsed="1" w:qFormat="1"/>
+    <w:lsdException w:name="heading 9" w:semiHidden="1" w:uiPriority="9" w:unhideWhenUsed="1" w:qFormat="1"/>
     <w:lsdException w:name="index 1" w:semiHidden="1" w:unhideWhenUsed="1"/>
     <w:lsdException w:name="index 2" w:semiHidden="1" w:unhideWhenUsed="1"/>
     <w:lsdException w:name="index 3" w:semiHidden="1" w:unhideWhenUsed="1"/>
@@ -681,22 +675,22 @@
     <w:lsdException w:name="index 7" w:semiHidden="1" w:unhideWhenUsed="1"/>
     <w:lsdException w:name="index 8" w:semiHidden="1" w:unhideWhenUsed="1"/>
     <w:lsdException w:name="index 9" w:semiHidden="1" w:unhideWhenUsed="1"/>
-    <w:lsdException w:name="toc 1" w:uiPriority="39" w:semiHidden="1" w:unhideWhenUsed="1"/>
-    <w:lsdException w:name="toc 2" w:uiPriority="39" w:semiHidden="1" w:unhideWhenUsed="1"/>
-    <w:lsdException w:name="toc 3" w:uiPriority="39" w:semiHidden="1" w:unhideWhenUsed="1"/>
-    <w:lsdException w:name="toc 4" w:uiPriority="39" w:semiHidden="1" w:unhideWhenUsed="1"/>
-    <w:lsdException w:name="toc 5" w:uiPriority="39" w:semiHidden="1" w:unhideWhenUsed="1"/>
-    <w:lsdException w:name="toc 6" w:uiPriority="39" w:semiHidden="1" w:unhideWhenUsed="1"/>
-    <w:lsdException w:name="toc 7" w:uiPriority="39" w:semiHidden="1" w:unhideWhenUsed="1"/>
-    <w:lsdException w:name="toc 8" w:uiPriority="39" w:semiHidden="1" w:unhideWhenUsed="1"/>
-    <w:lsdException w:name="toc 9" w:uiPriority="39" w:semiHidden="1" w:unhideWhenUsed="1"/>
+    <w:lsdException w:name="toc 1" w:semiHidden="1" w:uiPriority="39" w:unhideWhenUsed="1"/>
+    <w:lsdException w:name="toc 2" w:semiHidden="1" w:uiPriority="39" w:unhideWhenUsed="1"/>
+    <w:lsdException w:name="toc 3" w:semiHidden="1" w:uiPriority="39" w:unhideWhenUsed="1"/>
+    <w:lsdException w:name="toc 4" w:semiHidden="1" w:uiPriority="39" w:unhideWhenUsed="1"/>
+    <w:lsdException w:name="toc 5" w:semiHidden="1" w:uiPriority="39" w:unhideWhenUsed="1"/>
+    <w:lsdException w:name="toc 6" w:semiHidden="1" w:uiPriority="39" w:unhideWhenUsed="1"/>
+    <w:lsdException w:name="toc 7" w:semiHidden="1" w:uiPriority="39" w:unhideWhenUsed="1"/>
+    <w:lsdException w:name="toc 8" w:semiHidden="1" w:uiPriority="39" w:unhideWhenUsed="1"/>
+    <w:lsdException w:name="toc 9" w:semiHidden="1" w:uiPriority="39" w:unhideWhenUsed="1"/>
     <w:lsdException w:name="Normal Indent" w:semiHidden="1" w:unhideWhenUsed="1"/>
     <w:lsdException w:name="footnote text" w:semiHidden="1" w:unhideWhenUsed="1"/>
     <w:lsdException w:name="annotation text" w:semiHidden="1" w:unhideWhenUsed="1"/>
     <w:lsdException w:name="header" w:semiHidden="1" w:unhideWhenUsed="1"/>
     <w:lsdException w:name="footer" w:semiHidden="1" w:unhideWhenUsed="1"/>
     <w:lsdException w:name="index heading" w:semiHidden="1" w:unhideWhenUsed="1"/>
-    <w:lsdException w:name="caption" w:uiPriority="35" w:semiHidden="1" w:unhideWhenUsed="1" w:qFormat="1"/>
+    <w:lsdException w:name="caption" w:semiHidden="1" w:uiPriority="35" w:unhideWhenUsed="1" w:qFormat="1"/>
     <w:lsdException w:name="table of figures" w:semiHidden="1" w:unhideWhenUsed="1"/>
     <w:lsdException w:name="envelope address" w:semiHidden="1" w:unhideWhenUsed="1"/>
     <w:lsdException w:name="envelope return" w:semiHidden="1" w:unhideWhenUsed="1"/>
@@ -727,7 +721,7 @@
     <w:lsdException w:name="Title" w:uiPriority="10" w:qFormat="1"/>
     <w:lsdException w:name="Closing" w:semiHidden="1" w:unhideWhenUsed="1"/>
     <w:lsdException w:name="Signature" w:semiHidden="1" w:unhideWhenUsed="1"/>
-    <w:lsdException w:name="Default Paragraph Font" w:uiPriority="1" w:semiHidden="1" w:unhideWhenUsed="1"/>
+    <w:lsdException w:name="Default Paragraph Font" w:semiHidden="1" w:uiPriority="1" w:unhideWhenUsed="1"/>
     <w:lsdException w:name="Body Text" w:semiHidden="1" w:unhideWhenUsed="1"/>
     <w:lsdException w:name="Body Text Indent" w:semiHidden="1" w:unhideWhenUsed="1"/>
     <w:lsdException w:name="List Continue" w:semiHidden="1" w:unhideWhenUsed="1"/>
@@ -927,8 +921,8 @@
     <w:lsdException w:name="Subtle Reference" w:uiPriority="31" w:qFormat="1"/>
     <w:lsdException w:name="Intense Reference" w:uiPriority="32" w:qFormat="1"/>
     <w:lsdException w:name="Book Title" w:uiPriority="33" w:qFormat="1"/>
-    <w:lsdException w:name="Bibliography" w:uiPriority="37" w:semiHidden="1" w:unhideWhenUsed="1"/>
-    <w:lsdException w:name="TOC Heading" w:uiPriority="39" w:semiHidden="1" w:unhideWhenUsed="1" w:qFormat="1"/>
+    <w:lsdException w:name="Bibliography" w:semiHidden="1" w:uiPriority="37" w:unhideWhenUsed="1"/>
+    <w:lsdException w:name="TOC Heading" w:semiHidden="1" w:uiPriority="39" w:unhideWhenUsed="1" w:qFormat="1"/>
     <w:lsdException w:name="Plain Table 1" w:uiPriority="41"/>
     <w:lsdException w:name="Plain Table 2" w:uiPriority="42"/>
     <w:lsdException w:name="Plain Table 3" w:uiPriority="43"/>
@@ -1033,18 +1027,23 @@
     <w:lsdException w:name="List Table 5 Dark Accent 6" w:uiPriority="50"/>
     <w:lsdException w:name="List Table 6 Colorful Accent 6" w:uiPriority="51"/>
     <w:lsdException w:name="List Table 7 Colorful Accent 6" w:uiPriority="52"/>
+    <w:lsdException w:name="Mention" w:semiHidden="1" w:unhideWhenUsed="1"/>
+    <w:lsdException w:name="Smart Hyperlink" w:semiHidden="1" w:unhideWhenUsed="1"/>
+    <w:lsdException w:name="Hashtag" w:semiHidden="1" w:unhideWhenUsed="1"/>
+    <w:lsdException w:name="Unresolved Mention" w:semiHidden="1" w:unhideWhenUsed="1"/>
+    <w:lsdException w:name="Smart Link" w:semiHidden="1" w:unhideWhenUsed="1"/>
   </w:latentStyles>
-  <w:style w:type="paragraph" w:styleId="Normal" w:default="1">
+  <w:style w:type="paragraph" w:default="1" w:styleId="Normal">
     <w:name w:val="Normal"/>
     <w:qFormat/>
   </w:style>
-  <w:style w:type="character" w:styleId="DefaultParagraphFont" w:default="1">
+  <w:style w:type="character" w:default="1" w:styleId="DefaultParagraphFont">
     <w:name w:val="Default Paragraph Font"/>
     <w:uiPriority w:val="1"/>
     <w:semiHidden/>
     <w:unhideWhenUsed/>
   </w:style>
-  <w:style w:type="table" w:styleId="TableNormal" w:default="1">
+  <w:style w:type="table" w:default="1" w:styleId="TableNormal">
     <w:name w:val="Normal Table"/>
     <w:uiPriority w:val="99"/>
     <w:semiHidden/>
@@ -1059,43 +1058,36 @@
       </w:tblCellMar>
     </w:tblPr>
   </w:style>
-  <w:style w:type="numbering" w:styleId="NoList" w:default="1">
+  <w:style w:type="numbering" w:default="1" w:styleId="NoList">
     <w:name w:val="No List"/>
     <w:uiPriority w:val="99"/>
     <w:semiHidden/>
     <w:unhideWhenUsed/>
   </w:style>
-  <w:style xmlns:w="http://schemas.openxmlformats.org/wordprocessingml/2006/main" w:type="table" w:styleId="TableGrid">
-    <w:name xmlns:w="http://schemas.openxmlformats.org/wordprocessingml/2006/main" w:val="Table Grid"/>
-    <w:basedOn xmlns:w="http://schemas.openxmlformats.org/wordprocessingml/2006/main" w:val="TableNormal"/>
-    <w:uiPriority xmlns:w="http://schemas.openxmlformats.org/wordprocessingml/2006/main" w:val="59"/>
-    <w:rsid xmlns:w="http://schemas.openxmlformats.org/wordprocessingml/2006/main" w:val="00FB4123"/>
-    <w:pPr xmlns:w="http://schemas.openxmlformats.org/wordprocessingml/2006/main">
+  <w:style w:type="table" w:styleId="TableGrid">
+    <w:name w:val="Table Grid"/>
+    <w:basedOn w:val="TableNormal"/>
+    <w:uiPriority w:val="59"/>
+    <w:rsid w:val="00FB4123"/>
+    <w:pPr>
       <w:spacing w:after="0" w:line="240" w:lineRule="auto"/>
     </w:pPr>
-    <w:tblPr xmlns:w="http://schemas.openxmlformats.org/wordprocessingml/2006/main">
-      <w:tblInd w:w="0" w:type="dxa"/>
+    <w:tblPr>
       <w:tblBorders>
-        <w:top w:val="single" w:color="000000" w:themeColor="text1" w:sz="4" w:space="0"/>
-        <w:left w:val="single" w:color="000000" w:themeColor="text1" w:sz="4" w:space="0"/>
-        <w:bottom w:val="single" w:color="000000" w:themeColor="text1" w:sz="4" w:space="0"/>
-        <w:right w:val="single" w:color="000000" w:themeColor="text1" w:sz="4" w:space="0"/>
-        <w:insideH w:val="single" w:color="000000" w:themeColor="text1" w:sz="4" w:space="0"/>
-        <w:insideV w:val="single" w:color="000000" w:themeColor="text1" w:sz="4" w:space="0"/>
+        <w:top w:val="single" w:sz="4" w:space="0" w:color="000000" w:themeColor="text1"/>
+        <w:left w:val="single" w:sz="4" w:space="0" w:color="000000" w:themeColor="text1"/>
+        <w:bottom w:val="single" w:sz="4" w:space="0" w:color="000000" w:themeColor="text1"/>
+        <w:right w:val="single" w:sz="4" w:space="0" w:color="000000" w:themeColor="text1"/>
+        <w:insideH w:val="single" w:sz="4" w:space="0" w:color="000000" w:themeColor="text1"/>
+        <w:insideV w:val="single" w:sz="4" w:space="0" w:color="000000" w:themeColor="text1"/>
       </w:tblBorders>
-      <w:tblCellMar>
-        <w:top w:w="0" w:type="dxa"/>
-        <w:left w:w="108" w:type="dxa"/>
-        <w:bottom w:w="0" w:type="dxa"/>
-        <w:right w:w="108" w:type="dxa"/>
-      </w:tblCellMar>
     </w:tblPr>
   </w:style>
 </w:styles>
 </file>
 
 <file path=word/theme/theme1.xml><?xml version="1.0" encoding="utf-8"?>
-<a:theme xmlns:thm15="http://schemas.microsoft.com/office/thememl/2012/main" xmlns:a="http://schemas.openxmlformats.org/drawingml/2006/main" name="Office Theme">
+<a:theme xmlns:a="http://schemas.openxmlformats.org/drawingml/2006/main" name="Office Theme">
   <a:themeElements>
     <a:clrScheme name="Office">
       <a:dk1>

</xml_diff>

<commit_message>
modified:   Team Feedback on mapping tool.docx
</commit_message>
<xml_diff>
--- a/Team Feedback on mapping tool.docx
+++ b/Team Feedback on mapping tool.docx
@@ -235,21 +235,7 @@
               <w:rPr>
                 <w:rFonts w:ascii="Calibri" w:eastAsia="Calibri" w:hAnsi="Calibri" w:cs="Calibri"/>
               </w:rPr>
-              <w:t xml:space="preserve">TarraCO2 is marked as other but is </w:t>
-            </w:r>
-            <w:proofErr w:type="gramStart"/>
-            <w:r>
-              <w:rPr>
-                <w:rFonts w:ascii="Calibri" w:eastAsia="Calibri" w:hAnsi="Calibri" w:cs="Calibri"/>
-              </w:rPr>
-              <w:t>actually T&amp;S</w:t>
-            </w:r>
-            <w:proofErr w:type="gramEnd"/>
-            <w:r>
-              <w:rPr>
-                <w:rFonts w:ascii="Calibri" w:eastAsia="Calibri" w:hAnsi="Calibri" w:cs="Calibri"/>
-              </w:rPr>
-              <w:t xml:space="preserve"> infrastructure</w:t>
+              <w:t>TarraCO2 is marked as other but is actually T&amp;S infrastructure</w:t>
             </w:r>
           </w:p>
         </w:tc>
@@ -332,21 +318,11 @@
                 <w:rFonts w:ascii="Calibri" w:eastAsia="Calibri" w:hAnsi="Calibri" w:cs="Calibri"/>
               </w:rPr>
             </w:pPr>
-            <w:proofErr w:type="spellStart"/>
-            <w:proofErr w:type="gramStart"/>
-            <w:r>
-              <w:rPr>
-                <w:rFonts w:ascii="Calibri" w:eastAsia="Calibri" w:hAnsi="Calibri" w:cs="Calibri"/>
-              </w:rPr>
-              <w:t>Category:CCS</w:t>
-            </w:r>
-            <w:proofErr w:type="spellEnd"/>
-            <w:proofErr w:type="gramEnd"/>
-            <w:r>
-              <w:rPr>
-                <w:rFonts w:ascii="Calibri" w:eastAsia="Calibri" w:hAnsi="Calibri" w:cs="Calibri"/>
-              </w:rPr>
-              <w:t xml:space="preserve"> T&amp;S</w:t>
+            <w:r>
+              <w:rPr>
+                <w:rFonts w:ascii="Calibri" w:eastAsia="Calibri" w:hAnsi="Calibri" w:cs="Calibri"/>
+              </w:rPr>
+              <w:t>Category:CCS T&amp;S</w:t>
             </w:r>
           </w:p>
         </w:tc>

</xml_diff>

<commit_message>
modified:   Team Feedback on mapping tool.docx 	modified:   excel_data/Innovation_Fund_Projects_data - 290326.xlsx 	new file:   public/Logotype_VerticalBaseline_FullWhite.png 	new file:   public/ZEP_White.png 	new file:   public/data/meta.json 	modified:   public/data/projects.json 	modified:   scripts/excel_to_json.py 	modified:   src/components/Legend.jsx 	modified:   src/components/ProjectSidebar.jsx 	modified:   src/components/StatsBar.jsx 	modified:   src/components/StatsBar.module.css
</commit_message>
<xml_diff>
--- a/Team Feedback on mapping tool.docx
+++ b/Team Feedback on mapping tool.docx
@@ -4,10 +4,24 @@
   <w:body>
     <w:p>
       <w:pPr>
+        <w:pStyle w:val="Heading1"/>
+      </w:pPr>
+      <w:r>
+        <w:t xml:space="preserve">Feedback </w:t>
+      </w:r>
+      <w:r>
+        <w:t>on IF Mapping tool</w:t>
+      </w:r>
+    </w:p>
+    <w:p>
+      <w:pPr>
         <w:rPr>
           <w:rFonts w:hint="eastAsia"/>
         </w:rPr>
       </w:pPr>
+      <w:r>
+        <w:t>Please give your feedback below:</w:t>
+      </w:r>
     </w:p>
     <w:tbl>
       <w:tblPr>
@@ -16,8 +30,8 @@
         <w:tblLook w:val="06A0" w:firstRow="1" w:lastRow="0" w:firstColumn="1" w:lastColumn="0" w:noHBand="1" w:noVBand="1"/>
       </w:tblPr>
       <w:tblGrid>
-        <w:gridCol w:w="3115"/>
-        <w:gridCol w:w="3115"/>
+        <w:gridCol w:w="2065"/>
+        <w:gridCol w:w="4165"/>
         <w:gridCol w:w="3120"/>
       </w:tblGrid>
       <w:tr>
@@ -26,20 +40,18 @@
         </w:trPr>
         <w:tc>
           <w:tcPr>
-            <w:tcW w:w="3120" w:type="dxa"/>
-          </w:tcPr>
-          <w:p>
-            <w:pPr>
-              <w:jc w:val="center"/>
-              <w:rPr>
-                <w:rFonts w:ascii="Calibri" w:eastAsia="Calibri" w:hAnsi="Calibri" w:cs="Calibri"/>
+            <w:tcW w:w="2065" w:type="dxa"/>
+          </w:tcPr>
+          <w:p>
+            <w:pPr>
+              <w:spacing w:after="120"/>
+              <w:rPr>
                 <w:b/>
                 <w:bCs/>
               </w:rPr>
             </w:pPr>
             <w:r>
               <w:rPr>
-                <w:rFonts w:ascii="Calibri" w:eastAsia="Calibri" w:hAnsi="Calibri" w:cs="Calibri"/>
                 <w:b/>
                 <w:bCs/>
               </w:rPr>
@@ -49,20 +61,18 @@
         </w:tc>
         <w:tc>
           <w:tcPr>
-            <w:tcW w:w="3120" w:type="dxa"/>
-          </w:tcPr>
-          <w:p>
-            <w:pPr>
-              <w:jc w:val="center"/>
-              <w:rPr>
-                <w:rFonts w:ascii="Calibri" w:eastAsia="Calibri" w:hAnsi="Calibri" w:cs="Calibri"/>
+            <w:tcW w:w="4165" w:type="dxa"/>
+          </w:tcPr>
+          <w:p>
+            <w:pPr>
+              <w:spacing w:after="120"/>
+              <w:rPr>
                 <w:b/>
                 <w:bCs/>
               </w:rPr>
             </w:pPr>
             <w:r>
               <w:rPr>
-                <w:rFonts w:ascii="Calibri" w:eastAsia="Calibri" w:hAnsi="Calibri" w:cs="Calibri"/>
                 <w:b/>
                 <w:bCs/>
               </w:rPr>
@@ -76,16 +86,14 @@
           </w:tcPr>
           <w:p>
             <w:pPr>
-              <w:jc w:val="center"/>
-              <w:rPr>
-                <w:rFonts w:ascii="Calibri" w:eastAsia="Calibri" w:hAnsi="Calibri" w:cs="Calibri"/>
+              <w:spacing w:after="120"/>
+              <w:rPr>
                 <w:b/>
                 <w:bCs/>
               </w:rPr>
             </w:pPr>
             <w:r>
               <w:rPr>
-                <w:rFonts w:ascii="Calibri" w:eastAsia="Calibri" w:hAnsi="Calibri" w:cs="Calibri"/>
                 <w:b/>
                 <w:bCs/>
               </w:rPr>
@@ -100,46 +108,37 @@
         </w:trPr>
         <w:tc>
           <w:tcPr>
+            <w:tcW w:w="2065" w:type="dxa"/>
+          </w:tcPr>
+          <w:p>
+            <w:pPr>
+              <w:spacing w:after="120"/>
+            </w:pPr>
+            <w:r>
+              <w:t>Marker size</w:t>
+            </w:r>
+          </w:p>
+        </w:tc>
+        <w:tc>
+          <w:tcPr>
+            <w:tcW w:w="4165" w:type="dxa"/>
+          </w:tcPr>
+          <w:p>
+            <w:pPr>
+              <w:spacing w:after="120"/>
+            </w:pPr>
+            <w:r>
+              <w:t>Do we have a clear definition of what is small or large? Maybe we need more categories? It’s hard because some large projects are funded with a small amount or only an initial phase of a potentially large project. It might be best to make this based on funding amount?</w:t>
+            </w:r>
+          </w:p>
+        </w:tc>
+        <w:tc>
+          <w:tcPr>
             <w:tcW w:w="3120" w:type="dxa"/>
           </w:tcPr>
           <w:p>
             <w:pPr>
-              <w:rPr>
-                <w:rFonts w:ascii="Calibri" w:eastAsia="Calibri" w:hAnsi="Calibri" w:cs="Calibri"/>
-              </w:rPr>
-            </w:pPr>
-            <w:r>
-              <w:rPr>
-                <w:rFonts w:ascii="Calibri" w:eastAsia="Calibri" w:hAnsi="Calibri" w:cs="Calibri"/>
-              </w:rPr>
-              <w:t>Marker size</w:t>
-            </w:r>
-          </w:p>
-        </w:tc>
-        <w:tc>
-          <w:tcPr>
-            <w:tcW w:w="3120" w:type="dxa"/>
-          </w:tcPr>
-          <w:p>
-            <w:pPr>
-              <w:rPr>
-                <w:rFonts w:ascii="Calibri" w:eastAsia="Calibri" w:hAnsi="Calibri" w:cs="Calibri"/>
-              </w:rPr>
-            </w:pPr>
-            <w:r>
-              <w:rPr>
-                <w:rFonts w:ascii="Calibri" w:eastAsia="Calibri" w:hAnsi="Calibri" w:cs="Calibri"/>
-              </w:rPr>
-              <w:t>Do we have a clear definition of what is small or large? Maybe we need more categories? It’s hard because some large projects are funded with a small amount or only an initial phase of a potentially large project. It might be best to make this based on funding amount?</w:t>
-            </w:r>
-          </w:p>
-        </w:tc>
-        <w:tc>
-          <w:tcPr>
-            <w:tcW w:w="3120" w:type="dxa"/>
-          </w:tcPr>
-          <w:p>
-            <w:pPr>
+              <w:spacing w:after="120"/>
               <w:rPr>
                 <w:rFonts w:hint="eastAsia"/>
               </w:rPr>
@@ -155,7 +154,7 @@
                   <wp:docPr id="523767694" name="drawing">
                     <a:extLst xmlns:a="http://schemas.openxmlformats.org/drawingml/2006/main">
                       <a:ext uri="{FF2B5EF4-FFF2-40B4-BE49-F238E27FC236}">
-                        <a16:creationId xmlns:a16="http://schemas.microsoft.com/office/drawing/2014/main" id="{F48F8486-759F-41F6-B441-53D44C2ABEA5}"/>
+                        <a16:creationId xmlns:a16="http://schemas.microsoft.com/office/drawing/2014/main" id="{084D1A03-3D36-43C0-BCC1-D1F83F2C1367}"/>
                       </a:ext>
                     </a:extLst>
                   </wp:docPr>
@@ -170,7 +169,7 @@
                           <pic:cNvPicPr/>
                         </pic:nvPicPr>
                         <pic:blipFill>
-                          <a:blip r:embed="rId4">
+                          <a:blip r:embed="rId5">
                             <a:extLst>
                               <a:ext uri="{28A0092B-C50C-407E-A947-70E740481C1C}">
                                 <a14:useLocalDpi xmlns:a14="http://schemas.microsoft.com/office/drawing/2010/main"/>
@@ -205,46 +204,45 @@
         </w:trPr>
         <w:tc>
           <w:tcPr>
+            <w:tcW w:w="2065" w:type="dxa"/>
+          </w:tcPr>
+          <w:p>
+            <w:pPr>
+              <w:spacing w:after="120"/>
+            </w:pPr>
+            <w:r>
+              <w:t>Sector: TarraCO2</w:t>
+            </w:r>
+          </w:p>
+        </w:tc>
+        <w:tc>
+          <w:tcPr>
+            <w:tcW w:w="4165" w:type="dxa"/>
+          </w:tcPr>
+          <w:p>
+            <w:pPr>
+              <w:spacing w:after="120"/>
+            </w:pPr>
+            <w:r>
+              <w:t xml:space="preserve">TarraCO2 is marked as other but is </w:t>
+            </w:r>
+            <w:proofErr w:type="gramStart"/>
+            <w:r>
+              <w:t>actually T&amp;S</w:t>
+            </w:r>
+            <w:proofErr w:type="gramEnd"/>
+            <w:r>
+              <w:t xml:space="preserve"> infrastructure</w:t>
+            </w:r>
+          </w:p>
+        </w:tc>
+        <w:tc>
+          <w:tcPr>
             <w:tcW w:w="3120" w:type="dxa"/>
           </w:tcPr>
           <w:p>
             <w:pPr>
-              <w:rPr>
-                <w:rFonts w:ascii="Calibri" w:eastAsia="Calibri" w:hAnsi="Calibri" w:cs="Calibri"/>
-              </w:rPr>
-            </w:pPr>
-            <w:r>
-              <w:rPr>
-                <w:rFonts w:ascii="Calibri" w:eastAsia="Calibri" w:hAnsi="Calibri" w:cs="Calibri"/>
-              </w:rPr>
-              <w:t>Sector: TarraCO2</w:t>
-            </w:r>
-          </w:p>
-        </w:tc>
-        <w:tc>
-          <w:tcPr>
-            <w:tcW w:w="3120" w:type="dxa"/>
-          </w:tcPr>
-          <w:p>
-            <w:pPr>
-              <w:rPr>
-                <w:rFonts w:ascii="Calibri" w:eastAsia="Calibri" w:hAnsi="Calibri" w:cs="Calibri"/>
-              </w:rPr>
-            </w:pPr>
-            <w:r>
-              <w:rPr>
-                <w:rFonts w:ascii="Calibri" w:eastAsia="Calibri" w:hAnsi="Calibri" w:cs="Calibri"/>
-              </w:rPr>
-              <w:t>TarraCO2 is marked as other but is actually T&amp;S infrastructure</w:t>
-            </w:r>
-          </w:p>
-        </w:tc>
-        <w:tc>
-          <w:tcPr>
-            <w:tcW w:w="3120" w:type="dxa"/>
-          </w:tcPr>
-          <w:p>
-            <w:pPr>
+              <w:spacing w:after="120"/>
               <w:rPr>
                 <w:rFonts w:hint="eastAsia"/>
               </w:rPr>
@@ -260,7 +258,7 @@
                   <wp:docPr id="916434590" name="drawing">
                     <a:extLst xmlns:a="http://schemas.openxmlformats.org/drawingml/2006/main">
                       <a:ext uri="{FF2B5EF4-FFF2-40B4-BE49-F238E27FC236}">
-                        <a16:creationId xmlns:a16="http://schemas.microsoft.com/office/drawing/2014/main" id="{58080E74-029E-43F4-8CBA-C3ACA00B8FB6}"/>
+                        <a16:creationId xmlns:a16="http://schemas.microsoft.com/office/drawing/2014/main" id="{598CBD4B-F289-49FC-80D1-0F64758714E0}"/>
                       </a:ext>
                     </a:extLst>
                   </wp:docPr>
@@ -275,7 +273,7 @@
                           <pic:cNvPicPr/>
                         </pic:nvPicPr>
                         <pic:blipFill>
-                          <a:blip r:embed="rId5">
+                          <a:blip r:embed="rId6">
                             <a:extLst>
                               <a:ext uri="{28A0092B-C50C-407E-A947-70E740481C1C}">
                                 <a14:useLocalDpi xmlns:a14="http://schemas.microsoft.com/office/drawing/2010/main"/>
@@ -310,46 +308,44 @@
         </w:trPr>
         <w:tc>
           <w:tcPr>
+            <w:tcW w:w="2065" w:type="dxa"/>
+          </w:tcPr>
+          <w:p>
+            <w:pPr>
+              <w:spacing w:after="120"/>
+            </w:pPr>
+            <w:proofErr w:type="spellStart"/>
+            <w:proofErr w:type="gramStart"/>
+            <w:r>
+              <w:t>Category:CCS</w:t>
+            </w:r>
+            <w:proofErr w:type="spellEnd"/>
+            <w:proofErr w:type="gramEnd"/>
+            <w:r>
+              <w:t xml:space="preserve"> T&amp;S</w:t>
+            </w:r>
+          </w:p>
+        </w:tc>
+        <w:tc>
+          <w:tcPr>
+            <w:tcW w:w="4165" w:type="dxa"/>
+          </w:tcPr>
+          <w:p>
+            <w:pPr>
+              <w:spacing w:after="120"/>
+            </w:pPr>
+            <w:r>
+              <w:t>Can we rename this CO2 T&amp;S?</w:t>
+            </w:r>
+          </w:p>
+        </w:tc>
+        <w:tc>
+          <w:tcPr>
             <w:tcW w:w="3120" w:type="dxa"/>
           </w:tcPr>
           <w:p>
             <w:pPr>
-              <w:rPr>
-                <w:rFonts w:ascii="Calibri" w:eastAsia="Calibri" w:hAnsi="Calibri" w:cs="Calibri"/>
-              </w:rPr>
-            </w:pPr>
-            <w:r>
-              <w:rPr>
-                <w:rFonts w:ascii="Calibri" w:eastAsia="Calibri" w:hAnsi="Calibri" w:cs="Calibri"/>
-              </w:rPr>
-              <w:t>Category:CCS T&amp;S</w:t>
-            </w:r>
-          </w:p>
-        </w:tc>
-        <w:tc>
-          <w:tcPr>
-            <w:tcW w:w="3120" w:type="dxa"/>
-          </w:tcPr>
-          <w:p>
-            <w:pPr>
-              <w:rPr>
-                <w:rFonts w:ascii="Calibri" w:eastAsia="Calibri" w:hAnsi="Calibri" w:cs="Calibri"/>
-              </w:rPr>
-            </w:pPr>
-            <w:r>
-              <w:rPr>
-                <w:rFonts w:ascii="Calibri" w:eastAsia="Calibri" w:hAnsi="Calibri" w:cs="Calibri"/>
-              </w:rPr>
-              <w:t>Can we rename this CO2 T&amp;S?</w:t>
-            </w:r>
-          </w:p>
-        </w:tc>
-        <w:tc>
-          <w:tcPr>
-            <w:tcW w:w="3120" w:type="dxa"/>
-          </w:tcPr>
-          <w:p>
-            <w:pPr>
+              <w:spacing w:after="120"/>
               <w:rPr>
                 <w:rFonts w:hint="eastAsia"/>
               </w:rPr>
@@ -365,7 +361,7 @@
                   <wp:docPr id="66426576" name="drawing">
                     <a:extLst xmlns:a="http://schemas.openxmlformats.org/drawingml/2006/main">
                       <a:ext uri="{FF2B5EF4-FFF2-40B4-BE49-F238E27FC236}">
-                        <a16:creationId xmlns:a16="http://schemas.microsoft.com/office/drawing/2014/main" id="{77AF37B6-D196-4D0C-AA0C-D0C680BD0566}"/>
+                        <a16:creationId xmlns:a16="http://schemas.microsoft.com/office/drawing/2014/main" id="{39A518B0-F8BB-4120-A664-7CB37A4805A8}"/>
                       </a:ext>
                     </a:extLst>
                   </wp:docPr>
@@ -380,7 +376,7 @@
                           <pic:cNvPicPr/>
                         </pic:nvPicPr>
                         <pic:blipFill>
-                          <a:blip r:embed="rId6">
+                          <a:blip r:embed="rId7">
                             <a:extLst>
                               <a:ext uri="{28A0092B-C50C-407E-A947-70E740481C1C}">
                                 <a14:useLocalDpi xmlns:a14="http://schemas.microsoft.com/office/drawing/2010/main"/>
@@ -415,46 +411,37 @@
         </w:trPr>
         <w:tc>
           <w:tcPr>
+            <w:tcW w:w="2065" w:type="dxa"/>
+          </w:tcPr>
+          <w:p>
+            <w:pPr>
+              <w:spacing w:after="120"/>
+            </w:pPr>
+            <w:r>
+              <w:t>Category: GO4ECOPLANET</w:t>
+            </w:r>
+          </w:p>
+        </w:tc>
+        <w:tc>
+          <w:tcPr>
+            <w:tcW w:w="4165" w:type="dxa"/>
+          </w:tcPr>
+          <w:p>
+            <w:pPr>
+              <w:spacing w:after="120"/>
+            </w:pPr>
+            <w:r>
+              <w:t>Marked as cement &amp; lime but it’s just cement</w:t>
+            </w:r>
+          </w:p>
+        </w:tc>
+        <w:tc>
+          <w:tcPr>
             <w:tcW w:w="3120" w:type="dxa"/>
           </w:tcPr>
           <w:p>
             <w:pPr>
-              <w:rPr>
-                <w:rFonts w:ascii="Calibri" w:eastAsia="Calibri" w:hAnsi="Calibri" w:cs="Calibri"/>
-              </w:rPr>
-            </w:pPr>
-            <w:r>
-              <w:rPr>
-                <w:rFonts w:ascii="Calibri" w:eastAsia="Calibri" w:hAnsi="Calibri" w:cs="Calibri"/>
-              </w:rPr>
-              <w:t>Category: GO4ECOPLANET</w:t>
-            </w:r>
-          </w:p>
-        </w:tc>
-        <w:tc>
-          <w:tcPr>
-            <w:tcW w:w="3120" w:type="dxa"/>
-          </w:tcPr>
-          <w:p>
-            <w:pPr>
-              <w:rPr>
-                <w:rFonts w:ascii="Calibri" w:eastAsia="Calibri" w:hAnsi="Calibri" w:cs="Calibri"/>
-              </w:rPr>
-            </w:pPr>
-            <w:r>
-              <w:rPr>
-                <w:rFonts w:ascii="Calibri" w:eastAsia="Calibri" w:hAnsi="Calibri" w:cs="Calibri"/>
-              </w:rPr>
-              <w:t>Marked as cement &amp; lime but it’s just cement</w:t>
-            </w:r>
-          </w:p>
-        </w:tc>
-        <w:tc>
-          <w:tcPr>
-            <w:tcW w:w="3120" w:type="dxa"/>
-          </w:tcPr>
-          <w:p>
-            <w:pPr>
+              <w:spacing w:after="120"/>
               <w:rPr>
                 <w:rFonts w:hint="eastAsia"/>
               </w:rPr>
@@ -470,7 +457,7 @@
                   <wp:docPr id="236849351" name="drawing">
                     <a:extLst xmlns:a="http://schemas.openxmlformats.org/drawingml/2006/main">
                       <a:ext uri="{FF2B5EF4-FFF2-40B4-BE49-F238E27FC236}">
-                        <a16:creationId xmlns:a16="http://schemas.microsoft.com/office/drawing/2014/main" id="{0A50EDB1-8598-4511-8FDA-0AB05E742F35}"/>
+                        <a16:creationId xmlns:a16="http://schemas.microsoft.com/office/drawing/2014/main" id="{9ACB89CF-AB1A-4920-9F93-9679BD43393C}"/>
                       </a:ext>
                     </a:extLst>
                   </wp:docPr>
@@ -485,7 +472,7 @@
                           <pic:cNvPicPr/>
                         </pic:nvPicPr>
                         <pic:blipFill>
-                          <a:blip r:embed="rId7">
+                          <a:blip r:embed="rId8">
                             <a:extLst>
                               <a:ext uri="{28A0092B-C50C-407E-A947-70E740481C1C}">
                                 <a14:useLocalDpi xmlns:a14="http://schemas.microsoft.com/office/drawing/2010/main"/>
@@ -520,34 +507,31 @@
         </w:trPr>
         <w:tc>
           <w:tcPr>
+            <w:tcW w:w="2065" w:type="dxa"/>
+          </w:tcPr>
+          <w:p>
+            <w:pPr>
+              <w:spacing w:after="120"/>
+            </w:pPr>
+          </w:p>
+        </w:tc>
+        <w:tc>
+          <w:tcPr>
+            <w:tcW w:w="4165" w:type="dxa"/>
+          </w:tcPr>
+          <w:p>
+            <w:pPr>
+              <w:spacing w:after="120"/>
+            </w:pPr>
+          </w:p>
+        </w:tc>
+        <w:tc>
+          <w:tcPr>
             <w:tcW w:w="3120" w:type="dxa"/>
           </w:tcPr>
           <w:p>
             <w:pPr>
-              <w:rPr>
-                <w:rFonts w:ascii="Calibri" w:eastAsia="Calibri" w:hAnsi="Calibri" w:cs="Calibri"/>
-              </w:rPr>
-            </w:pPr>
-          </w:p>
-        </w:tc>
-        <w:tc>
-          <w:tcPr>
-            <w:tcW w:w="3120" w:type="dxa"/>
-          </w:tcPr>
-          <w:p>
-            <w:pPr>
-              <w:rPr>
-                <w:rFonts w:ascii="Calibri" w:eastAsia="Calibri" w:hAnsi="Calibri" w:cs="Calibri"/>
-              </w:rPr>
-            </w:pPr>
-          </w:p>
-        </w:tc>
-        <w:tc>
-          <w:tcPr>
-            <w:tcW w:w="3120" w:type="dxa"/>
-          </w:tcPr>
-          <w:p>
-            <w:pPr>
+              <w:spacing w:after="120"/>
               <w:rPr>
                 <w:rFonts w:hint="eastAsia"/>
               </w:rPr>
@@ -561,34 +545,31 @@
         </w:trPr>
         <w:tc>
           <w:tcPr>
+            <w:tcW w:w="2065" w:type="dxa"/>
+          </w:tcPr>
+          <w:p>
+            <w:pPr>
+              <w:spacing w:after="120"/>
+            </w:pPr>
+          </w:p>
+        </w:tc>
+        <w:tc>
+          <w:tcPr>
+            <w:tcW w:w="4165" w:type="dxa"/>
+          </w:tcPr>
+          <w:p>
+            <w:pPr>
+              <w:spacing w:after="120"/>
+            </w:pPr>
+          </w:p>
+        </w:tc>
+        <w:tc>
+          <w:tcPr>
             <w:tcW w:w="3120" w:type="dxa"/>
           </w:tcPr>
           <w:p>
             <w:pPr>
-              <w:rPr>
-                <w:rFonts w:ascii="Calibri" w:eastAsia="Calibri" w:hAnsi="Calibri" w:cs="Calibri"/>
-              </w:rPr>
-            </w:pPr>
-          </w:p>
-        </w:tc>
-        <w:tc>
-          <w:tcPr>
-            <w:tcW w:w="3120" w:type="dxa"/>
-          </w:tcPr>
-          <w:p>
-            <w:pPr>
-              <w:rPr>
-                <w:rFonts w:ascii="Calibri" w:eastAsia="Calibri" w:hAnsi="Calibri" w:cs="Calibri"/>
-              </w:rPr>
-            </w:pPr>
-          </w:p>
-        </w:tc>
-        <w:tc>
-          <w:tcPr>
-            <w:tcW w:w="3120" w:type="dxa"/>
-          </w:tcPr>
-          <w:p>
-            <w:pPr>
+              <w:spacing w:after="120"/>
               <w:rPr>
                 <w:rFonts w:hint="eastAsia"/>
               </w:rPr>
@@ -612,6 +593,10 @@
     </w:sectPr>
   </w:body>
 </w:document>
+</file>
+
+<file path=word/numbering.xml><?xml version="1.0" encoding="utf-8"?>
+<w:numbering xmlns:wpc="http://schemas.microsoft.com/office/word/2010/wordprocessingCanvas" xmlns:cx="http://schemas.microsoft.com/office/drawing/2014/chartex" xmlns:cx1="http://schemas.microsoft.com/office/drawing/2015/9/8/chartex" xmlns:cx2="http://schemas.microsoft.com/office/drawing/2015/10/21/chartex" xmlns:cx3="http://schemas.microsoft.com/office/drawing/2016/5/9/chartex" xmlns:cx4="http://schemas.microsoft.com/office/drawing/2016/5/10/chartex" xmlns:cx5="http://schemas.microsoft.com/office/drawing/2016/5/11/chartex" xmlns:cx6="http://schemas.microsoft.com/office/drawing/2016/5/12/chartex" xmlns:cx7="http://schemas.microsoft.com/office/drawing/2016/5/13/chartex" xmlns:cx8="http://schemas.microsoft.com/office/drawing/2016/5/14/chartex" xmlns:mc="http://schemas.openxmlformats.org/markup-compatibility/2006" xmlns:aink="http://schemas.microsoft.com/office/drawing/2016/ink" xmlns:am3d="http://schemas.microsoft.com/office/drawing/2017/model3d" xmlns:o="urn:schemas-microsoft-com:office:office" xmlns:oel="http://schemas.microsoft.com/office/2019/extlst" xmlns:r="http://schemas.openxmlformats.org/officeDocument/2006/relationships" xmlns:m="http://schemas.openxmlformats.org/officeDocument/2006/math" xmlns:v="urn:schemas-microsoft-com:vml" xmlns:wp14="http://schemas.microsoft.com/office/word/2010/wordprocessingDrawing" xmlns:wp="http://schemas.openxmlformats.org/drawingml/2006/wordprocessingDrawing" xmlns:w10="urn:schemas-microsoft-com:office:word" xmlns:w="http://schemas.openxmlformats.org/wordprocessingml/2006/main" xmlns:w14="http://schemas.microsoft.com/office/word/2010/wordml" xmlns:w15="http://schemas.microsoft.com/office/word/2012/wordml" xmlns:w16cex="http://schemas.microsoft.com/office/word/2018/wordml/cex" xmlns:w16cid="http://schemas.microsoft.com/office/word/2016/wordml/cid" xmlns:w16="http://schemas.microsoft.com/office/word/2018/wordml" xmlns:w16du="http://schemas.microsoft.com/office/word/2023/wordml/word16du" xmlns:w16sdtdh="http://schemas.microsoft.com/office/word/2020/wordml/sdtdatahash" xmlns:w16sdtfl="http://schemas.microsoft.com/office/word/2024/wordml/sdtformatlock" xmlns:w16se="http://schemas.microsoft.com/office/word/2015/wordml/symex" xmlns:wpg="http://schemas.microsoft.com/office/word/2010/wordprocessingGroup" xmlns:wpi="http://schemas.microsoft.com/office/word/2010/wordprocessingInk" xmlns:wne="http://schemas.microsoft.com/office/word/2006/wordml" xmlns:wps="http://schemas.microsoft.com/office/word/2010/wordprocessingShape" mc:Ignorable="w14 w15 w16se w16cid w16 w16cex w16sdtdh w16sdtfl w16du wp14"/>
 </file>
 
 <file path=word/styles.xml><?xml version="1.0" encoding="utf-8"?>
@@ -1013,6 +998,27 @@
     <w:name w:val="Normal"/>
     <w:qFormat/>
   </w:style>
+  <w:style w:type="paragraph" w:styleId="Heading1">
+    <w:name w:val="heading 1"/>
+    <w:basedOn w:val="Normal"/>
+    <w:next w:val="Normal"/>
+    <w:link w:val="Heading1Char"/>
+    <w:uiPriority w:val="9"/>
+    <w:qFormat/>
+    <w:rsid w:val="00D105AF"/>
+    <w:pPr>
+      <w:keepNext/>
+      <w:keepLines/>
+      <w:spacing w:before="240" w:after="0"/>
+      <w:outlineLvl w:val="0"/>
+    </w:pPr>
+    <w:rPr>
+      <w:rFonts w:asciiTheme="majorHAnsi" w:eastAsiaTheme="majorEastAsia" w:hAnsiTheme="majorHAnsi" w:cstheme="majorBidi"/>
+      <w:color w:val="0F4761" w:themeColor="accent1" w:themeShade="BF"/>
+      <w:sz w:val="32"/>
+      <w:szCs w:val="32"/>
+    </w:rPr>
+  </w:style>
   <w:style w:type="character" w:default="1" w:styleId="DefaultParagraphFont">
     <w:name w:val="Default Paragraph Font"/>
     <w:uiPriority w:val="1"/>
@@ -1058,6 +1064,19 @@
         <w:insideV w:val="single" w:sz="4" w:space="0" w:color="000000" w:themeColor="text1"/>
       </w:tblBorders>
     </w:tblPr>
+  </w:style>
+  <w:style w:type="character" w:customStyle="1" w:styleId="Heading1Char">
+    <w:name w:val="Heading 1 Char"/>
+    <w:basedOn w:val="DefaultParagraphFont"/>
+    <w:link w:val="Heading1"/>
+    <w:uiPriority w:val="9"/>
+    <w:rsid w:val="00D105AF"/>
+    <w:rPr>
+      <w:rFonts w:asciiTheme="majorHAnsi" w:eastAsiaTheme="majorEastAsia" w:hAnsiTheme="majorHAnsi" w:cstheme="majorBidi"/>
+      <w:color w:val="0F4761" w:themeColor="accent1" w:themeShade="BF"/>
+      <w:sz w:val="32"/>
+      <w:szCs w:val="32"/>
+    </w:rPr>
   </w:style>
 </w:styles>
 </file>

</xml_diff>

<commit_message>
modified:   Team Feedback on mapping tool.docx 	modified:   excel_data/Innovation_Fund_Projects_data - 290326.xlsx 	modified:   public/data/meta.json 	modified:   public/data/projects.json 	modified:   src/components/MapView.jsx 	modified:   src/components/ProjectSidebar.jsx 	modified:   src/components/StatsBar.jsx 	modified:   src/constants.js
</commit_message>
<xml_diff>
--- a/Team Feedback on mapping tool.docx
+++ b/Team Feedback on mapping tool.docx
@@ -1,6 +1,6 @@
 
 <file path=word/document.xml><?xml version="1.0" encoding="utf-8"?>
-<w:document xmlns:wpc="http://schemas.microsoft.com/office/word/2010/wordprocessingCanvas" xmlns:cx="http://schemas.microsoft.com/office/drawing/2014/chartex" xmlns:cx1="http://schemas.microsoft.com/office/drawing/2015/9/8/chartex" xmlns:cx2="http://schemas.microsoft.com/office/drawing/2015/10/21/chartex" xmlns:cx3="http://schemas.microsoft.com/office/drawing/2016/5/9/chartex" xmlns:cx4="http://schemas.microsoft.com/office/drawing/2016/5/10/chartex" xmlns:cx5="http://schemas.microsoft.com/office/drawing/2016/5/11/chartex" xmlns:cx6="http://schemas.microsoft.com/office/drawing/2016/5/12/chartex" xmlns:cx7="http://schemas.microsoft.com/office/drawing/2016/5/13/chartex" xmlns:cx8="http://schemas.microsoft.com/office/drawing/2016/5/14/chartex" xmlns:mc="http://schemas.openxmlformats.org/markup-compatibility/2006" xmlns:aink="http://schemas.microsoft.com/office/drawing/2016/ink" xmlns:am3d="http://schemas.microsoft.com/office/drawing/2017/model3d" xmlns:o="urn:schemas-microsoft-com:office:office" xmlns:oel="http://schemas.microsoft.com/office/2019/extlst" xmlns:r="http://schemas.openxmlformats.org/officeDocument/2006/relationships" xmlns:m="http://schemas.openxmlformats.org/officeDocument/2006/math" xmlns:v="urn:schemas-microsoft-com:vml" xmlns:wp14="http://schemas.microsoft.com/office/word/2010/wordprocessingDrawing" xmlns:wp="http://schemas.openxmlformats.org/drawingml/2006/wordprocessingDrawing" xmlns:w10="urn:schemas-microsoft-com:office:word" xmlns:w="http://schemas.openxmlformats.org/wordprocessingml/2006/main" xmlns:w14="http://schemas.microsoft.com/office/word/2010/wordml" xmlns:w15="http://schemas.microsoft.com/office/word/2012/wordml" xmlns:w16cex="http://schemas.microsoft.com/office/word/2018/wordml/cex" xmlns:w16cid="http://schemas.microsoft.com/office/word/2016/wordml/cid" xmlns:w16="http://schemas.microsoft.com/office/word/2018/wordml" xmlns:w16du="http://schemas.microsoft.com/office/word/2023/wordml/word16du" xmlns:w16sdtdh="http://schemas.microsoft.com/office/word/2020/wordml/sdtdatahash" xmlns:w16sdtfl="http://schemas.microsoft.com/office/word/2024/wordml/sdtformatlock" xmlns:w16se="http://schemas.microsoft.com/office/word/2015/wordml/symex" xmlns:wpg="http://schemas.microsoft.com/office/word/2010/wordprocessingGroup" xmlns:wpi="http://schemas.microsoft.com/office/word/2010/wordprocessingInk" xmlns:wne="http://schemas.microsoft.com/office/word/2006/wordml" xmlns:wps="http://schemas.microsoft.com/office/word/2010/wordprocessingShape" mc:Ignorable="w14 w15 w16se w16cid w16 w16cex w16sdtdh w16sdtfl w16du wp14">
+<w:document xmlns:wpc="http://schemas.microsoft.com/office/word/2010/wordprocessingCanvas" xmlns:cx="http://schemas.microsoft.com/office/drawing/2014/chartex" xmlns:cx1="http://schemas.microsoft.com/office/drawing/2015/9/8/chartex" xmlns:cx2="http://schemas.microsoft.com/office/drawing/2015/10/21/chartex" xmlns:cx3="http://schemas.microsoft.com/office/drawing/2016/5/9/chartex" xmlns:cx4="http://schemas.microsoft.com/office/drawing/2016/5/10/chartex" xmlns:cx5="http://schemas.microsoft.com/office/drawing/2016/5/11/chartex" xmlns:cx6="http://schemas.microsoft.com/office/drawing/2016/5/12/chartex" xmlns:cx7="http://schemas.microsoft.com/office/drawing/2016/5/13/chartex" xmlns:cx8="http://schemas.microsoft.com/office/drawing/2016/5/14/chartex" xmlns:mc="http://schemas.openxmlformats.org/markup-compatibility/2006" xmlns:aink="http://schemas.microsoft.com/office/drawing/2016/ink" xmlns:am3d="http://schemas.microsoft.com/office/drawing/2017/model3d" xmlns:o="urn:schemas-microsoft-com:office:office" xmlns:oel="http://schemas.microsoft.com/office/2019/extlst" xmlns:r="http://schemas.openxmlformats.org/officeDocument/2006/relationships" xmlns:m="http://schemas.openxmlformats.org/officeDocument/2006/math" xmlns:v="urn:schemas-microsoft-com:vml" xmlns:wp14="http://schemas.microsoft.com/office/word/2010/wordprocessingDrawing" xmlns:wp="http://schemas.openxmlformats.org/drawingml/2006/wordprocessingDrawing" xmlns:w10="urn:schemas-microsoft-com:office:word" xmlns:w="http://schemas.openxmlformats.org/wordprocessingml/2006/main" xmlns:w14="http://schemas.microsoft.com/office/word/2010/wordml" xmlns:w15="http://schemas.microsoft.com/office/word/2012/wordml" xmlns:w16cex="http://schemas.microsoft.com/office/word/2018/wordml/cex" xmlns:w16cid="http://schemas.microsoft.com/office/word/2016/wordml/cid" xmlns:w16="http://schemas.microsoft.com/office/word/2018/wordml" xmlns:w16du="http://schemas.microsoft.com/office/word/2023/wordml/word16du" xmlns:w16sdtdh="http://schemas.microsoft.com/office/word/2020/wordml/sdtdatahash" xmlns:w16sdtfl="http://schemas.microsoft.com/office/word/2024/wordml/sdtformatlock" xmlns:w16se="http://schemas.microsoft.com/office/word/2015/wordml/symex" xmlns:wpg="http://schemas.microsoft.com/office/word/2010/wordprocessingGroup" xmlns:wpi="http://schemas.microsoft.com/office/word/2010/wordprocessingInk" xmlns:wne="http://schemas.microsoft.com/office/word/2006/wordml" xmlns:wps="http://schemas.microsoft.com/office/word/2010/wordprocessingShape" xmlns:a="http://schemas.openxmlformats.org/drawingml/2006/main" xmlns:a16="http://schemas.microsoft.com/office/drawing/2014/main" xmlns:pic="http://schemas.openxmlformats.org/drawingml/2006/picture" xmlns:a14="http://schemas.microsoft.com/office/drawing/2010/main" mc:Ignorable="w14 w15 w16se w16cid w16 w16cex w16sdtdh w16sdtfl w16du wp14">
   <w:body>
     <w:p>
       <w:pPr>
@@ -41,6 +41,7 @@
         <w:tc>
           <w:tcPr>
             <w:tcW w:w="2065" w:type="dxa"/>
+            <w:tcMar/>
           </w:tcPr>
           <w:p>
             <w:pPr>
@@ -62,6 +63,7 @@
         <w:tc>
           <w:tcPr>
             <w:tcW w:w="4165" w:type="dxa"/>
+            <w:tcMar/>
           </w:tcPr>
           <w:p>
             <w:pPr>
@@ -83,6 +85,7 @@
         <w:tc>
           <w:tcPr>
             <w:tcW w:w="3120" w:type="dxa"/>
+            <w:tcMar/>
           </w:tcPr>
           <w:p>
             <w:pPr>
@@ -109,6 +112,7 @@
         <w:tc>
           <w:tcPr>
             <w:tcW w:w="2065" w:type="dxa"/>
+            <w:tcMar/>
           </w:tcPr>
           <w:p>
             <w:pPr>
@@ -122,6 +126,7 @@
         <w:tc>
           <w:tcPr>
             <w:tcW w:w="4165" w:type="dxa"/>
+            <w:tcMar/>
           </w:tcPr>
           <w:p>
             <w:pPr>
@@ -135,6 +140,7 @@
         <w:tc>
           <w:tcPr>
             <w:tcW w:w="3120" w:type="dxa"/>
+            <w:tcMar/>
           </w:tcPr>
           <w:p>
             <w:pPr>
@@ -205,6 +211,7 @@
         <w:tc>
           <w:tcPr>
             <w:tcW w:w="2065" w:type="dxa"/>
+            <w:tcMar/>
           </w:tcPr>
           <w:p>
             <w:pPr>
@@ -218,6 +225,7 @@
         <w:tc>
           <w:tcPr>
             <w:tcW w:w="4165" w:type="dxa"/>
+            <w:tcMar/>
           </w:tcPr>
           <w:p>
             <w:pPr>
@@ -239,6 +247,7 @@
         <w:tc>
           <w:tcPr>
             <w:tcW w:w="3120" w:type="dxa"/>
+            <w:tcMar/>
           </w:tcPr>
           <w:p>
             <w:pPr>
@@ -309,6 +318,7 @@
         <w:tc>
           <w:tcPr>
             <w:tcW w:w="2065" w:type="dxa"/>
+            <w:tcMar/>
           </w:tcPr>
           <w:p>
             <w:pPr>
@@ -329,6 +339,7 @@
         <w:tc>
           <w:tcPr>
             <w:tcW w:w="4165" w:type="dxa"/>
+            <w:tcMar/>
           </w:tcPr>
           <w:p>
             <w:pPr>
@@ -342,6 +353,7 @@
         <w:tc>
           <w:tcPr>
             <w:tcW w:w="3120" w:type="dxa"/>
+            <w:tcMar/>
           </w:tcPr>
           <w:p>
             <w:pPr>
@@ -412,6 +424,7 @@
         <w:tc>
           <w:tcPr>
             <w:tcW w:w="2065" w:type="dxa"/>
+            <w:tcMar/>
           </w:tcPr>
           <w:p>
             <w:pPr>
@@ -425,6 +438,7 @@
         <w:tc>
           <w:tcPr>
             <w:tcW w:w="4165" w:type="dxa"/>
+            <w:tcMar/>
           </w:tcPr>
           <w:p>
             <w:pPr>
@@ -438,6 +452,7 @@
         <w:tc>
           <w:tcPr>
             <w:tcW w:w="3120" w:type="dxa"/>
+            <w:tcMar/>
           </w:tcPr>
           <w:p>
             <w:pPr>
@@ -508,34 +523,92 @@
         <w:tc>
           <w:tcPr>
             <w:tcW w:w="2065" w:type="dxa"/>
-          </w:tcPr>
-          <w:p>
-            <w:pPr>
-              <w:spacing w:after="120"/>
-            </w:pPr>
+            <w:tcMar/>
+          </w:tcPr>
+          <w:p>
+            <w:pPr>
+              <w:spacing w:after="120"/>
+            </w:pPr>
+            <w:r>
+              <w:rPr/>
+              <w:t>Font in night mode</w:t>
+            </w:r>
           </w:p>
         </w:tc>
         <w:tc>
           <w:tcPr>
             <w:tcW w:w="4165" w:type="dxa"/>
-          </w:tcPr>
-          <w:p>
-            <w:pPr>
-              <w:spacing w:after="120"/>
-            </w:pPr>
+            <w:tcMar/>
+          </w:tcPr>
+          <w:p>
+            <w:pPr>
+              <w:spacing w:after="120"/>
+            </w:pPr>
+            <w:r>
+              <w:rPr/>
+              <w:t>Some of the font is hard to read in night mode</w:t>
+            </w:r>
           </w:p>
         </w:tc>
         <w:tc>
           <w:tcPr>
             <w:tcW w:w="3120" w:type="dxa"/>
-          </w:tcPr>
-          <w:p>
-            <w:pPr>
-              <w:spacing w:after="120"/>
-              <w:rPr>
-                <w:rFonts w:hint="eastAsia"/>
-              </w:rPr>
-            </w:pPr>
+            <w:tcMar/>
+          </w:tcPr>
+          <w:p>
+            <w:pPr>
+              <w:pStyle w:val="Normal"/>
+              <w:spacing w:after="120"/>
+            </w:pPr>
+            <w:r>
+              <w:drawing>
+                <wp:inline wp14:editId="2624A40D" wp14:anchorId="708AA0AD">
+                  <wp:extent cx="1629002" cy="533474"/>
+                  <wp:effectExtent l="0" t="0" r="0" b="0"/>
+                  <wp:docPr id="1524540011" name="drawing">
+                    <a:extLst>
+                      <a:ext uri="{FF2B5EF4-FFF2-40B4-BE49-F238E27FC236}">
+                        <a16:creationId xmlns:a16="http://schemas.microsoft.com/office/drawing/2014/main" id="{084D1A03-3D36-43C0-BCC1-D1F83F2C1367}"/>
+                      </a:ext>
+                    </a:extLst>
+                  </wp:docPr>
+                  <wp:cNvGraphicFramePr>
+                    <a:graphicFrameLocks noChangeAspect="1"/>
+                  </wp:cNvGraphicFramePr>
+                  <a:graphic>
+                    <a:graphicData xmlns:a="http://schemas.openxmlformats.org/drawingml/2006/main" uri="http://schemas.openxmlformats.org/drawingml/2006/picture">
+                      <pic:pic xmlns:pic="http://schemas.openxmlformats.org/drawingml/2006/picture">
+                        <pic:nvPicPr>
+                          <pic:cNvPr id="523767694" name="Picture 523767694"/>
+                          <pic:cNvPicPr/>
+                        </pic:nvPicPr>
+                        <pic:blipFill>
+                          <a:blip xmlns:r="http://schemas.openxmlformats.org/officeDocument/2006/relationships" r:embed="rId5">
+                            <a:extLst>
+                              <a:ext uri="{28A0092B-C50C-407E-A947-70E740481C1C}">
+                                <a14:useLocalDpi xmlns:a14="http://schemas.microsoft.com/office/drawing/2010/main"/>
+                              </a:ext>
+                            </a:extLst>
+                          </a:blip>
+                          <a:stretch>
+                            <a:fillRect/>
+                          </a:stretch>
+                        </pic:blipFill>
+                        <pic:spPr>
+                          <a:xfrm>
+                            <a:off x="0" y="0"/>
+                            <a:ext cx="1629002" cy="533474"/>
+                          </a:xfrm>
+                          <a:prstGeom prst="rect">
+                            <a:avLst/>
+                          </a:prstGeom>
+                        </pic:spPr>
+                      </pic:pic>
+                    </a:graphicData>
+                  </a:graphic>
+                </wp:inline>
+              </w:drawing>
+            </w:r>
           </w:p>
         </w:tc>
       </w:tr>
@@ -546,34 +619,378 @@
         <w:tc>
           <w:tcPr>
             <w:tcW w:w="2065" w:type="dxa"/>
-          </w:tcPr>
-          <w:p>
-            <w:pPr>
-              <w:spacing w:after="120"/>
-            </w:pPr>
+            <w:tcMar/>
+          </w:tcPr>
+          <w:p>
+            <w:pPr>
+              <w:spacing w:after="120"/>
+            </w:pPr>
+            <w:r>
+              <w:rPr/>
+              <w:t>Zoom level at load</w:t>
+            </w:r>
           </w:p>
         </w:tc>
         <w:tc>
           <w:tcPr>
             <w:tcW w:w="4165" w:type="dxa"/>
-          </w:tcPr>
-          <w:p>
-            <w:pPr>
-              <w:spacing w:after="120"/>
-            </w:pPr>
+            <w:tcMar/>
+          </w:tcPr>
+          <w:p>
+            <w:pPr>
+              <w:spacing w:after="120"/>
+            </w:pPr>
+            <w:r>
+              <w:rPr/>
+              <w:t>Would it be possible to set the zoom at this level when loading the page?</w:t>
+            </w:r>
           </w:p>
         </w:tc>
         <w:tc>
           <w:tcPr>
             <w:tcW w:w="3120" w:type="dxa"/>
-          </w:tcPr>
-          <w:p>
-            <w:pPr>
-              <w:spacing w:after="120"/>
-              <w:rPr>
-                <w:rFonts w:hint="eastAsia"/>
-              </w:rPr>
-            </w:pPr>
+            <w:tcMar/>
+          </w:tcPr>
+          <w:p>
+            <w:pPr>
+              <w:pStyle w:val="Normal"/>
+              <w:spacing w:after="120"/>
+            </w:pPr>
+            <w:r>
+              <w:drawing>
+                <wp:inline wp14:editId="5E95404F" wp14:anchorId="26EF574F">
+                  <wp:extent cx="1838325" cy="781050"/>
+                  <wp:effectExtent l="0" t="0" r="0" b="0"/>
+                  <wp:docPr id="684806498" name="drawing"/>
+                  <wp:cNvGraphicFramePr>
+                    <a:graphicFrameLocks noChangeAspect="1"/>
+                  </wp:cNvGraphicFramePr>
+                  <a:graphic>
+                    <a:graphicData xmlns:a="http://schemas.openxmlformats.org/drawingml/2006/main" uri="http://schemas.openxmlformats.org/drawingml/2006/picture">
+                      <pic:pic xmlns:pic="http://schemas.openxmlformats.org/drawingml/2006/picture">
+                        <pic:nvPicPr>
+                          <pic:cNvPr id="684806498" name="Picture 684806498"/>
+                          <pic:cNvPicPr/>
+                        </pic:nvPicPr>
+                        <pic:blipFill>
+                          <a:blip xmlns:r="http://schemas.openxmlformats.org/officeDocument/2006/relationships" r:embed="rId1097516745">
+                            <a:extLst>
+                              <a:ext uri="{28A0092B-C50C-407E-A947-70E740481C1C}">
+                                <a14:useLocalDpi xmlns:a14="http://schemas.microsoft.com/office/drawing/2010/main"/>
+                              </a:ext>
+                            </a:extLst>
+                          </a:blip>
+                          <a:stretch>
+                            <a:fillRect/>
+                          </a:stretch>
+                        </pic:blipFill>
+                        <pic:spPr>
+                          <a:xfrm>
+                            <a:off x="0" y="0"/>
+                            <a:ext cx="1838325" cy="781050"/>
+                          </a:xfrm>
+                          <a:prstGeom prst="rect">
+                            <a:avLst/>
+                          </a:prstGeom>
+                        </pic:spPr>
+                      </pic:pic>
+                    </a:graphicData>
+                  </a:graphic>
+                </wp:inline>
+              </w:drawing>
+            </w:r>
+          </w:p>
+        </w:tc>
+      </w:tr>
+      <w:tr>
+        <w:trPr>
+          <w:trHeight w:val="300"/>
+        </w:trPr>
+        <w:tc>
+          <w:tcPr>
+            <w:tcW w:w="2065" w:type="dxa"/>
+            <w:tcMar/>
+          </w:tcPr>
+          <w:p>
+            <w:pPr>
+              <w:pStyle w:val="Normal"/>
+            </w:pPr>
+            <w:r>
+              <w:rPr/>
+              <w:t>Colour categories</w:t>
+            </w:r>
+          </w:p>
+        </w:tc>
+        <w:tc>
+          <w:tcPr>
+            <w:tcW w:w="4165" w:type="dxa"/>
+            <w:tcMar/>
+          </w:tcPr>
+          <w:p>
+            <w:pPr>
+              <w:pStyle w:val="Normal"/>
+            </w:pPr>
+            <w:r>
+              <w:rPr/>
+              <w:t>would suggest two green categories only to balance red categories at bottom and make FID pending redder</w:t>
+            </w:r>
+            <w:r>
+              <w:rPr/>
+              <w:t>. Maybe make Op / Pilot warm yellowish?</w:t>
+            </w:r>
+          </w:p>
+        </w:tc>
+        <w:tc>
+          <w:tcPr>
+            <w:tcW w:w="3120" w:type="dxa"/>
+            <w:tcMar/>
+          </w:tcPr>
+          <w:p>
+            <w:pPr>
+              <w:pStyle w:val="Normal"/>
+            </w:pPr>
+            <w:r>
+              <w:drawing>
+                <wp:inline wp14:editId="59415261" wp14:anchorId="1A8FA3E8">
+                  <wp:extent cx="1228725" cy="1838325"/>
+                  <wp:effectExtent l="0" t="0" r="0" b="0"/>
+                  <wp:docPr id="1644478558" name="drawing"/>
+                  <wp:cNvGraphicFramePr>
+                    <a:graphicFrameLocks noChangeAspect="1"/>
+                  </wp:cNvGraphicFramePr>
+                  <a:graphic>
+                    <a:graphicData xmlns:a="http://schemas.openxmlformats.org/drawingml/2006/main" uri="http://schemas.openxmlformats.org/drawingml/2006/picture">
+                      <pic:pic xmlns:pic="http://schemas.openxmlformats.org/drawingml/2006/picture">
+                        <pic:nvPicPr>
+                          <pic:cNvPr id="1644478558" name="Picture 1644478558"/>
+                          <pic:cNvPicPr/>
+                        </pic:nvPicPr>
+                        <pic:blipFill>
+                          <a:blip xmlns:r="http://schemas.openxmlformats.org/officeDocument/2006/relationships" r:embed="rId422606684">
+                            <a:extLst>
+                              <a:ext uri="{28A0092B-C50C-407E-A947-70E740481C1C}">
+                                <a14:useLocalDpi xmlns:a14="http://schemas.microsoft.com/office/drawing/2010/main"/>
+                              </a:ext>
+                            </a:extLst>
+                          </a:blip>
+                          <a:stretch>
+                            <a:fillRect/>
+                          </a:stretch>
+                        </pic:blipFill>
+                        <pic:spPr>
+                          <a:xfrm>
+                            <a:off x="0" y="0"/>
+                            <a:ext cx="1228725" cy="1838325"/>
+                          </a:xfrm>
+                          <a:prstGeom prst="rect">
+                            <a:avLst/>
+                          </a:prstGeom>
+                        </pic:spPr>
+                      </pic:pic>
+                    </a:graphicData>
+                  </a:graphic>
+                </wp:inline>
+              </w:drawing>
+            </w:r>
+          </w:p>
+        </w:tc>
+      </w:tr>
+      <w:tr>
+        <w:trPr>
+          <w:trHeight w:val="300"/>
+        </w:trPr>
+        <w:tc>
+          <w:tcPr>
+            <w:tcW w:w="2065" w:type="dxa"/>
+            <w:tcMar/>
+          </w:tcPr>
+          <w:p>
+            <w:pPr>
+              <w:pStyle w:val="Normal"/>
+            </w:pPr>
+            <w:r>
+              <w:rPr/>
+              <w:t>Title</w:t>
+            </w:r>
+          </w:p>
+        </w:tc>
+        <w:tc>
+          <w:tcPr>
+            <w:tcW w:w="4165" w:type="dxa"/>
+            <w:tcMar/>
+          </w:tcPr>
+          <w:p>
+            <w:pPr>
+              <w:pStyle w:val="Normal"/>
+            </w:pPr>
+            <w:r>
+              <w:rPr/>
+              <w:t>Could we call this “Industrial Carbon Management Project Database”?</w:t>
+            </w:r>
+          </w:p>
+        </w:tc>
+        <w:tc>
+          <w:tcPr>
+            <w:tcW w:w="3120" w:type="dxa"/>
+            <w:tcMar/>
+          </w:tcPr>
+          <w:p>
+            <w:pPr>
+              <w:pStyle w:val="Normal"/>
+            </w:pPr>
+            <w:r>
+              <w:drawing>
+                <wp:inline wp14:editId="7C0DF4D2" wp14:anchorId="564D08BE">
+                  <wp:extent cx="1838325" cy="361950"/>
+                  <wp:effectExtent l="0" t="0" r="0" b="0"/>
+                  <wp:docPr id="1791505748" name="drawing"/>
+                  <wp:cNvGraphicFramePr>
+                    <a:graphicFrameLocks noChangeAspect="1"/>
+                  </wp:cNvGraphicFramePr>
+                  <a:graphic>
+                    <a:graphicData xmlns:a="http://schemas.openxmlformats.org/drawingml/2006/main" uri="http://schemas.openxmlformats.org/drawingml/2006/picture">
+                      <pic:pic xmlns:pic="http://schemas.openxmlformats.org/drawingml/2006/picture">
+                        <pic:nvPicPr>
+                          <pic:cNvPr id="1791505748" name="Picture 1791505748"/>
+                          <pic:cNvPicPr/>
+                        </pic:nvPicPr>
+                        <pic:blipFill>
+                          <a:blip xmlns:r="http://schemas.openxmlformats.org/officeDocument/2006/relationships" r:embed="rId974800531">
+                            <a:extLst>
+                              <a:ext uri="{28A0092B-C50C-407E-A947-70E740481C1C}">
+                                <a14:useLocalDpi xmlns:a14="http://schemas.microsoft.com/office/drawing/2010/main"/>
+                              </a:ext>
+                            </a:extLst>
+                          </a:blip>
+                          <a:stretch>
+                            <a:fillRect/>
+                          </a:stretch>
+                        </pic:blipFill>
+                        <pic:spPr>
+                          <a:xfrm>
+                            <a:off x="0" y="0"/>
+                            <a:ext cx="1838325" cy="361950"/>
+                          </a:xfrm>
+                          <a:prstGeom prst="rect">
+                            <a:avLst/>
+                          </a:prstGeom>
+                        </pic:spPr>
+                      </pic:pic>
+                    </a:graphicData>
+                  </a:graphic>
+                </wp:inline>
+              </w:drawing>
+            </w:r>
+          </w:p>
+        </w:tc>
+      </w:tr>
+      <w:tr>
+        <w:trPr>
+          <w:trHeight w:val="300"/>
+        </w:trPr>
+        <w:tc>
+          <w:tcPr>
+            <w:tcW w:w="2065" w:type="dxa"/>
+            <w:tcMar/>
+          </w:tcPr>
+          <w:p>
+            <w:pPr>
+              <w:pStyle w:val="Normal"/>
+            </w:pPr>
+            <w:r>
+              <w:rPr/>
+              <w:t>Colours</w:t>
+            </w:r>
+            <w:r>
+              <w:rPr/>
+              <w:t xml:space="preserve"> on project card</w:t>
+            </w:r>
+          </w:p>
+        </w:tc>
+        <w:tc>
+          <w:tcPr>
+            <w:tcW w:w="4165" w:type="dxa"/>
+            <w:tcMar/>
+          </w:tcPr>
+          <w:p>
+            <w:pPr>
+              <w:pStyle w:val="Normal"/>
+              <w:suppressLineNumbers w:val="0"/>
+              <w:bidi w:val="0"/>
+              <w:spacing w:before="0" w:beforeAutospacing="off" w:after="0" w:afterAutospacing="off" w:line="240" w:lineRule="auto"/>
+              <w:ind w:left="0" w:right="0"/>
+              <w:jc w:val="left"/>
+            </w:pPr>
+            <w:r>
+              <w:rPr/>
+              <w:t xml:space="preserve">Could </w:t>
+            </w:r>
+            <w:r>
+              <w:rPr/>
+              <w:t>wekeep</w:t>
+            </w:r>
+            <w:r>
+              <w:rPr/>
+              <w:t xml:space="preserve"> the avoided green but do it as a grand total of co2 stored to date and then the rest in white? Currently they’re the same as the legend w</w:t>
+            </w:r>
+            <w:r>
+              <w:rPr/>
+              <w:t>hich is a bit confusing</w:t>
+            </w:r>
+          </w:p>
+        </w:tc>
+        <w:tc>
+          <w:tcPr>
+            <w:tcW w:w="3120" w:type="dxa"/>
+            <w:tcMar/>
+          </w:tcPr>
+          <w:p>
+            <w:pPr>
+              <w:pStyle w:val="Normal"/>
+            </w:pPr>
+            <w:r>
+              <w:drawing>
+                <wp:inline wp14:editId="170D5030" wp14:anchorId="06360EAE">
+                  <wp:extent cx="1838325" cy="1409700"/>
+                  <wp:effectExtent l="0" t="0" r="0" b="0"/>
+                  <wp:docPr id="1630411971" name="drawing"/>
+                  <wp:cNvGraphicFramePr>
+                    <a:graphicFrameLocks noChangeAspect="1"/>
+                  </wp:cNvGraphicFramePr>
+                  <a:graphic>
+                    <a:graphicData xmlns:a="http://schemas.openxmlformats.org/drawingml/2006/main" uri="http://schemas.openxmlformats.org/drawingml/2006/picture">
+                      <pic:pic xmlns:pic="http://schemas.openxmlformats.org/drawingml/2006/picture">
+                        <pic:nvPicPr>
+                          <pic:cNvPr id="1630411971" name="Picture 1630411971"/>
+                          <pic:cNvPicPr/>
+                        </pic:nvPicPr>
+                        <pic:blipFill>
+                          <a:blip xmlns:r="http://schemas.openxmlformats.org/officeDocument/2006/relationships" r:embed="rId495534922">
+                            <a:extLst>
+                              <a:ext uri="{28A0092B-C50C-407E-A947-70E740481C1C}">
+                                <a14:useLocalDpi xmlns:a14="http://schemas.microsoft.com/office/drawing/2010/main"/>
+                              </a:ext>
+                            </a:extLst>
+                          </a:blip>
+                          <a:stretch>
+                            <a:fillRect/>
+                          </a:stretch>
+                        </pic:blipFill>
+                        <pic:spPr>
+                          <a:xfrm>
+                            <a:off x="0" y="0"/>
+                            <a:ext cx="1838325" cy="1409700"/>
+                          </a:xfrm>
+                          <a:prstGeom prst="rect">
+                            <a:avLst/>
+                          </a:prstGeom>
+                        </pic:spPr>
+                      </pic:pic>
+                    </a:graphicData>
+                  </a:graphic>
+                </wp:inline>
+              </w:drawing>
+            </w:r>
           </w:p>
         </w:tc>
       </w:tr>
@@ -586,7 +1003,7 @@
       </w:pPr>
     </w:p>
     <w:sectPr>
-      <w:pgSz w:w="12240" w:h="15840"/>
+      <w:pgSz w:w="12240" w:h="15840" w:orient="portrait"/>
       <w:pgMar w:top="1440" w:right="1440" w:bottom="1440" w:left="1440" w:header="720" w:footer="720" w:gutter="0"/>
       <w:cols w:space="720"/>
       <w:docGrid w:linePitch="360"/>
@@ -604,7 +1021,7 @@
   <w:docDefaults>
     <w:rPrDefault>
       <w:rPr>
-        <w:rFonts w:asciiTheme="minorHAnsi" w:eastAsiaTheme="minorEastAsia" w:hAnsiTheme="minorHAnsi" w:cstheme="minorBidi"/>
+        <w:rFonts w:asciiTheme="minorHAnsi" w:hAnsiTheme="minorHAnsi" w:eastAsiaTheme="minorEastAsia" w:cstheme="minorBidi"/>
         <w:sz w:val="24"/>
         <w:szCs w:val="24"/>
         <w:lang w:val="en-US" w:eastAsia="ja-JP" w:bidi="ar-SA"/>
@@ -619,14 +1036,14 @@
   <w:latentStyles w:defLockedState="0" w:defUIPriority="99" w:defSemiHidden="0" w:defUnhideWhenUsed="0" w:defQFormat="0" w:count="376">
     <w:lsdException w:name="Normal" w:uiPriority="0" w:qFormat="1"/>
     <w:lsdException w:name="heading 1" w:uiPriority="9" w:qFormat="1"/>
-    <w:lsdException w:name="heading 2" w:semiHidden="1" w:uiPriority="9" w:unhideWhenUsed="1" w:qFormat="1"/>
-    <w:lsdException w:name="heading 3" w:semiHidden="1" w:uiPriority="9" w:unhideWhenUsed="1" w:qFormat="1"/>
-    <w:lsdException w:name="heading 4" w:semiHidden="1" w:uiPriority="9" w:unhideWhenUsed="1" w:qFormat="1"/>
-    <w:lsdException w:name="heading 5" w:semiHidden="1" w:uiPriority="9" w:unhideWhenUsed="1" w:qFormat="1"/>
-    <w:lsdException w:name="heading 6" w:semiHidden="1" w:uiPriority="9" w:unhideWhenUsed="1" w:qFormat="1"/>
-    <w:lsdException w:name="heading 7" w:semiHidden="1" w:uiPriority="9" w:unhideWhenUsed="1" w:qFormat="1"/>
-    <w:lsdException w:name="heading 8" w:semiHidden="1" w:uiPriority="9" w:unhideWhenUsed="1" w:qFormat="1"/>
-    <w:lsdException w:name="heading 9" w:semiHidden="1" w:uiPriority="9" w:unhideWhenUsed="1" w:qFormat="1"/>
+    <w:lsdException w:name="heading 2" w:uiPriority="9" w:semiHidden="1" w:unhideWhenUsed="1" w:qFormat="1"/>
+    <w:lsdException w:name="heading 3" w:uiPriority="9" w:semiHidden="1" w:unhideWhenUsed="1" w:qFormat="1"/>
+    <w:lsdException w:name="heading 4" w:uiPriority="9" w:semiHidden="1" w:unhideWhenUsed="1" w:qFormat="1"/>
+    <w:lsdException w:name="heading 5" w:uiPriority="9" w:semiHidden="1" w:unhideWhenUsed="1" w:qFormat="1"/>
+    <w:lsdException w:name="heading 6" w:uiPriority="9" w:semiHidden="1" w:unhideWhenUsed="1" w:qFormat="1"/>
+    <w:lsdException w:name="heading 7" w:uiPriority="9" w:semiHidden="1" w:unhideWhenUsed="1" w:qFormat="1"/>
+    <w:lsdException w:name="heading 8" w:uiPriority="9" w:semiHidden="1" w:unhideWhenUsed="1" w:qFormat="1"/>
+    <w:lsdException w:name="heading 9" w:uiPriority="9" w:semiHidden="1" w:unhideWhenUsed="1" w:qFormat="1"/>
     <w:lsdException w:name="index 1" w:semiHidden="1" w:unhideWhenUsed="1"/>
     <w:lsdException w:name="index 2" w:semiHidden="1" w:unhideWhenUsed="1"/>
     <w:lsdException w:name="index 3" w:semiHidden="1" w:unhideWhenUsed="1"/>
@@ -636,22 +1053,22 @@
     <w:lsdException w:name="index 7" w:semiHidden="1" w:unhideWhenUsed="1"/>
     <w:lsdException w:name="index 8" w:semiHidden="1" w:unhideWhenUsed="1"/>
     <w:lsdException w:name="index 9" w:semiHidden="1" w:unhideWhenUsed="1"/>
-    <w:lsdException w:name="toc 1" w:semiHidden="1" w:uiPriority="39" w:unhideWhenUsed="1"/>
-    <w:lsdException w:name="toc 2" w:semiHidden="1" w:uiPriority="39" w:unhideWhenUsed="1"/>
-    <w:lsdException w:name="toc 3" w:semiHidden="1" w:uiPriority="39" w:unhideWhenUsed="1"/>
-    <w:lsdException w:name="toc 4" w:semiHidden="1" w:uiPriority="39" w:unhideWhenUsed="1"/>
-    <w:lsdException w:name="toc 5" w:semiHidden="1" w:uiPriority="39" w:unhideWhenUsed="1"/>
-    <w:lsdException w:name="toc 6" w:semiHidden="1" w:uiPriority="39" w:unhideWhenUsed="1"/>
-    <w:lsdException w:name="toc 7" w:semiHidden="1" w:uiPriority="39" w:unhideWhenUsed="1"/>
-    <w:lsdException w:name="toc 8" w:semiHidden="1" w:uiPriority="39" w:unhideWhenUsed="1"/>
-    <w:lsdException w:name="toc 9" w:semiHidden="1" w:uiPriority="39" w:unhideWhenUsed="1"/>
+    <w:lsdException w:name="toc 1" w:uiPriority="39" w:semiHidden="1" w:unhideWhenUsed="1"/>
+    <w:lsdException w:name="toc 2" w:uiPriority="39" w:semiHidden="1" w:unhideWhenUsed="1"/>
+    <w:lsdException w:name="toc 3" w:uiPriority="39" w:semiHidden="1" w:unhideWhenUsed="1"/>
+    <w:lsdException w:name="toc 4" w:uiPriority="39" w:semiHidden="1" w:unhideWhenUsed="1"/>
+    <w:lsdException w:name="toc 5" w:uiPriority="39" w:semiHidden="1" w:unhideWhenUsed="1"/>
+    <w:lsdException w:name="toc 6" w:uiPriority="39" w:semiHidden="1" w:unhideWhenUsed="1"/>
+    <w:lsdException w:name="toc 7" w:uiPriority="39" w:semiHidden="1" w:unhideWhenUsed="1"/>
+    <w:lsdException w:name="toc 8" w:uiPriority="39" w:semiHidden="1" w:unhideWhenUsed="1"/>
+    <w:lsdException w:name="toc 9" w:uiPriority="39" w:semiHidden="1" w:unhideWhenUsed="1"/>
     <w:lsdException w:name="Normal Indent" w:semiHidden="1" w:unhideWhenUsed="1"/>
     <w:lsdException w:name="footnote text" w:semiHidden="1" w:unhideWhenUsed="1"/>
     <w:lsdException w:name="annotation text" w:semiHidden="1" w:unhideWhenUsed="1"/>
     <w:lsdException w:name="header" w:semiHidden="1" w:unhideWhenUsed="1"/>
     <w:lsdException w:name="footer" w:semiHidden="1" w:unhideWhenUsed="1"/>
     <w:lsdException w:name="index heading" w:semiHidden="1" w:unhideWhenUsed="1"/>
-    <w:lsdException w:name="caption" w:semiHidden="1" w:uiPriority="35" w:unhideWhenUsed="1" w:qFormat="1"/>
+    <w:lsdException w:name="caption" w:uiPriority="35" w:semiHidden="1" w:unhideWhenUsed="1" w:qFormat="1"/>
     <w:lsdException w:name="table of figures" w:semiHidden="1" w:unhideWhenUsed="1"/>
     <w:lsdException w:name="envelope address" w:semiHidden="1" w:unhideWhenUsed="1"/>
     <w:lsdException w:name="envelope return" w:semiHidden="1" w:unhideWhenUsed="1"/>
@@ -682,7 +1099,7 @@
     <w:lsdException w:name="Title" w:uiPriority="10" w:qFormat="1"/>
     <w:lsdException w:name="Closing" w:semiHidden="1" w:unhideWhenUsed="1"/>
     <w:lsdException w:name="Signature" w:semiHidden="1" w:unhideWhenUsed="1"/>
-    <w:lsdException w:name="Default Paragraph Font" w:semiHidden="1" w:uiPriority="1" w:unhideWhenUsed="1"/>
+    <w:lsdException w:name="Default Paragraph Font" w:uiPriority="1" w:semiHidden="1" w:unhideWhenUsed="1"/>
     <w:lsdException w:name="Body Text" w:semiHidden="1" w:unhideWhenUsed="1"/>
     <w:lsdException w:name="Body Text Indent" w:semiHidden="1" w:unhideWhenUsed="1"/>
     <w:lsdException w:name="List Continue" w:semiHidden="1" w:unhideWhenUsed="1"/>
@@ -882,8 +1299,8 @@
     <w:lsdException w:name="Subtle Reference" w:uiPriority="31" w:qFormat="1"/>
     <w:lsdException w:name="Intense Reference" w:uiPriority="32" w:qFormat="1"/>
     <w:lsdException w:name="Book Title" w:uiPriority="33" w:qFormat="1"/>
-    <w:lsdException w:name="Bibliography" w:semiHidden="1" w:uiPriority="37" w:unhideWhenUsed="1"/>
-    <w:lsdException w:name="TOC Heading" w:semiHidden="1" w:uiPriority="39" w:unhideWhenUsed="1" w:qFormat="1"/>
+    <w:lsdException w:name="Bibliography" w:uiPriority="37" w:semiHidden="1" w:unhideWhenUsed="1"/>
+    <w:lsdException w:name="TOC Heading" w:uiPriority="39" w:semiHidden="1" w:unhideWhenUsed="1" w:qFormat="1"/>
     <w:lsdException w:name="Plain Table 1" w:uiPriority="41"/>
     <w:lsdException w:name="Plain Table 2" w:uiPriority="42"/>
     <w:lsdException w:name="Plain Table 3" w:uiPriority="43"/>
@@ -994,7 +1411,7 @@
     <w:lsdException w:name="Unresolved Mention" w:semiHidden="1" w:unhideWhenUsed="1"/>
     <w:lsdException w:name="Smart Link" w:semiHidden="1" w:unhideWhenUsed="1"/>
   </w:latentStyles>
-  <w:style w:type="paragraph" w:default="1" w:styleId="Normal">
+  <w:style w:type="paragraph" w:styleId="Normal" w:default="1">
     <w:name w:val="Normal"/>
     <w:qFormat/>
   </w:style>
@@ -1013,19 +1430,19 @@
       <w:outlineLvl w:val="0"/>
     </w:pPr>
     <w:rPr>
-      <w:rFonts w:asciiTheme="majorHAnsi" w:eastAsiaTheme="majorEastAsia" w:hAnsiTheme="majorHAnsi" w:cstheme="majorBidi"/>
+      <w:rFonts w:asciiTheme="majorHAnsi" w:hAnsiTheme="majorHAnsi" w:eastAsiaTheme="majorEastAsia" w:cstheme="majorBidi"/>
       <w:color w:val="0F4761" w:themeColor="accent1" w:themeShade="BF"/>
       <w:sz w:val="32"/>
       <w:szCs w:val="32"/>
     </w:rPr>
   </w:style>
-  <w:style w:type="character" w:default="1" w:styleId="DefaultParagraphFont">
+  <w:style w:type="character" w:styleId="DefaultParagraphFont" w:default="1">
     <w:name w:val="Default Paragraph Font"/>
     <w:uiPriority w:val="1"/>
     <w:semiHidden/>
     <w:unhideWhenUsed/>
   </w:style>
-  <w:style w:type="table" w:default="1" w:styleId="TableNormal">
+  <w:style w:type="table" w:styleId="TableNormal" w:default="1">
     <w:name w:val="Normal Table"/>
     <w:uiPriority w:val="99"/>
     <w:semiHidden/>
@@ -1040,7 +1457,7 @@
       </w:tblCellMar>
     </w:tblPr>
   </w:style>
-  <w:style w:type="numbering" w:default="1" w:styleId="NoList">
+  <w:style w:type="numbering" w:styleId="NoList" w:default="1">
     <w:name w:val="No List"/>
     <w:uiPriority w:val="99"/>
     <w:semiHidden/>
@@ -1056,23 +1473,23 @@
     </w:pPr>
     <w:tblPr>
       <w:tblBorders>
-        <w:top w:val="single" w:sz="4" w:space="0" w:color="000000" w:themeColor="text1"/>
-        <w:left w:val="single" w:sz="4" w:space="0" w:color="000000" w:themeColor="text1"/>
-        <w:bottom w:val="single" w:sz="4" w:space="0" w:color="000000" w:themeColor="text1"/>
-        <w:right w:val="single" w:sz="4" w:space="0" w:color="000000" w:themeColor="text1"/>
-        <w:insideH w:val="single" w:sz="4" w:space="0" w:color="000000" w:themeColor="text1"/>
-        <w:insideV w:val="single" w:sz="4" w:space="0" w:color="000000" w:themeColor="text1"/>
+        <w:top w:val="single" w:color="000000" w:themeColor="text1" w:sz="4" w:space="0"/>
+        <w:left w:val="single" w:color="000000" w:themeColor="text1" w:sz="4" w:space="0"/>
+        <w:bottom w:val="single" w:color="000000" w:themeColor="text1" w:sz="4" w:space="0"/>
+        <w:right w:val="single" w:color="000000" w:themeColor="text1" w:sz="4" w:space="0"/>
+        <w:insideH w:val="single" w:color="000000" w:themeColor="text1" w:sz="4" w:space="0"/>
+        <w:insideV w:val="single" w:color="000000" w:themeColor="text1" w:sz="4" w:space="0"/>
       </w:tblBorders>
     </w:tblPr>
   </w:style>
-  <w:style w:type="character" w:customStyle="1" w:styleId="Heading1Char">
+  <w:style w:type="character" w:styleId="Heading1Char" w:customStyle="1">
     <w:name w:val="Heading 1 Char"/>
     <w:basedOn w:val="DefaultParagraphFont"/>
     <w:link w:val="Heading1"/>
     <w:uiPriority w:val="9"/>
     <w:rsid w:val="00D105AF"/>
     <w:rPr>
-      <w:rFonts w:asciiTheme="majorHAnsi" w:eastAsiaTheme="majorEastAsia" w:hAnsiTheme="majorHAnsi" w:cstheme="majorBidi"/>
+      <w:rFonts w:asciiTheme="majorHAnsi" w:hAnsiTheme="majorHAnsi" w:eastAsiaTheme="majorEastAsia" w:cstheme="majorBidi"/>
       <w:color w:val="0F4761" w:themeColor="accent1" w:themeShade="BF"/>
       <w:sz w:val="32"/>
       <w:szCs w:val="32"/>
@@ -1082,7 +1499,7 @@
 </file>
 
 <file path=word/theme/theme1.xml><?xml version="1.0" encoding="utf-8"?>
-<a:theme xmlns:a="http://schemas.openxmlformats.org/drawingml/2006/main" name="Office Theme">
+<a:theme xmlns:a="http://schemas.openxmlformats.org/drawingml/2006/main" xmlns:thm15="http://schemas.microsoft.com/office/thememl/2012/main" name="Office Theme">
   <a:themeElements>
     <a:clrScheme name="Office">
       <a:dk1>

</xml_diff>

<commit_message>
modified:   Team Feedback on mapping tool.docx 	modified:   excel_data/Innovation_Fund_Projects_data - 290326.xlsx
</commit_message>
<xml_diff>
--- a/Team Feedback on mapping tool.docx
+++ b/Team Feedback on mapping tool.docx
@@ -1,6 +1,6 @@
 
 <file path=word/document.xml><?xml version="1.0" encoding="utf-8"?>
-<w:document xmlns:wpc="http://schemas.microsoft.com/office/word/2010/wordprocessingCanvas" xmlns:cx="http://schemas.microsoft.com/office/drawing/2014/chartex" xmlns:cx1="http://schemas.microsoft.com/office/drawing/2015/9/8/chartex" xmlns:cx2="http://schemas.microsoft.com/office/drawing/2015/10/21/chartex" xmlns:cx3="http://schemas.microsoft.com/office/drawing/2016/5/9/chartex" xmlns:cx4="http://schemas.microsoft.com/office/drawing/2016/5/10/chartex" xmlns:cx5="http://schemas.microsoft.com/office/drawing/2016/5/11/chartex" xmlns:cx6="http://schemas.microsoft.com/office/drawing/2016/5/12/chartex" xmlns:cx7="http://schemas.microsoft.com/office/drawing/2016/5/13/chartex" xmlns:cx8="http://schemas.microsoft.com/office/drawing/2016/5/14/chartex" xmlns:mc="http://schemas.openxmlformats.org/markup-compatibility/2006" xmlns:aink="http://schemas.microsoft.com/office/drawing/2016/ink" xmlns:am3d="http://schemas.microsoft.com/office/drawing/2017/model3d" xmlns:o="urn:schemas-microsoft-com:office:office" xmlns:oel="http://schemas.microsoft.com/office/2019/extlst" xmlns:r="http://schemas.openxmlformats.org/officeDocument/2006/relationships" xmlns:m="http://schemas.openxmlformats.org/officeDocument/2006/math" xmlns:v="urn:schemas-microsoft-com:vml" xmlns:wp14="http://schemas.microsoft.com/office/word/2010/wordprocessingDrawing" xmlns:wp="http://schemas.openxmlformats.org/drawingml/2006/wordprocessingDrawing" xmlns:w10="urn:schemas-microsoft-com:office:word" xmlns:w="http://schemas.openxmlformats.org/wordprocessingml/2006/main" xmlns:w14="http://schemas.microsoft.com/office/word/2010/wordml" xmlns:w15="http://schemas.microsoft.com/office/word/2012/wordml" xmlns:w16cex="http://schemas.microsoft.com/office/word/2018/wordml/cex" xmlns:w16cid="http://schemas.microsoft.com/office/word/2016/wordml/cid" xmlns:w16="http://schemas.microsoft.com/office/word/2018/wordml" xmlns:w16du="http://schemas.microsoft.com/office/word/2023/wordml/word16du" xmlns:w16sdtdh="http://schemas.microsoft.com/office/word/2020/wordml/sdtdatahash" xmlns:w16sdtfl="http://schemas.microsoft.com/office/word/2024/wordml/sdtformatlock" xmlns:w16se="http://schemas.microsoft.com/office/word/2015/wordml/symex" xmlns:wpg="http://schemas.microsoft.com/office/word/2010/wordprocessingGroup" xmlns:wpi="http://schemas.microsoft.com/office/word/2010/wordprocessingInk" xmlns:wne="http://schemas.microsoft.com/office/word/2006/wordml" xmlns:wps="http://schemas.microsoft.com/office/word/2010/wordprocessingShape" xmlns:a="http://schemas.openxmlformats.org/drawingml/2006/main" xmlns:a16="http://schemas.microsoft.com/office/drawing/2014/main" xmlns:pic="http://schemas.openxmlformats.org/drawingml/2006/picture" xmlns:a14="http://schemas.microsoft.com/office/drawing/2010/main" mc:Ignorable="w14 w15 w16se w16cid w16 w16cex w16sdtdh w16sdtfl w16du wp14">
+<w:document xmlns:wpc="http://schemas.microsoft.com/office/word/2010/wordprocessingCanvas" xmlns:cx="http://schemas.microsoft.com/office/drawing/2014/chartex" xmlns:cx1="http://schemas.microsoft.com/office/drawing/2015/9/8/chartex" xmlns:cx2="http://schemas.microsoft.com/office/drawing/2015/10/21/chartex" xmlns:cx3="http://schemas.microsoft.com/office/drawing/2016/5/9/chartex" xmlns:cx4="http://schemas.microsoft.com/office/drawing/2016/5/10/chartex" xmlns:cx5="http://schemas.microsoft.com/office/drawing/2016/5/11/chartex" xmlns:cx6="http://schemas.microsoft.com/office/drawing/2016/5/12/chartex" xmlns:cx7="http://schemas.microsoft.com/office/drawing/2016/5/13/chartex" xmlns:cx8="http://schemas.microsoft.com/office/drawing/2016/5/14/chartex" xmlns:mc="http://schemas.openxmlformats.org/markup-compatibility/2006" xmlns:aink="http://schemas.microsoft.com/office/drawing/2016/ink" xmlns:am3d="http://schemas.microsoft.com/office/drawing/2017/model3d" xmlns:o="urn:schemas-microsoft-com:office:office" xmlns:oel="http://schemas.microsoft.com/office/2019/extlst" xmlns:r="http://schemas.openxmlformats.org/officeDocument/2006/relationships" xmlns:m="http://schemas.openxmlformats.org/officeDocument/2006/math" xmlns:v="urn:schemas-microsoft-com:vml" xmlns:wp14="http://schemas.microsoft.com/office/word/2010/wordprocessingDrawing" xmlns:wp="http://schemas.openxmlformats.org/drawingml/2006/wordprocessingDrawing" xmlns:w10="urn:schemas-microsoft-com:office:word" xmlns:w="http://schemas.openxmlformats.org/wordprocessingml/2006/main" xmlns:w14="http://schemas.microsoft.com/office/word/2010/wordml" xmlns:w15="http://schemas.microsoft.com/office/word/2012/wordml" xmlns:w16cex="http://schemas.microsoft.com/office/word/2018/wordml/cex" xmlns:w16cid="http://schemas.microsoft.com/office/word/2016/wordml/cid" xmlns:w16="http://schemas.microsoft.com/office/word/2018/wordml" xmlns:w16du="http://schemas.microsoft.com/office/word/2023/wordml/word16du" xmlns:w16sdtdh="http://schemas.microsoft.com/office/word/2020/wordml/sdtdatahash" xmlns:w16sdtfl="http://schemas.microsoft.com/office/word/2024/wordml/sdtformatlock" xmlns:w16se="http://schemas.microsoft.com/office/word/2015/wordml/symex" xmlns:wpg="http://schemas.microsoft.com/office/word/2010/wordprocessingGroup" xmlns:wpi="http://schemas.microsoft.com/office/word/2010/wordprocessingInk" xmlns:wne="http://schemas.microsoft.com/office/word/2006/wordml" xmlns:wps="http://schemas.microsoft.com/office/word/2010/wordprocessingShape" mc:Ignorable="w14 w15 w16se w16cid w16 w16cex w16sdtdh w16sdtfl w16du wp14">
   <w:body>
     <w:p>
       <w:pPr>
@@ -30,9 +30,9 @@
         <w:tblLook w:val="06A0" w:firstRow="1" w:lastRow="0" w:firstColumn="1" w:lastColumn="0" w:noHBand="1" w:noVBand="1"/>
       </w:tblPr>
       <w:tblGrid>
-        <w:gridCol w:w="2065"/>
-        <w:gridCol w:w="4165"/>
-        <w:gridCol w:w="3120"/>
+        <w:gridCol w:w="2027"/>
+        <w:gridCol w:w="3387"/>
+        <w:gridCol w:w="3936"/>
       </w:tblGrid>
       <w:tr>
         <w:trPr>
@@ -41,12 +41,12 @@
         <w:tc>
           <w:tcPr>
             <w:tcW w:w="2065" w:type="dxa"/>
-            <w:tcMar/>
           </w:tcPr>
           <w:p>
             <w:pPr>
               <w:spacing w:after="120"/>
               <w:rPr>
+                <w:rFonts w:hint="eastAsia"/>
                 <w:b/>
                 <w:bCs/>
               </w:rPr>
@@ -63,12 +63,12 @@
         <w:tc>
           <w:tcPr>
             <w:tcW w:w="4165" w:type="dxa"/>
-            <w:tcMar/>
           </w:tcPr>
           <w:p>
             <w:pPr>
               <w:spacing w:after="120"/>
               <w:rPr>
+                <w:rFonts w:hint="eastAsia"/>
                 <w:b/>
                 <w:bCs/>
               </w:rPr>
@@ -85,12 +85,12 @@
         <w:tc>
           <w:tcPr>
             <w:tcW w:w="3120" w:type="dxa"/>
-            <w:tcMar/>
           </w:tcPr>
           <w:p>
             <w:pPr>
               <w:spacing w:after="120"/>
               <w:rPr>
+                <w:rFonts w:hint="eastAsia"/>
                 <w:b/>
                 <w:bCs/>
               </w:rPr>
@@ -112,11 +112,13 @@
         <w:tc>
           <w:tcPr>
             <w:tcW w:w="2065" w:type="dxa"/>
-            <w:tcMar/>
           </w:tcPr>
           <w:p>
             <w:pPr>
               <w:spacing w:after="120"/>
+              <w:rPr>
+                <w:rFonts w:hint="eastAsia"/>
+              </w:rPr>
             </w:pPr>
             <w:r>
               <w:t>Marker size</w:t>
@@ -126,11 +128,13 @@
         <w:tc>
           <w:tcPr>
             <w:tcW w:w="4165" w:type="dxa"/>
-            <w:tcMar/>
           </w:tcPr>
           <w:p>
             <w:pPr>
               <w:spacing w:after="120"/>
+              <w:rPr>
+                <w:rFonts w:hint="eastAsia"/>
+              </w:rPr>
             </w:pPr>
             <w:r>
               <w:t>Do we have a clear definition of what is small or large? Maybe we need more categories? It’s hard because some large projects are funded with a small amount or only an initial phase of a potentially large project. It might be best to make this based on funding amount?</w:t>
@@ -140,7 +144,6 @@
         <w:tc>
           <w:tcPr>
             <w:tcW w:w="3120" w:type="dxa"/>
-            <w:tcMar/>
           </w:tcPr>
           <w:p>
             <w:pPr>
@@ -175,7 +178,7 @@
                           <pic:cNvPicPr/>
                         </pic:nvPicPr>
                         <pic:blipFill>
-                          <a:blip r:embed="rId5">
+                          <a:blip r:embed="rId4">
                             <a:extLst>
                               <a:ext uri="{28A0092B-C50C-407E-A947-70E740481C1C}">
                                 <a14:useLocalDpi xmlns:a14="http://schemas.microsoft.com/office/drawing/2010/main"/>
@@ -211,11 +214,13 @@
         <w:tc>
           <w:tcPr>
             <w:tcW w:w="2065" w:type="dxa"/>
-            <w:tcMar/>
           </w:tcPr>
           <w:p>
             <w:pPr>
               <w:spacing w:after="120"/>
+              <w:rPr>
+                <w:rFonts w:hint="eastAsia"/>
+              </w:rPr>
             </w:pPr>
             <w:r>
               <w:t>Sector: TarraCO2</w:t>
@@ -225,11 +230,13 @@
         <w:tc>
           <w:tcPr>
             <w:tcW w:w="4165" w:type="dxa"/>
-            <w:tcMar/>
           </w:tcPr>
           <w:p>
             <w:pPr>
               <w:spacing w:after="120"/>
+              <w:rPr>
+                <w:rFonts w:hint="eastAsia"/>
+              </w:rPr>
             </w:pPr>
             <w:r>
               <w:t xml:space="preserve">TarraCO2 is marked as other but is </w:t>
@@ -247,7 +254,6 @@
         <w:tc>
           <w:tcPr>
             <w:tcW w:w="3120" w:type="dxa"/>
-            <w:tcMar/>
           </w:tcPr>
           <w:p>
             <w:pPr>
@@ -282,7 +288,7 @@
                           <pic:cNvPicPr/>
                         </pic:nvPicPr>
                         <pic:blipFill>
-                          <a:blip r:embed="rId6">
+                          <a:blip r:embed="rId5">
                             <a:extLst>
                               <a:ext uri="{28A0092B-C50C-407E-A947-70E740481C1C}">
                                 <a14:useLocalDpi xmlns:a14="http://schemas.microsoft.com/office/drawing/2010/main"/>
@@ -318,11 +324,13 @@
         <w:tc>
           <w:tcPr>
             <w:tcW w:w="2065" w:type="dxa"/>
-            <w:tcMar/>
           </w:tcPr>
           <w:p>
             <w:pPr>
               <w:spacing w:after="120"/>
+              <w:rPr>
+                <w:rFonts w:hint="eastAsia"/>
+              </w:rPr>
             </w:pPr>
             <w:proofErr w:type="spellStart"/>
             <w:proofErr w:type="gramStart"/>
@@ -339,11 +347,13 @@
         <w:tc>
           <w:tcPr>
             <w:tcW w:w="4165" w:type="dxa"/>
-            <w:tcMar/>
           </w:tcPr>
           <w:p>
             <w:pPr>
               <w:spacing w:after="120"/>
+              <w:rPr>
+                <w:rFonts w:hint="eastAsia"/>
+              </w:rPr>
             </w:pPr>
             <w:r>
               <w:t>Can we rename this CO2 T&amp;S?</w:t>
@@ -353,7 +363,6 @@
         <w:tc>
           <w:tcPr>
             <w:tcW w:w="3120" w:type="dxa"/>
-            <w:tcMar/>
           </w:tcPr>
           <w:p>
             <w:pPr>
@@ -388,7 +397,7 @@
                           <pic:cNvPicPr/>
                         </pic:nvPicPr>
                         <pic:blipFill>
-                          <a:blip r:embed="rId7">
+                          <a:blip r:embed="rId6">
                             <a:extLst>
                               <a:ext uri="{28A0092B-C50C-407E-A947-70E740481C1C}">
                                 <a14:useLocalDpi xmlns:a14="http://schemas.microsoft.com/office/drawing/2010/main"/>
@@ -424,11 +433,13 @@
         <w:tc>
           <w:tcPr>
             <w:tcW w:w="2065" w:type="dxa"/>
-            <w:tcMar/>
           </w:tcPr>
           <w:p>
             <w:pPr>
               <w:spacing w:after="120"/>
+              <w:rPr>
+                <w:rFonts w:hint="eastAsia"/>
+              </w:rPr>
             </w:pPr>
             <w:r>
               <w:t>Category: GO4ECOPLANET</w:t>
@@ -438,11 +449,13 @@
         <w:tc>
           <w:tcPr>
             <w:tcW w:w="4165" w:type="dxa"/>
-            <w:tcMar/>
           </w:tcPr>
           <w:p>
             <w:pPr>
               <w:spacing w:after="120"/>
+              <w:rPr>
+                <w:rFonts w:hint="eastAsia"/>
+              </w:rPr>
             </w:pPr>
             <w:r>
               <w:t>Marked as cement &amp; lime but it’s just cement</w:t>
@@ -452,7 +465,6 @@
         <w:tc>
           <w:tcPr>
             <w:tcW w:w="3120" w:type="dxa"/>
-            <w:tcMar/>
           </w:tcPr>
           <w:p>
             <w:pPr>
@@ -487,7 +499,7 @@
                           <pic:cNvPicPr/>
                         </pic:nvPicPr>
                         <pic:blipFill>
-                          <a:blip r:embed="rId8">
+                          <a:blip r:embed="rId7">
                             <a:extLst>
                               <a:ext uri="{28A0092B-C50C-407E-A947-70E740481C1C}">
                                 <a14:useLocalDpi xmlns:a14="http://schemas.microsoft.com/office/drawing/2010/main"/>
@@ -523,14 +535,15 @@
         <w:tc>
           <w:tcPr>
             <w:tcW w:w="2065" w:type="dxa"/>
-            <w:tcMar/>
           </w:tcPr>
           <w:p>
             <w:pPr>
               <w:spacing w:after="120"/>
-            </w:pPr>
-            <w:r>
-              <w:rPr/>
+              <w:rPr>
+                <w:rFonts w:hint="eastAsia"/>
+              </w:rPr>
+            </w:pPr>
+            <w:r>
               <w:t>Font in night mode</w:t>
             </w:r>
           </w:p>
@@ -538,52 +551,65 @@
         <w:tc>
           <w:tcPr>
             <w:tcW w:w="4165" w:type="dxa"/>
-            <w:tcMar/>
           </w:tcPr>
           <w:p>
             <w:pPr>
               <w:spacing w:after="120"/>
-            </w:pPr>
-            <w:r>
-              <w:rPr/>
-              <w:t>Some of the font is hard to read in night mode</w:t>
-            </w:r>
-          </w:p>
-        </w:tc>
-        <w:tc>
-          <w:tcPr>
-            <w:tcW w:w="3120" w:type="dxa"/>
-            <w:tcMar/>
-          </w:tcPr>
-          <w:p>
-            <w:pPr>
-              <w:pStyle w:val="Normal"/>
+              <w:rPr>
+                <w:rFonts w:hint="eastAsia"/>
+              </w:rPr>
+            </w:pPr>
+            <w:r>
+              <w:t xml:space="preserve">Some of the </w:t>
+            </w:r>
+            <w:proofErr w:type="gramStart"/>
+            <w:r>
+              <w:t>font is</w:t>
+            </w:r>
+            <w:proofErr w:type="gramEnd"/>
+            <w:r>
+              <w:t xml:space="preserve"> hard to read in night mode</w:t>
+            </w:r>
+          </w:p>
+        </w:tc>
+        <w:tc>
+          <w:tcPr>
+            <w:tcW w:w="3120" w:type="dxa"/>
+          </w:tcPr>
+          <w:p>
+            <w:pPr>
               <w:spacing w:after="120"/>
-            </w:pPr>
-            <w:r>
+              <w:rPr>
+                <w:rFonts w:hint="eastAsia"/>
+              </w:rPr>
+            </w:pPr>
+            <w:r>
+              <w:rPr>
+                <w:noProof/>
+              </w:rPr>
               <w:drawing>
-                <wp:inline wp14:editId="2624A40D" wp14:anchorId="708AA0AD">
+                <wp:inline distT="0" distB="0" distL="0" distR="0" wp14:anchorId="708AA0AD" wp14:editId="2624A40D">
                   <wp:extent cx="1629002" cy="533474"/>
                   <wp:effectExtent l="0" t="0" r="0" b="0"/>
                   <wp:docPr id="1524540011" name="drawing">
-                    <a:extLst>
+                    <a:extLst xmlns:a="http://schemas.openxmlformats.org/drawingml/2006/main">
                       <a:ext uri="{FF2B5EF4-FFF2-40B4-BE49-F238E27FC236}">
                         <a16:creationId xmlns:a16="http://schemas.microsoft.com/office/drawing/2014/main" id="{084D1A03-3D36-43C0-BCC1-D1F83F2C1367}"/>
                       </a:ext>
                     </a:extLst>
                   </wp:docPr>
                   <wp:cNvGraphicFramePr>
-                    <a:graphicFrameLocks noChangeAspect="1"/>
+                    <a:graphicFrameLocks xmlns:a="http://schemas.openxmlformats.org/drawingml/2006/main" noChangeAspect="1"/>
                   </wp:cNvGraphicFramePr>
-                  <a:graphic>
-                    <a:graphicData xmlns:a="http://schemas.openxmlformats.org/drawingml/2006/main" uri="http://schemas.openxmlformats.org/drawingml/2006/picture">
+                  <a:graphic xmlns:a="http://schemas.openxmlformats.org/drawingml/2006/main">
+                    <a:graphicData uri="http://schemas.openxmlformats.org/drawingml/2006/picture">
                       <pic:pic xmlns:pic="http://schemas.openxmlformats.org/drawingml/2006/picture">
                         <pic:nvPicPr>
                           <pic:cNvPr id="523767694" name="Picture 523767694"/>
                           <pic:cNvPicPr/>
                         </pic:nvPicPr>
                         <pic:blipFill>
-                          <a:blip xmlns:r="http://schemas.openxmlformats.org/officeDocument/2006/relationships" r:embed="rId5">
+                          <a:blip r:embed="rId4">
                             <a:extLst>
                               <a:ext uri="{28A0092B-C50C-407E-A947-70E740481C1C}">
                                 <a14:useLocalDpi xmlns:a14="http://schemas.microsoft.com/office/drawing/2010/main"/>
@@ -619,14 +645,15 @@
         <w:tc>
           <w:tcPr>
             <w:tcW w:w="2065" w:type="dxa"/>
-            <w:tcMar/>
           </w:tcPr>
           <w:p>
             <w:pPr>
               <w:spacing w:after="120"/>
-            </w:pPr>
-            <w:r>
-              <w:rPr/>
+              <w:rPr>
+                <w:rFonts w:hint="eastAsia"/>
+              </w:rPr>
+            </w:pPr>
+            <w:r>
               <w:t>Zoom level at load</w:t>
             </w:r>
           </w:p>
@@ -634,14 +661,15 @@
         <w:tc>
           <w:tcPr>
             <w:tcW w:w="4165" w:type="dxa"/>
-            <w:tcMar/>
           </w:tcPr>
           <w:p>
             <w:pPr>
               <w:spacing w:after="120"/>
-            </w:pPr>
-            <w:r>
-              <w:rPr/>
+              <w:rPr>
+                <w:rFonts w:hint="eastAsia"/>
+              </w:rPr>
+            </w:pPr>
+            <w:r>
               <w:t>Would it be possible to set the zoom at this level when loading the page?</w:t>
             </w:r>
           </w:p>
@@ -649,31 +677,35 @@
         <w:tc>
           <w:tcPr>
             <w:tcW w:w="3120" w:type="dxa"/>
-            <w:tcMar/>
-          </w:tcPr>
-          <w:p>
-            <w:pPr>
-              <w:pStyle w:val="Normal"/>
+          </w:tcPr>
+          <w:p>
+            <w:pPr>
               <w:spacing w:after="120"/>
-            </w:pPr>
-            <w:r>
+              <w:rPr>
+                <w:rFonts w:hint="eastAsia"/>
+              </w:rPr>
+            </w:pPr>
+            <w:r>
+              <w:rPr>
+                <w:noProof/>
+              </w:rPr>
               <w:drawing>
-                <wp:inline wp14:editId="5E95404F" wp14:anchorId="26EF574F">
+                <wp:inline distT="0" distB="0" distL="0" distR="0" wp14:anchorId="26EF574F" wp14:editId="5E95404F">
                   <wp:extent cx="1838325" cy="781050"/>
                   <wp:effectExtent l="0" t="0" r="0" b="0"/>
                   <wp:docPr id="684806498" name="drawing"/>
                   <wp:cNvGraphicFramePr>
-                    <a:graphicFrameLocks noChangeAspect="1"/>
+                    <a:graphicFrameLocks xmlns:a="http://schemas.openxmlformats.org/drawingml/2006/main" noChangeAspect="1"/>
                   </wp:cNvGraphicFramePr>
-                  <a:graphic>
-                    <a:graphicData xmlns:a="http://schemas.openxmlformats.org/drawingml/2006/main" uri="http://schemas.openxmlformats.org/drawingml/2006/picture">
+                  <a:graphic xmlns:a="http://schemas.openxmlformats.org/drawingml/2006/main">
+                    <a:graphicData uri="http://schemas.openxmlformats.org/drawingml/2006/picture">
                       <pic:pic xmlns:pic="http://schemas.openxmlformats.org/drawingml/2006/picture">
                         <pic:nvPicPr>
                           <pic:cNvPr id="684806498" name="Picture 684806498"/>
                           <pic:cNvPicPr/>
                         </pic:nvPicPr>
                         <pic:blipFill>
-                          <a:blip xmlns:r="http://schemas.openxmlformats.org/officeDocument/2006/relationships" r:embed="rId1097516745">
+                          <a:blip r:embed="rId8">
                             <a:extLst>
                               <a:ext uri="{28A0092B-C50C-407E-A947-70E740481C1C}">
                                 <a14:useLocalDpi xmlns:a14="http://schemas.microsoft.com/office/drawing/2010/main"/>
@@ -709,33 +741,38 @@
         <w:tc>
           <w:tcPr>
             <w:tcW w:w="2065" w:type="dxa"/>
-            <w:tcMar/>
-          </w:tcPr>
-          <w:p>
-            <w:pPr>
-              <w:pStyle w:val="Normal"/>
-            </w:pPr>
-            <w:r>
-              <w:rPr/>
-              <w:t>Colour categories</w:t>
-            </w:r>
-          </w:p>
-        </w:tc>
-        <w:tc>
-          <w:tcPr>
-            <w:tcW w:w="4165" w:type="dxa"/>
-            <w:tcMar/>
-          </w:tcPr>
-          <w:p>
-            <w:pPr>
-              <w:pStyle w:val="Normal"/>
-            </w:pPr>
-            <w:r>
-              <w:rPr/>
+          </w:tcPr>
+          <w:p>
+            <w:pPr>
+              <w:rPr>
+                <w:rFonts w:hint="eastAsia"/>
+              </w:rPr>
+            </w:pPr>
+            <w:proofErr w:type="spellStart"/>
+            <w:r>
+              <w:lastRenderedPageBreak/>
+              <w:t>Colour</w:t>
+            </w:r>
+            <w:proofErr w:type="spellEnd"/>
+            <w:r>
+              <w:t xml:space="preserve"> categories</w:t>
+            </w:r>
+          </w:p>
+        </w:tc>
+        <w:tc>
+          <w:tcPr>
+            <w:tcW w:w="4165" w:type="dxa"/>
+          </w:tcPr>
+          <w:p>
+            <w:pPr>
+              <w:rPr>
+                <w:rFonts w:hint="eastAsia"/>
+              </w:rPr>
+            </w:pPr>
+            <w:r>
               <w:t>would suggest two green categories only to balance red categories at bottom and make FID pending redder</w:t>
             </w:r>
             <w:r>
-              <w:rPr/>
               <w:t>. Maybe make Op / Pilot warm yellowish?</w:t>
             </w:r>
           </w:p>
@@ -743,30 +780,34 @@
         <w:tc>
           <w:tcPr>
             <w:tcW w:w="3120" w:type="dxa"/>
-            <w:tcMar/>
-          </w:tcPr>
-          <w:p>
-            <w:pPr>
-              <w:pStyle w:val="Normal"/>
-            </w:pPr>
-            <w:r>
+          </w:tcPr>
+          <w:p>
+            <w:pPr>
+              <w:rPr>
+                <w:rFonts w:hint="eastAsia"/>
+              </w:rPr>
+            </w:pPr>
+            <w:r>
+              <w:rPr>
+                <w:noProof/>
+              </w:rPr>
               <w:drawing>
-                <wp:inline wp14:editId="59415261" wp14:anchorId="1A8FA3E8">
+                <wp:inline distT="0" distB="0" distL="0" distR="0" wp14:anchorId="1A8FA3E8" wp14:editId="59415261">
                   <wp:extent cx="1228725" cy="1838325"/>
                   <wp:effectExtent l="0" t="0" r="0" b="0"/>
                   <wp:docPr id="1644478558" name="drawing"/>
                   <wp:cNvGraphicFramePr>
-                    <a:graphicFrameLocks noChangeAspect="1"/>
+                    <a:graphicFrameLocks xmlns:a="http://schemas.openxmlformats.org/drawingml/2006/main" noChangeAspect="1"/>
                   </wp:cNvGraphicFramePr>
-                  <a:graphic>
-                    <a:graphicData xmlns:a="http://schemas.openxmlformats.org/drawingml/2006/main" uri="http://schemas.openxmlformats.org/drawingml/2006/picture">
+                  <a:graphic xmlns:a="http://schemas.openxmlformats.org/drawingml/2006/main">
+                    <a:graphicData uri="http://schemas.openxmlformats.org/drawingml/2006/picture">
                       <pic:pic xmlns:pic="http://schemas.openxmlformats.org/drawingml/2006/picture">
                         <pic:nvPicPr>
                           <pic:cNvPr id="1644478558" name="Picture 1644478558"/>
                           <pic:cNvPicPr/>
                         </pic:nvPicPr>
                         <pic:blipFill>
-                          <a:blip xmlns:r="http://schemas.openxmlformats.org/officeDocument/2006/relationships" r:embed="rId422606684">
+                          <a:blip r:embed="rId9">
                             <a:extLst>
                               <a:ext uri="{28A0092B-C50C-407E-A947-70E740481C1C}">
                                 <a14:useLocalDpi xmlns:a14="http://schemas.microsoft.com/office/drawing/2010/main"/>
@@ -802,14 +843,14 @@
         <w:tc>
           <w:tcPr>
             <w:tcW w:w="2065" w:type="dxa"/>
-            <w:tcMar/>
-          </w:tcPr>
-          <w:p>
-            <w:pPr>
-              <w:pStyle w:val="Normal"/>
-            </w:pPr>
-            <w:r>
-              <w:rPr/>
+          </w:tcPr>
+          <w:p>
+            <w:pPr>
+              <w:rPr>
+                <w:rFonts w:hint="eastAsia"/>
+              </w:rPr>
+            </w:pPr>
+            <w:r>
               <w:t>Title</w:t>
             </w:r>
           </w:p>
@@ -817,14 +858,14 @@
         <w:tc>
           <w:tcPr>
             <w:tcW w:w="4165" w:type="dxa"/>
-            <w:tcMar/>
-          </w:tcPr>
-          <w:p>
-            <w:pPr>
-              <w:pStyle w:val="Normal"/>
-            </w:pPr>
-            <w:r>
-              <w:rPr/>
+          </w:tcPr>
+          <w:p>
+            <w:pPr>
+              <w:rPr>
+                <w:rFonts w:hint="eastAsia"/>
+              </w:rPr>
+            </w:pPr>
+            <w:r>
               <w:t>Could we call this “Industrial Carbon Management Project Database”?</w:t>
             </w:r>
           </w:p>
@@ -832,30 +873,34 @@
         <w:tc>
           <w:tcPr>
             <w:tcW w:w="3120" w:type="dxa"/>
-            <w:tcMar/>
-          </w:tcPr>
-          <w:p>
-            <w:pPr>
-              <w:pStyle w:val="Normal"/>
-            </w:pPr>
-            <w:r>
+          </w:tcPr>
+          <w:p>
+            <w:pPr>
+              <w:rPr>
+                <w:rFonts w:hint="eastAsia"/>
+              </w:rPr>
+            </w:pPr>
+            <w:r>
+              <w:rPr>
+                <w:noProof/>
+              </w:rPr>
               <w:drawing>
-                <wp:inline wp14:editId="7C0DF4D2" wp14:anchorId="564D08BE">
+                <wp:inline distT="0" distB="0" distL="0" distR="0" wp14:anchorId="564D08BE" wp14:editId="7C0DF4D2">
                   <wp:extent cx="1838325" cy="361950"/>
                   <wp:effectExtent l="0" t="0" r="0" b="0"/>
                   <wp:docPr id="1791505748" name="drawing"/>
                   <wp:cNvGraphicFramePr>
-                    <a:graphicFrameLocks noChangeAspect="1"/>
+                    <a:graphicFrameLocks xmlns:a="http://schemas.openxmlformats.org/drawingml/2006/main" noChangeAspect="1"/>
                   </wp:cNvGraphicFramePr>
-                  <a:graphic>
-                    <a:graphicData xmlns:a="http://schemas.openxmlformats.org/drawingml/2006/main" uri="http://schemas.openxmlformats.org/drawingml/2006/picture">
+                  <a:graphic xmlns:a="http://schemas.openxmlformats.org/drawingml/2006/main">
+                    <a:graphicData uri="http://schemas.openxmlformats.org/drawingml/2006/picture">
                       <pic:pic xmlns:pic="http://schemas.openxmlformats.org/drawingml/2006/picture">
                         <pic:nvPicPr>
                           <pic:cNvPr id="1791505748" name="Picture 1791505748"/>
                           <pic:cNvPicPr/>
                         </pic:nvPicPr>
                         <pic:blipFill>
-                          <a:blip xmlns:r="http://schemas.openxmlformats.org/officeDocument/2006/relationships" r:embed="rId974800531">
+                          <a:blip r:embed="rId10">
                             <a:extLst>
                               <a:ext uri="{28A0092B-C50C-407E-A947-70E740481C1C}">
                                 <a14:useLocalDpi xmlns:a14="http://schemas.microsoft.com/office/drawing/2010/main"/>
@@ -891,18 +936,19 @@
         <w:tc>
           <w:tcPr>
             <w:tcW w:w="2065" w:type="dxa"/>
-            <w:tcMar/>
-          </w:tcPr>
-          <w:p>
-            <w:pPr>
-              <w:pStyle w:val="Normal"/>
-            </w:pPr>
-            <w:r>
-              <w:rPr/>
+          </w:tcPr>
+          <w:p>
+            <w:pPr>
+              <w:rPr>
+                <w:rFonts w:hint="eastAsia"/>
+              </w:rPr>
+            </w:pPr>
+            <w:proofErr w:type="spellStart"/>
+            <w:r>
               <w:t>Colours</w:t>
             </w:r>
-            <w:r>
-              <w:rPr/>
+            <w:proofErr w:type="spellEnd"/>
+            <w:r>
               <w:t xml:space="preserve"> on project card</w:t>
             </w:r>
           </w:p>
@@ -910,31 +956,17 @@
         <w:tc>
           <w:tcPr>
             <w:tcW w:w="4165" w:type="dxa"/>
-            <w:tcMar/>
-          </w:tcPr>
-          <w:p>
-            <w:pPr>
-              <w:pStyle w:val="Normal"/>
-              <w:suppressLineNumbers w:val="0"/>
-              <w:bidi w:val="0"/>
-              <w:spacing w:before="0" w:beforeAutospacing="off" w:after="0" w:afterAutospacing="off" w:line="240" w:lineRule="auto"/>
-              <w:ind w:left="0" w:right="0"/>
-              <w:jc w:val="left"/>
-            </w:pPr>
-            <w:r>
-              <w:rPr/>
-              <w:t xml:space="preserve">Could </w:t>
-            </w:r>
-            <w:r>
-              <w:rPr/>
-              <w:t>wekeep</w:t>
-            </w:r>
-            <w:r>
-              <w:rPr/>
-              <w:t xml:space="preserve"> the avoided green but do it as a grand total of co2 stored to date and then the rest in white? Currently they’re the same as the legend w</w:t>
-            </w:r>
-            <w:r>
-              <w:rPr/>
+          </w:tcPr>
+          <w:p>
+            <w:pPr>
+              <w:rPr>
+                <w:rFonts w:hint="eastAsia"/>
+              </w:rPr>
+            </w:pPr>
+            <w:r>
+              <w:t>Could wekeep the avoided green but do it as a grand total of co2 stored to date and then the rest in white? Currently they’re the same as the legend w</w:t>
+            </w:r>
+            <w:r>
               <w:t>hich is a bit confusing</w:t>
             </w:r>
           </w:p>
@@ -942,30 +974,34 @@
         <w:tc>
           <w:tcPr>
             <w:tcW w:w="3120" w:type="dxa"/>
-            <w:tcMar/>
-          </w:tcPr>
-          <w:p>
-            <w:pPr>
-              <w:pStyle w:val="Normal"/>
-            </w:pPr>
-            <w:r>
+          </w:tcPr>
+          <w:p>
+            <w:pPr>
+              <w:rPr>
+                <w:rFonts w:hint="eastAsia"/>
+              </w:rPr>
+            </w:pPr>
+            <w:r>
+              <w:rPr>
+                <w:noProof/>
+              </w:rPr>
               <w:drawing>
-                <wp:inline wp14:editId="170D5030" wp14:anchorId="06360EAE">
+                <wp:inline distT="0" distB="0" distL="0" distR="0" wp14:anchorId="06360EAE" wp14:editId="170D5030">
                   <wp:extent cx="1838325" cy="1409700"/>
                   <wp:effectExtent l="0" t="0" r="0" b="0"/>
                   <wp:docPr id="1630411971" name="drawing"/>
                   <wp:cNvGraphicFramePr>
-                    <a:graphicFrameLocks noChangeAspect="1"/>
+                    <a:graphicFrameLocks xmlns:a="http://schemas.openxmlformats.org/drawingml/2006/main" noChangeAspect="1"/>
                   </wp:cNvGraphicFramePr>
-                  <a:graphic>
-                    <a:graphicData xmlns:a="http://schemas.openxmlformats.org/drawingml/2006/main" uri="http://schemas.openxmlformats.org/drawingml/2006/picture">
+                  <a:graphic xmlns:a="http://schemas.openxmlformats.org/drawingml/2006/main">
+                    <a:graphicData uri="http://schemas.openxmlformats.org/drawingml/2006/picture">
                       <pic:pic xmlns:pic="http://schemas.openxmlformats.org/drawingml/2006/picture">
                         <pic:nvPicPr>
                           <pic:cNvPr id="1630411971" name="Picture 1630411971"/>
                           <pic:cNvPicPr/>
                         </pic:nvPicPr>
                         <pic:blipFill>
-                          <a:blip xmlns:r="http://schemas.openxmlformats.org/officeDocument/2006/relationships" r:embed="rId495534922">
+                          <a:blip r:embed="rId11">
                             <a:extLst>
                               <a:ext uri="{28A0092B-C50C-407E-A947-70E740481C1C}">
                                 <a14:useLocalDpi xmlns:a14="http://schemas.microsoft.com/office/drawing/2010/main"/>
@@ -994,6 +1030,472 @@
           </w:p>
         </w:tc>
       </w:tr>
+      <w:tr>
+        <w:trPr>
+          <w:trHeight w:val="300"/>
+        </w:trPr>
+        <w:tc>
+          <w:tcPr>
+            <w:tcW w:w="2065" w:type="dxa"/>
+          </w:tcPr>
+          <w:p>
+            <w:r>
+              <w:t>CO</w:t>
+            </w:r>
+            <w:r>
+              <w:rPr>
+                <w:vertAlign w:val="subscript"/>
+              </w:rPr>
+              <w:t>2</w:t>
+            </w:r>
+            <w:r>
+              <w:t xml:space="preserve"> metrics </w:t>
+            </w:r>
+            <w:r>
+              <w:t>(Lifetime)</w:t>
+            </w:r>
+          </w:p>
+        </w:tc>
+        <w:tc>
+          <w:tcPr>
+            <w:tcW w:w="4165" w:type="dxa"/>
+          </w:tcPr>
+          <w:p>
+            <w:r>
+              <w:t>Remove ‘Lifetime’</w:t>
+            </w:r>
+          </w:p>
+        </w:tc>
+        <w:tc>
+          <w:tcPr>
+            <w:tcW w:w="3120" w:type="dxa"/>
+          </w:tcPr>
+          <w:p>
+            <w:pPr>
+              <w:rPr>
+                <w:noProof/>
+              </w:rPr>
+            </w:pPr>
+            <w:r>
+              <w:rPr>
+                <w:noProof/>
+              </w:rPr>
+              <w:drawing>
+                <wp:inline distT="0" distB="0" distL="0" distR="0" wp14:anchorId="1AED3DDA" wp14:editId="48266A53">
+                  <wp:extent cx="2355273" cy="1077989"/>
+                  <wp:effectExtent l="0" t="0" r="6985" b="8255"/>
+                  <wp:docPr id="1205072602" name="Picture 1"/>
+                  <wp:cNvGraphicFramePr>
+                    <a:graphicFrameLocks xmlns:a="http://schemas.openxmlformats.org/drawingml/2006/main" noChangeAspect="1"/>
+                  </wp:cNvGraphicFramePr>
+                  <a:graphic xmlns:a="http://schemas.openxmlformats.org/drawingml/2006/main">
+                    <a:graphicData uri="http://schemas.openxmlformats.org/drawingml/2006/picture">
+                      <pic:pic xmlns:pic="http://schemas.openxmlformats.org/drawingml/2006/picture">
+                        <pic:nvPicPr>
+                          <pic:cNvPr id="1205072602" name=""/>
+                          <pic:cNvPicPr/>
+                        </pic:nvPicPr>
+                        <pic:blipFill>
+                          <a:blip r:embed="rId12"/>
+                          <a:stretch>
+                            <a:fillRect/>
+                          </a:stretch>
+                        </pic:blipFill>
+                        <pic:spPr>
+                          <a:xfrm>
+                            <a:off x="0" y="0"/>
+                            <a:ext cx="2383020" cy="1090689"/>
+                          </a:xfrm>
+                          <a:prstGeom prst="rect">
+                            <a:avLst/>
+                          </a:prstGeom>
+                        </pic:spPr>
+                      </pic:pic>
+                    </a:graphicData>
+                  </a:graphic>
+                </wp:inline>
+              </w:drawing>
+            </w:r>
+          </w:p>
+        </w:tc>
+      </w:tr>
+      <w:tr>
+        <w:trPr>
+          <w:trHeight w:val="300"/>
+        </w:trPr>
+        <w:tc>
+          <w:tcPr>
+            <w:tcW w:w="2065" w:type="dxa"/>
+          </w:tcPr>
+          <w:p/>
+        </w:tc>
+        <w:tc>
+          <w:tcPr>
+            <w:tcW w:w="4165" w:type="dxa"/>
+          </w:tcPr>
+          <w:p/>
+        </w:tc>
+        <w:tc>
+          <w:tcPr>
+            <w:tcW w:w="3120" w:type="dxa"/>
+          </w:tcPr>
+          <w:p>
+            <w:pPr>
+              <w:rPr>
+                <w:noProof/>
+              </w:rPr>
+            </w:pPr>
+          </w:p>
+        </w:tc>
+      </w:tr>
+      <w:tr>
+        <w:trPr>
+          <w:trHeight w:val="300"/>
+        </w:trPr>
+        <w:tc>
+          <w:tcPr>
+            <w:tcW w:w="2065" w:type="dxa"/>
+          </w:tcPr>
+          <w:p/>
+        </w:tc>
+        <w:tc>
+          <w:tcPr>
+            <w:tcW w:w="4165" w:type="dxa"/>
+          </w:tcPr>
+          <w:p/>
+        </w:tc>
+        <w:tc>
+          <w:tcPr>
+            <w:tcW w:w="3120" w:type="dxa"/>
+          </w:tcPr>
+          <w:p>
+            <w:pPr>
+              <w:rPr>
+                <w:noProof/>
+              </w:rPr>
+            </w:pPr>
+          </w:p>
+        </w:tc>
+      </w:tr>
+      <w:tr>
+        <w:trPr>
+          <w:trHeight w:val="300"/>
+        </w:trPr>
+        <w:tc>
+          <w:tcPr>
+            <w:tcW w:w="2065" w:type="dxa"/>
+          </w:tcPr>
+          <w:p/>
+        </w:tc>
+        <w:tc>
+          <w:tcPr>
+            <w:tcW w:w="4165" w:type="dxa"/>
+          </w:tcPr>
+          <w:p/>
+        </w:tc>
+        <w:tc>
+          <w:tcPr>
+            <w:tcW w:w="3120" w:type="dxa"/>
+          </w:tcPr>
+          <w:p>
+            <w:pPr>
+              <w:rPr>
+                <w:noProof/>
+              </w:rPr>
+            </w:pPr>
+          </w:p>
+        </w:tc>
+      </w:tr>
+      <w:tr>
+        <w:trPr>
+          <w:trHeight w:val="300"/>
+        </w:trPr>
+        <w:tc>
+          <w:tcPr>
+            <w:tcW w:w="2065" w:type="dxa"/>
+          </w:tcPr>
+          <w:p/>
+        </w:tc>
+        <w:tc>
+          <w:tcPr>
+            <w:tcW w:w="4165" w:type="dxa"/>
+          </w:tcPr>
+          <w:p/>
+        </w:tc>
+        <w:tc>
+          <w:tcPr>
+            <w:tcW w:w="3120" w:type="dxa"/>
+          </w:tcPr>
+          <w:p>
+            <w:pPr>
+              <w:rPr>
+                <w:noProof/>
+              </w:rPr>
+            </w:pPr>
+          </w:p>
+        </w:tc>
+      </w:tr>
+      <w:tr>
+        <w:trPr>
+          <w:trHeight w:val="300"/>
+        </w:trPr>
+        <w:tc>
+          <w:tcPr>
+            <w:tcW w:w="2065" w:type="dxa"/>
+          </w:tcPr>
+          <w:p/>
+        </w:tc>
+        <w:tc>
+          <w:tcPr>
+            <w:tcW w:w="4165" w:type="dxa"/>
+          </w:tcPr>
+          <w:p/>
+        </w:tc>
+        <w:tc>
+          <w:tcPr>
+            <w:tcW w:w="3120" w:type="dxa"/>
+          </w:tcPr>
+          <w:p>
+            <w:pPr>
+              <w:rPr>
+                <w:noProof/>
+              </w:rPr>
+            </w:pPr>
+          </w:p>
+        </w:tc>
+      </w:tr>
+      <w:tr>
+        <w:trPr>
+          <w:trHeight w:val="300"/>
+        </w:trPr>
+        <w:tc>
+          <w:tcPr>
+            <w:tcW w:w="2065" w:type="dxa"/>
+          </w:tcPr>
+          <w:p/>
+        </w:tc>
+        <w:tc>
+          <w:tcPr>
+            <w:tcW w:w="4165" w:type="dxa"/>
+          </w:tcPr>
+          <w:p/>
+        </w:tc>
+        <w:tc>
+          <w:tcPr>
+            <w:tcW w:w="3120" w:type="dxa"/>
+          </w:tcPr>
+          <w:p>
+            <w:pPr>
+              <w:rPr>
+                <w:noProof/>
+              </w:rPr>
+            </w:pPr>
+          </w:p>
+        </w:tc>
+      </w:tr>
+      <w:tr>
+        <w:trPr>
+          <w:trHeight w:val="300"/>
+        </w:trPr>
+        <w:tc>
+          <w:tcPr>
+            <w:tcW w:w="2065" w:type="dxa"/>
+          </w:tcPr>
+          <w:p/>
+        </w:tc>
+        <w:tc>
+          <w:tcPr>
+            <w:tcW w:w="4165" w:type="dxa"/>
+          </w:tcPr>
+          <w:p/>
+        </w:tc>
+        <w:tc>
+          <w:tcPr>
+            <w:tcW w:w="3120" w:type="dxa"/>
+          </w:tcPr>
+          <w:p>
+            <w:pPr>
+              <w:rPr>
+                <w:noProof/>
+              </w:rPr>
+            </w:pPr>
+          </w:p>
+        </w:tc>
+      </w:tr>
+      <w:tr>
+        <w:trPr>
+          <w:trHeight w:val="300"/>
+        </w:trPr>
+        <w:tc>
+          <w:tcPr>
+            <w:tcW w:w="2065" w:type="dxa"/>
+          </w:tcPr>
+          <w:p/>
+        </w:tc>
+        <w:tc>
+          <w:tcPr>
+            <w:tcW w:w="4165" w:type="dxa"/>
+          </w:tcPr>
+          <w:p/>
+        </w:tc>
+        <w:tc>
+          <w:tcPr>
+            <w:tcW w:w="3120" w:type="dxa"/>
+          </w:tcPr>
+          <w:p>
+            <w:pPr>
+              <w:rPr>
+                <w:noProof/>
+              </w:rPr>
+            </w:pPr>
+          </w:p>
+        </w:tc>
+      </w:tr>
+      <w:tr>
+        <w:trPr>
+          <w:trHeight w:val="300"/>
+        </w:trPr>
+        <w:tc>
+          <w:tcPr>
+            <w:tcW w:w="2065" w:type="dxa"/>
+          </w:tcPr>
+          <w:p/>
+        </w:tc>
+        <w:tc>
+          <w:tcPr>
+            <w:tcW w:w="4165" w:type="dxa"/>
+          </w:tcPr>
+          <w:p/>
+        </w:tc>
+        <w:tc>
+          <w:tcPr>
+            <w:tcW w:w="3120" w:type="dxa"/>
+          </w:tcPr>
+          <w:p>
+            <w:pPr>
+              <w:rPr>
+                <w:noProof/>
+              </w:rPr>
+            </w:pPr>
+          </w:p>
+        </w:tc>
+      </w:tr>
+      <w:tr>
+        <w:trPr>
+          <w:trHeight w:val="300"/>
+        </w:trPr>
+        <w:tc>
+          <w:tcPr>
+            <w:tcW w:w="2065" w:type="dxa"/>
+          </w:tcPr>
+          <w:p/>
+        </w:tc>
+        <w:tc>
+          <w:tcPr>
+            <w:tcW w:w="4165" w:type="dxa"/>
+          </w:tcPr>
+          <w:p/>
+        </w:tc>
+        <w:tc>
+          <w:tcPr>
+            <w:tcW w:w="3120" w:type="dxa"/>
+          </w:tcPr>
+          <w:p>
+            <w:pPr>
+              <w:rPr>
+                <w:noProof/>
+              </w:rPr>
+            </w:pPr>
+          </w:p>
+        </w:tc>
+      </w:tr>
+      <w:tr>
+        <w:trPr>
+          <w:trHeight w:val="300"/>
+        </w:trPr>
+        <w:tc>
+          <w:tcPr>
+            <w:tcW w:w="2065" w:type="dxa"/>
+          </w:tcPr>
+          <w:p/>
+        </w:tc>
+        <w:tc>
+          <w:tcPr>
+            <w:tcW w:w="4165" w:type="dxa"/>
+          </w:tcPr>
+          <w:p/>
+        </w:tc>
+        <w:tc>
+          <w:tcPr>
+            <w:tcW w:w="3120" w:type="dxa"/>
+          </w:tcPr>
+          <w:p>
+            <w:pPr>
+              <w:rPr>
+                <w:noProof/>
+              </w:rPr>
+            </w:pPr>
+          </w:p>
+        </w:tc>
+      </w:tr>
+      <w:tr>
+        <w:trPr>
+          <w:trHeight w:val="300"/>
+        </w:trPr>
+        <w:tc>
+          <w:tcPr>
+            <w:tcW w:w="2065" w:type="dxa"/>
+          </w:tcPr>
+          <w:p/>
+        </w:tc>
+        <w:tc>
+          <w:tcPr>
+            <w:tcW w:w="4165" w:type="dxa"/>
+          </w:tcPr>
+          <w:p/>
+        </w:tc>
+        <w:tc>
+          <w:tcPr>
+            <w:tcW w:w="3120" w:type="dxa"/>
+          </w:tcPr>
+          <w:p>
+            <w:pPr>
+              <w:rPr>
+                <w:noProof/>
+              </w:rPr>
+            </w:pPr>
+          </w:p>
+        </w:tc>
+      </w:tr>
+      <w:tr>
+        <w:trPr>
+          <w:trHeight w:val="300"/>
+        </w:trPr>
+        <w:tc>
+          <w:tcPr>
+            <w:tcW w:w="2065" w:type="dxa"/>
+          </w:tcPr>
+          <w:p/>
+        </w:tc>
+        <w:tc>
+          <w:tcPr>
+            <w:tcW w:w="4165" w:type="dxa"/>
+          </w:tcPr>
+          <w:p/>
+        </w:tc>
+        <w:tc>
+          <w:tcPr>
+            <w:tcW w:w="3120" w:type="dxa"/>
+          </w:tcPr>
+          <w:p>
+            <w:pPr>
+              <w:rPr>
+                <w:noProof/>
+              </w:rPr>
+            </w:pPr>
+          </w:p>
+        </w:tc>
+      </w:tr>
     </w:tbl>
     <w:p>
       <w:pPr>
@@ -1003,7 +1505,7 @@
       </w:pPr>
     </w:p>
     <w:sectPr>
-      <w:pgSz w:w="12240" w:h="15840" w:orient="portrait"/>
+      <w:pgSz w:w="12240" w:h="15840"/>
       <w:pgMar w:top="1440" w:right="1440" w:bottom="1440" w:left="1440" w:header="720" w:footer="720" w:gutter="0"/>
       <w:cols w:space="720"/>
       <w:docGrid w:linePitch="360"/>
@@ -1012,16 +1514,12 @@
 </w:document>
 </file>
 
-<file path=word/numbering.xml><?xml version="1.0" encoding="utf-8"?>
-<w:numbering xmlns:wpc="http://schemas.microsoft.com/office/word/2010/wordprocessingCanvas" xmlns:cx="http://schemas.microsoft.com/office/drawing/2014/chartex" xmlns:cx1="http://schemas.microsoft.com/office/drawing/2015/9/8/chartex" xmlns:cx2="http://schemas.microsoft.com/office/drawing/2015/10/21/chartex" xmlns:cx3="http://schemas.microsoft.com/office/drawing/2016/5/9/chartex" xmlns:cx4="http://schemas.microsoft.com/office/drawing/2016/5/10/chartex" xmlns:cx5="http://schemas.microsoft.com/office/drawing/2016/5/11/chartex" xmlns:cx6="http://schemas.microsoft.com/office/drawing/2016/5/12/chartex" xmlns:cx7="http://schemas.microsoft.com/office/drawing/2016/5/13/chartex" xmlns:cx8="http://schemas.microsoft.com/office/drawing/2016/5/14/chartex" xmlns:mc="http://schemas.openxmlformats.org/markup-compatibility/2006" xmlns:aink="http://schemas.microsoft.com/office/drawing/2016/ink" xmlns:am3d="http://schemas.microsoft.com/office/drawing/2017/model3d" xmlns:o="urn:schemas-microsoft-com:office:office" xmlns:oel="http://schemas.microsoft.com/office/2019/extlst" xmlns:r="http://schemas.openxmlformats.org/officeDocument/2006/relationships" xmlns:m="http://schemas.openxmlformats.org/officeDocument/2006/math" xmlns:v="urn:schemas-microsoft-com:vml" xmlns:wp14="http://schemas.microsoft.com/office/word/2010/wordprocessingDrawing" xmlns:wp="http://schemas.openxmlformats.org/drawingml/2006/wordprocessingDrawing" xmlns:w10="urn:schemas-microsoft-com:office:word" xmlns:w="http://schemas.openxmlformats.org/wordprocessingml/2006/main" xmlns:w14="http://schemas.microsoft.com/office/word/2010/wordml" xmlns:w15="http://schemas.microsoft.com/office/word/2012/wordml" xmlns:w16cex="http://schemas.microsoft.com/office/word/2018/wordml/cex" xmlns:w16cid="http://schemas.microsoft.com/office/word/2016/wordml/cid" xmlns:w16="http://schemas.microsoft.com/office/word/2018/wordml" xmlns:w16du="http://schemas.microsoft.com/office/word/2023/wordml/word16du" xmlns:w16sdtdh="http://schemas.microsoft.com/office/word/2020/wordml/sdtdatahash" xmlns:w16sdtfl="http://schemas.microsoft.com/office/word/2024/wordml/sdtformatlock" xmlns:w16se="http://schemas.microsoft.com/office/word/2015/wordml/symex" xmlns:wpg="http://schemas.microsoft.com/office/word/2010/wordprocessingGroup" xmlns:wpi="http://schemas.microsoft.com/office/word/2010/wordprocessingInk" xmlns:wne="http://schemas.microsoft.com/office/word/2006/wordml" xmlns:wps="http://schemas.microsoft.com/office/word/2010/wordprocessingShape" mc:Ignorable="w14 w15 w16se w16cid w16 w16cex w16sdtdh w16sdtfl w16du wp14"/>
-</file>
-
 <file path=word/styles.xml><?xml version="1.0" encoding="utf-8"?>
 <w:styles xmlns:mc="http://schemas.openxmlformats.org/markup-compatibility/2006" xmlns:r="http://schemas.openxmlformats.org/officeDocument/2006/relationships" xmlns:w="http://schemas.openxmlformats.org/wordprocessingml/2006/main" xmlns:w14="http://schemas.microsoft.com/office/word/2010/wordml" xmlns:w15="http://schemas.microsoft.com/office/word/2012/wordml" xmlns:w16cex="http://schemas.microsoft.com/office/word/2018/wordml/cex" xmlns:w16cid="http://schemas.microsoft.com/office/word/2016/wordml/cid" xmlns:w16="http://schemas.microsoft.com/office/word/2018/wordml" xmlns:w16du="http://schemas.microsoft.com/office/word/2023/wordml/word16du" xmlns:w16sdtdh="http://schemas.microsoft.com/office/word/2020/wordml/sdtdatahash" xmlns:w16sdtfl="http://schemas.microsoft.com/office/word/2024/wordml/sdtformatlock" xmlns:w16se="http://schemas.microsoft.com/office/word/2015/wordml/symex" mc:Ignorable="w14 w15 w16se w16cid w16 w16cex w16sdtdh w16sdtfl w16du">
   <w:docDefaults>
     <w:rPrDefault>
       <w:rPr>
-        <w:rFonts w:asciiTheme="minorHAnsi" w:hAnsiTheme="minorHAnsi" w:eastAsiaTheme="minorEastAsia" w:cstheme="minorBidi"/>
+        <w:rFonts w:asciiTheme="minorHAnsi" w:eastAsiaTheme="minorEastAsia" w:hAnsiTheme="minorHAnsi" w:cstheme="minorBidi"/>
         <w:sz w:val="24"/>
         <w:szCs w:val="24"/>
         <w:lang w:val="en-US" w:eastAsia="ja-JP" w:bidi="ar-SA"/>
@@ -1036,14 +1534,14 @@
   <w:latentStyles w:defLockedState="0" w:defUIPriority="99" w:defSemiHidden="0" w:defUnhideWhenUsed="0" w:defQFormat="0" w:count="376">
     <w:lsdException w:name="Normal" w:uiPriority="0" w:qFormat="1"/>
     <w:lsdException w:name="heading 1" w:uiPriority="9" w:qFormat="1"/>
-    <w:lsdException w:name="heading 2" w:uiPriority="9" w:semiHidden="1" w:unhideWhenUsed="1" w:qFormat="1"/>
-    <w:lsdException w:name="heading 3" w:uiPriority="9" w:semiHidden="1" w:unhideWhenUsed="1" w:qFormat="1"/>
-    <w:lsdException w:name="heading 4" w:uiPriority="9" w:semiHidden="1" w:unhideWhenUsed="1" w:qFormat="1"/>
-    <w:lsdException w:name="heading 5" w:uiPriority="9" w:semiHidden="1" w:unhideWhenUsed="1" w:qFormat="1"/>
-    <w:lsdException w:name="heading 6" w:uiPriority="9" w:semiHidden="1" w:unhideWhenUsed="1" w:qFormat="1"/>
-    <w:lsdException w:name="heading 7" w:uiPriority="9" w:semiHidden="1" w:unhideWhenUsed="1" w:qFormat="1"/>
-    <w:lsdException w:name="heading 8" w:uiPriority="9" w:semiHidden="1" w:unhideWhenUsed="1" w:qFormat="1"/>
-    <w:lsdException w:name="heading 9" w:uiPriority="9" w:semiHidden="1" w:unhideWhenUsed="1" w:qFormat="1"/>
+    <w:lsdException w:name="heading 2" w:semiHidden="1" w:uiPriority="9" w:unhideWhenUsed="1" w:qFormat="1"/>
+    <w:lsdException w:name="heading 3" w:semiHidden="1" w:uiPriority="9" w:unhideWhenUsed="1" w:qFormat="1"/>
+    <w:lsdException w:name="heading 4" w:semiHidden="1" w:uiPriority="9" w:unhideWhenUsed="1" w:qFormat="1"/>
+    <w:lsdException w:name="heading 5" w:semiHidden="1" w:uiPriority="9" w:unhideWhenUsed="1" w:qFormat="1"/>
+    <w:lsdException w:name="heading 6" w:semiHidden="1" w:uiPriority="9" w:unhideWhenUsed="1" w:qFormat="1"/>
+    <w:lsdException w:name="heading 7" w:semiHidden="1" w:uiPriority="9" w:unhideWhenUsed="1" w:qFormat="1"/>
+    <w:lsdException w:name="heading 8" w:semiHidden="1" w:uiPriority="9" w:unhideWhenUsed="1" w:qFormat="1"/>
+    <w:lsdException w:name="heading 9" w:semiHidden="1" w:uiPriority="9" w:unhideWhenUsed="1" w:qFormat="1"/>
     <w:lsdException w:name="index 1" w:semiHidden="1" w:unhideWhenUsed="1"/>
     <w:lsdException w:name="index 2" w:semiHidden="1" w:unhideWhenUsed="1"/>
     <w:lsdException w:name="index 3" w:semiHidden="1" w:unhideWhenUsed="1"/>
@@ -1053,22 +1551,22 @@
     <w:lsdException w:name="index 7" w:semiHidden="1" w:unhideWhenUsed="1"/>
     <w:lsdException w:name="index 8" w:semiHidden="1" w:unhideWhenUsed="1"/>
     <w:lsdException w:name="index 9" w:semiHidden="1" w:unhideWhenUsed="1"/>
-    <w:lsdException w:name="toc 1" w:uiPriority="39" w:semiHidden="1" w:unhideWhenUsed="1"/>
-    <w:lsdException w:name="toc 2" w:uiPriority="39" w:semiHidden="1" w:unhideWhenUsed="1"/>
-    <w:lsdException w:name="toc 3" w:uiPriority="39" w:semiHidden="1" w:unhideWhenUsed="1"/>
-    <w:lsdException w:name="toc 4" w:uiPriority="39" w:semiHidden="1" w:unhideWhenUsed="1"/>
-    <w:lsdException w:name="toc 5" w:uiPriority="39" w:semiHidden="1" w:unhideWhenUsed="1"/>
-    <w:lsdException w:name="toc 6" w:uiPriority="39" w:semiHidden="1" w:unhideWhenUsed="1"/>
-    <w:lsdException w:name="toc 7" w:uiPriority="39" w:semiHidden="1" w:unhideWhenUsed="1"/>
-    <w:lsdException w:name="toc 8" w:uiPriority="39" w:semiHidden="1" w:unhideWhenUsed="1"/>
-    <w:lsdException w:name="toc 9" w:uiPriority="39" w:semiHidden="1" w:unhideWhenUsed="1"/>
+    <w:lsdException w:name="toc 1" w:semiHidden="1" w:uiPriority="39" w:unhideWhenUsed="1"/>
+    <w:lsdException w:name="toc 2" w:semiHidden="1" w:uiPriority="39" w:unhideWhenUsed="1"/>
+    <w:lsdException w:name="toc 3" w:semiHidden="1" w:uiPriority="39" w:unhideWhenUsed="1"/>
+    <w:lsdException w:name="toc 4" w:semiHidden="1" w:uiPriority="39" w:unhideWhenUsed="1"/>
+    <w:lsdException w:name="toc 5" w:semiHidden="1" w:uiPriority="39" w:unhideWhenUsed="1"/>
+    <w:lsdException w:name="toc 6" w:semiHidden="1" w:uiPriority="39" w:unhideWhenUsed="1"/>
+    <w:lsdException w:name="toc 7" w:semiHidden="1" w:uiPriority="39" w:unhideWhenUsed="1"/>
+    <w:lsdException w:name="toc 8" w:semiHidden="1" w:uiPriority="39" w:unhideWhenUsed="1"/>
+    <w:lsdException w:name="toc 9" w:semiHidden="1" w:uiPriority="39" w:unhideWhenUsed="1"/>
     <w:lsdException w:name="Normal Indent" w:semiHidden="1" w:unhideWhenUsed="1"/>
     <w:lsdException w:name="footnote text" w:semiHidden="1" w:unhideWhenUsed="1"/>
     <w:lsdException w:name="annotation text" w:semiHidden="1" w:unhideWhenUsed="1"/>
     <w:lsdException w:name="header" w:semiHidden="1" w:unhideWhenUsed="1"/>
     <w:lsdException w:name="footer" w:semiHidden="1" w:unhideWhenUsed="1"/>
     <w:lsdException w:name="index heading" w:semiHidden="1" w:unhideWhenUsed="1"/>
-    <w:lsdException w:name="caption" w:uiPriority="35" w:semiHidden="1" w:unhideWhenUsed="1" w:qFormat="1"/>
+    <w:lsdException w:name="caption" w:semiHidden="1" w:uiPriority="35" w:unhideWhenUsed="1" w:qFormat="1"/>
     <w:lsdException w:name="table of figures" w:semiHidden="1" w:unhideWhenUsed="1"/>
     <w:lsdException w:name="envelope address" w:semiHidden="1" w:unhideWhenUsed="1"/>
     <w:lsdException w:name="envelope return" w:semiHidden="1" w:unhideWhenUsed="1"/>
@@ -1099,7 +1597,7 @@
     <w:lsdException w:name="Title" w:uiPriority="10" w:qFormat="1"/>
     <w:lsdException w:name="Closing" w:semiHidden="1" w:unhideWhenUsed="1"/>
     <w:lsdException w:name="Signature" w:semiHidden="1" w:unhideWhenUsed="1"/>
-    <w:lsdException w:name="Default Paragraph Font" w:uiPriority="1" w:semiHidden="1" w:unhideWhenUsed="1"/>
+    <w:lsdException w:name="Default Paragraph Font" w:semiHidden="1" w:uiPriority="1" w:unhideWhenUsed="1"/>
     <w:lsdException w:name="Body Text" w:semiHidden="1" w:unhideWhenUsed="1"/>
     <w:lsdException w:name="Body Text Indent" w:semiHidden="1" w:unhideWhenUsed="1"/>
     <w:lsdException w:name="List Continue" w:semiHidden="1" w:unhideWhenUsed="1"/>
@@ -1299,8 +1797,8 @@
     <w:lsdException w:name="Subtle Reference" w:uiPriority="31" w:qFormat="1"/>
     <w:lsdException w:name="Intense Reference" w:uiPriority="32" w:qFormat="1"/>
     <w:lsdException w:name="Book Title" w:uiPriority="33" w:qFormat="1"/>
-    <w:lsdException w:name="Bibliography" w:uiPriority="37" w:semiHidden="1" w:unhideWhenUsed="1"/>
-    <w:lsdException w:name="TOC Heading" w:uiPriority="39" w:semiHidden="1" w:unhideWhenUsed="1" w:qFormat="1"/>
+    <w:lsdException w:name="Bibliography" w:semiHidden="1" w:uiPriority="37" w:unhideWhenUsed="1"/>
+    <w:lsdException w:name="TOC Heading" w:semiHidden="1" w:uiPriority="39" w:unhideWhenUsed="1" w:qFormat="1"/>
     <w:lsdException w:name="Plain Table 1" w:uiPriority="41"/>
     <w:lsdException w:name="Plain Table 2" w:uiPriority="42"/>
     <w:lsdException w:name="Plain Table 3" w:uiPriority="43"/>
@@ -1411,7 +1909,7 @@
     <w:lsdException w:name="Unresolved Mention" w:semiHidden="1" w:unhideWhenUsed="1"/>
     <w:lsdException w:name="Smart Link" w:semiHidden="1" w:unhideWhenUsed="1"/>
   </w:latentStyles>
-  <w:style w:type="paragraph" w:styleId="Normal" w:default="1">
+  <w:style w:type="paragraph" w:default="1" w:styleId="Normal">
     <w:name w:val="Normal"/>
     <w:qFormat/>
   </w:style>
@@ -1430,19 +1928,19 @@
       <w:outlineLvl w:val="0"/>
     </w:pPr>
     <w:rPr>
-      <w:rFonts w:asciiTheme="majorHAnsi" w:hAnsiTheme="majorHAnsi" w:eastAsiaTheme="majorEastAsia" w:cstheme="majorBidi"/>
+      <w:rFonts w:asciiTheme="majorHAnsi" w:eastAsiaTheme="majorEastAsia" w:hAnsiTheme="majorHAnsi" w:cstheme="majorBidi"/>
       <w:color w:val="0F4761" w:themeColor="accent1" w:themeShade="BF"/>
       <w:sz w:val="32"/>
       <w:szCs w:val="32"/>
     </w:rPr>
   </w:style>
-  <w:style w:type="character" w:styleId="DefaultParagraphFont" w:default="1">
+  <w:style w:type="character" w:default="1" w:styleId="DefaultParagraphFont">
     <w:name w:val="Default Paragraph Font"/>
     <w:uiPriority w:val="1"/>
     <w:semiHidden/>
     <w:unhideWhenUsed/>
   </w:style>
-  <w:style w:type="table" w:styleId="TableNormal" w:default="1">
+  <w:style w:type="table" w:default="1" w:styleId="TableNormal">
     <w:name w:val="Normal Table"/>
     <w:uiPriority w:val="99"/>
     <w:semiHidden/>
@@ -1457,7 +1955,7 @@
       </w:tblCellMar>
     </w:tblPr>
   </w:style>
-  <w:style w:type="numbering" w:styleId="NoList" w:default="1">
+  <w:style w:type="numbering" w:default="1" w:styleId="NoList">
     <w:name w:val="No List"/>
     <w:uiPriority w:val="99"/>
     <w:semiHidden/>
@@ -1473,23 +1971,23 @@
     </w:pPr>
     <w:tblPr>
       <w:tblBorders>
-        <w:top w:val="single" w:color="000000" w:themeColor="text1" w:sz="4" w:space="0"/>
-        <w:left w:val="single" w:color="000000" w:themeColor="text1" w:sz="4" w:space="0"/>
-        <w:bottom w:val="single" w:color="000000" w:themeColor="text1" w:sz="4" w:space="0"/>
-        <w:right w:val="single" w:color="000000" w:themeColor="text1" w:sz="4" w:space="0"/>
-        <w:insideH w:val="single" w:color="000000" w:themeColor="text1" w:sz="4" w:space="0"/>
-        <w:insideV w:val="single" w:color="000000" w:themeColor="text1" w:sz="4" w:space="0"/>
+        <w:top w:val="single" w:sz="4" w:space="0" w:color="000000" w:themeColor="text1"/>
+        <w:left w:val="single" w:sz="4" w:space="0" w:color="000000" w:themeColor="text1"/>
+        <w:bottom w:val="single" w:sz="4" w:space="0" w:color="000000" w:themeColor="text1"/>
+        <w:right w:val="single" w:sz="4" w:space="0" w:color="000000" w:themeColor="text1"/>
+        <w:insideH w:val="single" w:sz="4" w:space="0" w:color="000000" w:themeColor="text1"/>
+        <w:insideV w:val="single" w:sz="4" w:space="0" w:color="000000" w:themeColor="text1"/>
       </w:tblBorders>
     </w:tblPr>
   </w:style>
-  <w:style w:type="character" w:styleId="Heading1Char" w:customStyle="1">
+  <w:style w:type="character" w:customStyle="1" w:styleId="Heading1Char">
     <w:name w:val="Heading 1 Char"/>
     <w:basedOn w:val="DefaultParagraphFont"/>
     <w:link w:val="Heading1"/>
     <w:uiPriority w:val="9"/>
     <w:rsid w:val="00D105AF"/>
     <w:rPr>
-      <w:rFonts w:asciiTheme="majorHAnsi" w:hAnsiTheme="majorHAnsi" w:eastAsiaTheme="majorEastAsia" w:cstheme="majorBidi"/>
+      <w:rFonts w:asciiTheme="majorHAnsi" w:eastAsiaTheme="majorEastAsia" w:hAnsiTheme="majorHAnsi" w:cstheme="majorBidi"/>
       <w:color w:val="0F4761" w:themeColor="accent1" w:themeShade="BF"/>
       <w:sz w:val="32"/>
       <w:szCs w:val="32"/>
@@ -1499,7 +1997,7 @@
 </file>
 
 <file path=word/theme/theme1.xml><?xml version="1.0" encoding="utf-8"?>
-<a:theme xmlns:a="http://schemas.openxmlformats.org/drawingml/2006/main" xmlns:thm15="http://schemas.microsoft.com/office/thememl/2012/main" name="Office Theme">
+<a:theme xmlns:a="http://schemas.openxmlformats.org/drawingml/2006/main" name="Office Theme">
   <a:themeElements>
     <a:clrScheme name="Office">
       <a:dk1>

</xml_diff>

<commit_message>
modified:   Team Feedback on mapping tool.docx 	new file:   excel_data/IF_Projects_harmonised.xlsx 	new file:   excel_data/Innovation_Fund_Projects_data - 130426.xlsx 	new file:   excel_data/Innovation_Fund_Projects_data - 290326 - BKP.xlsx 	new file:   excel_data/Innovation_Fund_Projects_data - 290326.csv 	deleted:    excel_data/Innovation_Fund_Projects_data - 290326.xlsx 	modified:   public/data/meta.json 	modified:   public/data/projects.json 	new file:   public/data/projects_bkp_130426.json 	modified:   scripts/excel_to_json.py 	new file:   scripts/excel_to_json_bkp_130426.py 	modified:   src/components/FilterPanel.jsx 	modified:   src/components/Legend.jsx 	modified:   src/components/Legend.module.css 	modified:   src/components/MapView.jsx 	modified:   src/components/ProjectSidebar.jsx 	modified:   src/components/ProjectSidebar.module.css 	modified:   src/components/StatsBar.jsx 	modified:   src/constants.js
</commit_message>
<xml_diff>
--- a/Team Feedback on mapping tool.docx
+++ b/Team Feedback on mapping tool.docx
@@ -14,11 +14,6 @@
       </w:r>
     </w:p>
     <w:p>
-      <w:pPr>
-        <w:rPr>
-          <w:rFonts w:hint="eastAsia"/>
-        </w:rPr>
-      </w:pPr>
       <w:r>
         <w:t>Please give your feedback below:</w:t>
       </w:r>
@@ -30,8 +25,8 @@
         <w:tblLook w:val="06A0" w:firstRow="1" w:lastRow="0" w:firstColumn="1" w:lastColumn="0" w:noHBand="1" w:noVBand="1"/>
       </w:tblPr>
       <w:tblGrid>
-        <w:gridCol w:w="2027"/>
-        <w:gridCol w:w="3387"/>
+        <w:gridCol w:w="2038"/>
+        <w:gridCol w:w="3376"/>
         <w:gridCol w:w="3936"/>
       </w:tblGrid>
       <w:tr>
@@ -46,7 +41,6 @@
             <w:pPr>
               <w:spacing w:after="120"/>
               <w:rPr>
-                <w:rFonts w:hint="eastAsia"/>
                 <w:b/>
                 <w:bCs/>
               </w:rPr>
@@ -68,7 +62,6 @@
             <w:pPr>
               <w:spacing w:after="120"/>
               <w:rPr>
-                <w:rFonts w:hint="eastAsia"/>
                 <w:b/>
                 <w:bCs/>
               </w:rPr>
@@ -90,7 +83,6 @@
             <w:pPr>
               <w:spacing w:after="120"/>
               <w:rPr>
-                <w:rFonts w:hint="eastAsia"/>
                 <w:b/>
                 <w:bCs/>
               </w:rPr>
@@ -117,10 +109,13 @@
             <w:pPr>
               <w:spacing w:after="120"/>
               <w:rPr>
-                <w:rFonts w:hint="eastAsia"/>
-              </w:rPr>
-            </w:pPr>
-            <w:r>
+                <w:highlight w:val="green"/>
+              </w:rPr>
+            </w:pPr>
+            <w:r>
+              <w:rPr>
+                <w:highlight w:val="green"/>
+              </w:rPr>
               <w:t>Marker size</w:t>
             </w:r>
           </w:p>
@@ -133,10 +128,13 @@
             <w:pPr>
               <w:spacing w:after="120"/>
               <w:rPr>
-                <w:rFonts w:hint="eastAsia"/>
-              </w:rPr>
-            </w:pPr>
-            <w:r>
+                <w:highlight w:val="green"/>
+              </w:rPr>
+            </w:pPr>
+            <w:r>
+              <w:rPr>
+                <w:highlight w:val="green"/>
+              </w:rPr>
               <w:t>Do we have a clear definition of what is small or large? Maybe we need more categories? It’s hard because some large projects are funded with a small amount or only an initial phase of a potentially large project. It might be best to make this based on funding amount?</w:t>
             </w:r>
           </w:p>
@@ -149,12 +147,13 @@
             <w:pPr>
               <w:spacing w:after="120"/>
               <w:rPr>
-                <w:rFonts w:hint="eastAsia"/>
+                <w:highlight w:val="green"/>
               </w:rPr>
             </w:pPr>
             <w:r>
               <w:rPr>
                 <w:noProof/>
+                <w:highlight w:val="green"/>
               </w:rPr>
               <w:drawing>
                 <wp:inline distT="0" distB="0" distL="0" distR="0" wp14:anchorId="7DD0208C" wp14:editId="6CB551B1">
@@ -219,10 +218,13 @@
             <w:pPr>
               <w:spacing w:after="120"/>
               <w:rPr>
-                <w:rFonts w:hint="eastAsia"/>
-              </w:rPr>
-            </w:pPr>
-            <w:r>
+                <w:highlight w:val="green"/>
+              </w:rPr>
+            </w:pPr>
+            <w:r>
+              <w:rPr>
+                <w:highlight w:val="green"/>
+              </w:rPr>
               <w:t>Sector: TarraCO2</w:t>
             </w:r>
           </w:p>
@@ -235,18 +237,27 @@
             <w:pPr>
               <w:spacing w:after="120"/>
               <w:rPr>
-                <w:rFonts w:hint="eastAsia"/>
-              </w:rPr>
-            </w:pPr>
-            <w:r>
+                <w:highlight w:val="green"/>
+              </w:rPr>
+            </w:pPr>
+            <w:r>
+              <w:rPr>
+                <w:highlight w:val="green"/>
+              </w:rPr>
               <w:t xml:space="preserve">TarraCO2 is marked as other but is </w:t>
             </w:r>
             <w:proofErr w:type="gramStart"/>
             <w:r>
+              <w:rPr>
+                <w:highlight w:val="green"/>
+              </w:rPr>
               <w:t>actually T&amp;S</w:t>
             </w:r>
             <w:proofErr w:type="gramEnd"/>
             <w:r>
+              <w:rPr>
+                <w:highlight w:val="green"/>
+              </w:rPr>
               <w:t xml:space="preserve"> infrastructure</w:t>
             </w:r>
           </w:p>
@@ -259,12 +270,13 @@
             <w:pPr>
               <w:spacing w:after="120"/>
               <w:rPr>
-                <w:rFonts w:hint="eastAsia"/>
+                <w:highlight w:val="green"/>
               </w:rPr>
             </w:pPr>
             <w:r>
               <w:rPr>
                 <w:noProof/>
+                <w:highlight w:val="green"/>
               </w:rPr>
               <w:drawing>
                 <wp:inline distT="0" distB="0" distL="0" distR="0" wp14:anchorId="17F6AE1F" wp14:editId="04EE87EE">
@@ -329,17 +341,23 @@
             <w:pPr>
               <w:spacing w:after="120"/>
               <w:rPr>
-                <w:rFonts w:hint="eastAsia"/>
+                <w:highlight w:val="green"/>
               </w:rPr>
             </w:pPr>
             <w:proofErr w:type="spellStart"/>
             <w:proofErr w:type="gramStart"/>
             <w:r>
+              <w:rPr>
+                <w:highlight w:val="green"/>
+              </w:rPr>
               <w:t>Category:CCS</w:t>
             </w:r>
             <w:proofErr w:type="spellEnd"/>
             <w:proofErr w:type="gramEnd"/>
             <w:r>
+              <w:rPr>
+                <w:highlight w:val="green"/>
+              </w:rPr>
               <w:t xml:space="preserve"> T&amp;S</w:t>
             </w:r>
           </w:p>
@@ -352,10 +370,13 @@
             <w:pPr>
               <w:spacing w:after="120"/>
               <w:rPr>
-                <w:rFonts w:hint="eastAsia"/>
-              </w:rPr>
-            </w:pPr>
-            <w:r>
+                <w:highlight w:val="green"/>
+              </w:rPr>
+            </w:pPr>
+            <w:r>
+              <w:rPr>
+                <w:highlight w:val="green"/>
+              </w:rPr>
               <w:t>Can we rename this CO2 T&amp;S?</w:t>
             </w:r>
           </w:p>
@@ -368,12 +389,13 @@
             <w:pPr>
               <w:spacing w:after="120"/>
               <w:rPr>
-                <w:rFonts w:hint="eastAsia"/>
+                <w:highlight w:val="green"/>
               </w:rPr>
             </w:pPr>
             <w:r>
               <w:rPr>
                 <w:noProof/>
+                <w:highlight w:val="green"/>
               </w:rPr>
               <w:drawing>
                 <wp:inline distT="0" distB="0" distL="0" distR="0" wp14:anchorId="46F4B6E2" wp14:editId="12CB0644">
@@ -438,10 +460,13 @@
             <w:pPr>
               <w:spacing w:after="120"/>
               <w:rPr>
-                <w:rFonts w:hint="eastAsia"/>
-              </w:rPr>
-            </w:pPr>
-            <w:r>
+                <w:highlight w:val="green"/>
+              </w:rPr>
+            </w:pPr>
+            <w:r>
+              <w:rPr>
+                <w:highlight w:val="green"/>
+              </w:rPr>
               <w:t>Category: GO4ECOPLANET</w:t>
             </w:r>
           </w:p>
@@ -454,10 +479,13 @@
             <w:pPr>
               <w:spacing w:after="120"/>
               <w:rPr>
-                <w:rFonts w:hint="eastAsia"/>
-              </w:rPr>
-            </w:pPr>
-            <w:r>
+                <w:highlight w:val="green"/>
+              </w:rPr>
+            </w:pPr>
+            <w:r>
+              <w:rPr>
+                <w:highlight w:val="green"/>
+              </w:rPr>
               <w:t>Marked as cement &amp; lime but it’s just cement</w:t>
             </w:r>
           </w:p>
@@ -470,12 +498,13 @@
             <w:pPr>
               <w:spacing w:after="120"/>
               <w:rPr>
-                <w:rFonts w:hint="eastAsia"/>
+                <w:highlight w:val="green"/>
               </w:rPr>
             </w:pPr>
             <w:r>
               <w:rPr>
                 <w:noProof/>
+                <w:highlight w:val="green"/>
               </w:rPr>
               <w:drawing>
                 <wp:inline distT="0" distB="0" distL="0" distR="0" wp14:anchorId="1F61E0B2" wp14:editId="35E4235E">
@@ -540,10 +569,13 @@
             <w:pPr>
               <w:spacing w:after="120"/>
               <w:rPr>
-                <w:rFonts w:hint="eastAsia"/>
-              </w:rPr>
-            </w:pPr>
-            <w:r>
+                <w:highlight w:val="green"/>
+              </w:rPr>
+            </w:pPr>
+            <w:r>
+              <w:rPr>
+                <w:highlight w:val="green"/>
+              </w:rPr>
               <w:t>Font in night mode</w:t>
             </w:r>
           </w:p>
@@ -556,18 +588,27 @@
             <w:pPr>
               <w:spacing w:after="120"/>
               <w:rPr>
-                <w:rFonts w:hint="eastAsia"/>
-              </w:rPr>
-            </w:pPr>
-            <w:r>
+                <w:highlight w:val="green"/>
+              </w:rPr>
+            </w:pPr>
+            <w:r>
+              <w:rPr>
+                <w:highlight w:val="green"/>
+              </w:rPr>
               <w:t xml:space="preserve">Some of the </w:t>
             </w:r>
             <w:proofErr w:type="gramStart"/>
             <w:r>
+              <w:rPr>
+                <w:highlight w:val="green"/>
+              </w:rPr>
               <w:t>font is</w:t>
             </w:r>
             <w:proofErr w:type="gramEnd"/>
             <w:r>
+              <w:rPr>
+                <w:highlight w:val="green"/>
+              </w:rPr>
               <w:t xml:space="preserve"> hard to read in night mode</w:t>
             </w:r>
           </w:p>
@@ -580,12 +621,13 @@
             <w:pPr>
               <w:spacing w:after="120"/>
               <w:rPr>
-                <w:rFonts w:hint="eastAsia"/>
+                <w:highlight w:val="green"/>
               </w:rPr>
             </w:pPr>
             <w:r>
               <w:rPr>
                 <w:noProof/>
+                <w:highlight w:val="green"/>
               </w:rPr>
               <w:drawing>
                 <wp:inline distT="0" distB="0" distL="0" distR="0" wp14:anchorId="708AA0AD" wp14:editId="2624A40D">
@@ -650,10 +692,13 @@
             <w:pPr>
               <w:spacing w:after="120"/>
               <w:rPr>
-                <w:rFonts w:hint="eastAsia"/>
-              </w:rPr>
-            </w:pPr>
-            <w:r>
+                <w:highlight w:val="green"/>
+              </w:rPr>
+            </w:pPr>
+            <w:r>
+              <w:rPr>
+                <w:highlight w:val="green"/>
+              </w:rPr>
               <w:t>Zoom level at load</w:t>
             </w:r>
           </w:p>
@@ -666,10 +711,13 @@
             <w:pPr>
               <w:spacing w:after="120"/>
               <w:rPr>
-                <w:rFonts w:hint="eastAsia"/>
-              </w:rPr>
-            </w:pPr>
-            <w:r>
+                <w:highlight w:val="green"/>
+              </w:rPr>
+            </w:pPr>
+            <w:r>
+              <w:rPr>
+                <w:highlight w:val="green"/>
+              </w:rPr>
               <w:t>Would it be possible to set the zoom at this level when loading the page?</w:t>
             </w:r>
           </w:p>
@@ -682,12 +730,13 @@
             <w:pPr>
               <w:spacing w:after="120"/>
               <w:rPr>
-                <w:rFonts w:hint="eastAsia"/>
+                <w:highlight w:val="green"/>
               </w:rPr>
             </w:pPr>
             <w:r>
               <w:rPr>
                 <w:noProof/>
+                <w:highlight w:val="green"/>
               </w:rPr>
               <w:drawing>
                 <wp:inline distT="0" distB="0" distL="0" distR="0" wp14:anchorId="26EF574F" wp14:editId="5E95404F">
@@ -743,11 +792,6 @@
             <w:tcW w:w="2065" w:type="dxa"/>
           </w:tcPr>
           <w:p>
-            <w:pPr>
-              <w:rPr>
-                <w:rFonts w:hint="eastAsia"/>
-              </w:rPr>
-            </w:pPr>
             <w:proofErr w:type="spellStart"/>
             <w:r>
               <w:lastRenderedPageBreak/>
@@ -764,11 +808,6 @@
             <w:tcW w:w="4165" w:type="dxa"/>
           </w:tcPr>
           <w:p>
-            <w:pPr>
-              <w:rPr>
-                <w:rFonts w:hint="eastAsia"/>
-              </w:rPr>
-            </w:pPr>
             <w:r>
               <w:t>would suggest two green categories only to balance red categories at bottom and make FID pending redder</w:t>
             </w:r>
@@ -782,11 +821,6 @@
             <w:tcW w:w="3120" w:type="dxa"/>
           </w:tcPr>
           <w:p>
-            <w:pPr>
-              <w:rPr>
-                <w:rFonts w:hint="eastAsia"/>
-              </w:rPr>
-            </w:pPr>
             <w:r>
               <w:rPr>
                 <w:noProof/>
@@ -847,10 +881,13 @@
           <w:p>
             <w:pPr>
               <w:rPr>
-                <w:rFonts w:hint="eastAsia"/>
-              </w:rPr>
-            </w:pPr>
-            <w:r>
+                <w:highlight w:val="green"/>
+              </w:rPr>
+            </w:pPr>
+            <w:r>
+              <w:rPr>
+                <w:highlight w:val="green"/>
+              </w:rPr>
               <w:t>Title</w:t>
             </w:r>
           </w:p>
@@ -862,10 +899,13 @@
           <w:p>
             <w:pPr>
               <w:rPr>
-                <w:rFonts w:hint="eastAsia"/>
-              </w:rPr>
-            </w:pPr>
-            <w:r>
+                <w:highlight w:val="green"/>
+              </w:rPr>
+            </w:pPr>
+            <w:r>
+              <w:rPr>
+                <w:highlight w:val="green"/>
+              </w:rPr>
               <w:t>Could we call this “Industrial Carbon Management Project Database”?</w:t>
             </w:r>
           </w:p>
@@ -877,12 +917,13 @@
           <w:p>
             <w:pPr>
               <w:rPr>
-                <w:rFonts w:hint="eastAsia"/>
+                <w:highlight w:val="green"/>
               </w:rPr>
             </w:pPr>
             <w:r>
               <w:rPr>
                 <w:noProof/>
+                <w:highlight w:val="green"/>
               </w:rPr>
               <w:drawing>
                 <wp:inline distT="0" distB="0" distL="0" distR="0" wp14:anchorId="564D08BE" wp14:editId="7C0DF4D2">
@@ -938,11 +979,6 @@
             <w:tcW w:w="2065" w:type="dxa"/>
           </w:tcPr>
           <w:p>
-            <w:pPr>
-              <w:rPr>
-                <w:rFonts w:hint="eastAsia"/>
-              </w:rPr>
-            </w:pPr>
             <w:proofErr w:type="spellStart"/>
             <w:r>
               <w:t>Colours</w:t>
@@ -958,11 +994,6 @@
             <w:tcW w:w="4165" w:type="dxa"/>
           </w:tcPr>
           <w:p>
-            <w:pPr>
-              <w:rPr>
-                <w:rFonts w:hint="eastAsia"/>
-              </w:rPr>
-            </w:pPr>
             <w:r>
               <w:t>Could wekeep the avoided green but do it as a grand total of co2 stored to date and then the rest in white? Currently they’re the same as the legend w</w:t>
             </w:r>
@@ -976,11 +1007,6 @@
             <w:tcW w:w="3120" w:type="dxa"/>
           </w:tcPr>
           <w:p>
-            <w:pPr>
-              <w:rPr>
-                <w:rFonts w:hint="eastAsia"/>
-              </w:rPr>
-            </w:pPr>
             <w:r>
               <w:rPr>
                 <w:noProof/>
@@ -1039,19 +1065,34 @@
             <w:tcW w:w="2065" w:type="dxa"/>
           </w:tcPr>
           <w:p>
-            <w:r>
+            <w:pPr>
+              <w:rPr>
+                <w:highlight w:val="green"/>
+              </w:rPr>
+            </w:pPr>
+            <w:r>
+              <w:rPr>
+                <w:highlight w:val="green"/>
+              </w:rPr>
               <w:t>CO</w:t>
             </w:r>
             <w:r>
               <w:rPr>
+                <w:highlight w:val="green"/>
                 <w:vertAlign w:val="subscript"/>
               </w:rPr>
               <w:t>2</w:t>
             </w:r>
             <w:r>
+              <w:rPr>
+                <w:highlight w:val="green"/>
+              </w:rPr>
               <w:t xml:space="preserve"> metrics </w:t>
             </w:r>
             <w:r>
+              <w:rPr>
+                <w:highlight w:val="green"/>
+              </w:rPr>
               <w:t>(Lifetime)</w:t>
             </w:r>
           </w:p>
@@ -1061,7 +1102,15 @@
             <w:tcW w:w="4165" w:type="dxa"/>
           </w:tcPr>
           <w:p>
-            <w:r>
+            <w:pPr>
+              <w:rPr>
+                <w:highlight w:val="green"/>
+              </w:rPr>
+            </w:pPr>
+            <w:r>
+              <w:rPr>
+                <w:highlight w:val="green"/>
+              </w:rPr>
               <w:t>Remove ‘Lifetime’</w:t>
             </w:r>
           </w:p>
@@ -1497,13 +1546,7 @@
         </w:tc>
       </w:tr>
     </w:tbl>
-    <w:p>
-      <w:pPr>
-        <w:rPr>
-          <w:rFonts w:hint="eastAsia"/>
-        </w:rPr>
-      </w:pPr>
-    </w:p>
+    <w:p/>
     <w:sectPr>
       <w:pgSz w:w="12240" w:h="15840"/>
       <w:pgMar w:top="1440" w:right="1440" w:bottom="1440" w:left="1440" w:header="720" w:footer="720" w:gutter="0"/>

</xml_diff>